<commit_message>
docs: clarify care coordination ownership and patient workflows
Signed-off-by: Everett Williams <everett@medplum.com>
</commit_message>
<xml_diff>
--- a/packages/docs/static/decision-guides/care-coordination.docx
+++ b/packages/docs/static/decision-guides/care-coordination.docx
@@ -11,18 +11,18 @@
           <wp:inline>
             <wp:extent cx="5943600" cy="1289649"/>
             <wp:effectExtent b="0" l="0" r="0" t="0"/>
-            <wp:docPr descr="Medplum" title="" id="21" name="Picture"/>
+            <wp:docPr descr="Medplum" title="" id="10" name="Picture"/>
             <a:graphic>
               <a:graphicData uri="http://schemas.openxmlformats.org/drawingml/2006/picture">
                 <pic:pic>
                   <pic:nvPicPr>
-                    <pic:cNvPr descr="medplum-wordmark-grape.png" id="22" name="Picture"/>
+                    <pic:cNvPr descr="medplum-wordmark-grape.png" id="11" name="Picture"/>
                     <pic:cNvPicPr>
                       <a:picLocks noChangeArrowheads="1" noChangeAspect="1"/>
                     </pic:cNvPicPr>
                   </pic:nvPicPr>
                   <pic:blipFill>
-                    <a:blip r:embed="rId20"/>
+                    <a:blip r:embed="rId9"/>
                     <a:stretch>
                       <a:fillRect/>
                     </a:stretch>
@@ -49,7 +49,7 @@
         </w:drawing>
       </w:r>
     </w:p>
-    <w:bookmarkStart w:id="62" w:name="care-coordination-decision-guide"/>
+    <w:bookmarkStart w:id="52" w:name="care-coordination-decision-guide"/>
     <w:p>
       <w:pPr>
         <w:pStyle w:val="Heading1"/>
@@ -64,39 +64,39 @@
       </w:pPr>
       <w:r>
         <w:rPr>
+          <w:i/>
           <w:iCs/>
-          <w:i/>
         </w:rPr>
         <w:t xml:space="preserve">Companion to the</w:t>
       </w:r>
       <w:r>
         <w:rPr>
+          <w:i/>
           <w:iCs/>
-          <w:i/>
         </w:rPr>
         <w:t xml:space="preserve"> </w:t>
       </w:r>
-      <w:hyperlink r:id="rId23">
+      <w:hyperlink r:id="rId12">
         <w:r>
           <w:rPr>
             <w:rStyle w:val="Hyperlink"/>
+            <w:i/>
             <w:iCs/>
-            <w:i/>
           </w:rPr>
           <w:t xml:space="preserve">Care Coordination</w:t>
         </w:r>
       </w:hyperlink>
       <w:r>
         <w:rPr>
+          <w:i/>
           <w:iCs/>
-          <w:i/>
         </w:rPr>
         <w:t xml:space="preserve"> </w:t>
       </w:r>
       <w:r>
         <w:rPr>
+          <w:i/>
           <w:iCs/>
-          <w:i/>
         </w:rPr>
         <w:t xml:space="preserve">docs.</w:t>
       </w:r>
@@ -106,10 +106,10 @@
         <w:pStyle w:val="BodyText"/>
       </w:pPr>
       <w:r>
-        <w:t xml:space="preserve">Care coordination covers operational workflows across the practice: deciding what work needs to happen, routing it to the right person, following it through to completion, and maintaining continuity across visits and teams. This guide scopes both everyday work queues and longitudinal patient care. A practice can start with task management and add care plans, case tracking, or decision support where those capabilities serve a specific need.</w:t>
-      </w:r>
-    </w:p>
-    <w:bookmarkStart w:id="24" w:name="section-1-use-case-participants"/>
+        <w:t xml:space="preserve">Use this guide with your clinical and operations teams to decide what work needs to happen, who owns it, and how to follow it through. Start with the practice’s first workflow, then add care plans, case tracking, or decision support as needed.</w:t>
+      </w:r>
+    </w:p>
+    <w:bookmarkStart w:id="14" w:name="section-1-use-case-participants"/>
     <w:p>
       <w:pPr>
         <w:pStyle w:val="Heading2"/>
@@ -124,79 +124,79 @@
       </w:pPr>
       <w:r>
         <w:rPr>
+          <w:b/>
           <w:bCs/>
-          <w:b/>
         </w:rPr>
         <w:t xml:space="preserve">1.1 Which operational problems are you trying to solve first?</w:t>
       </w:r>
     </w:p>
     <w:p>
       <w:pPr>
+        <w:pStyle w:val="Compact"/>
         <w:numPr>
           <w:ilvl w:val="0"/>
           <w:numId w:val="1001"/>
         </w:numPr>
+      </w:pPr>
+      <w:r>
+        <w:t xml:space="preserve">Clinicians spend time on work that other team members could perform</w:t>
+      </w:r>
+    </w:p>
+    <w:p>
+      <w:pPr>
         <w:pStyle w:val="Compact"/>
-      </w:pPr>
-      <w:r>
-        <w:t xml:space="preserve">Clinicians spend time on work that other team members could perform</w:t>
-      </w:r>
-    </w:p>
-    <w:p>
-      <w:pPr>
         <w:numPr>
           <w:ilvl w:val="0"/>
           <w:numId w:val="1001"/>
         </w:numPr>
+      </w:pPr>
+      <w:r>
+        <w:t xml:space="preserve">Work gets lost between people, teams, visits, or systems</w:t>
+      </w:r>
+    </w:p>
+    <w:p>
+      <w:pPr>
         <w:pStyle w:val="Compact"/>
-      </w:pPr>
-      <w:r>
-        <w:t xml:space="preserve">Work gets lost between people, teams, visits, or systems</w:t>
-      </w:r>
-    </w:p>
-    <w:p>
-      <w:pPr>
         <w:numPr>
           <w:ilvl w:val="0"/>
           <w:numId w:val="1001"/>
         </w:numPr>
+      </w:pPr>
+      <w:r>
+        <w:t xml:space="preserve">Staff cannot see who owns the next action or what is overdue</w:t>
+      </w:r>
+    </w:p>
+    <w:p>
+      <w:pPr>
         <w:pStyle w:val="Compact"/>
-      </w:pPr>
-      <w:r>
-        <w:t xml:space="preserve">Staff cannot see who owns the next action or what is overdue</w:t>
-      </w:r>
-    </w:p>
-    <w:p>
-      <w:pPr>
         <w:numPr>
           <w:ilvl w:val="0"/>
           <w:numId w:val="1001"/>
         </w:numPr>
+      </w:pPr>
+      <w:r>
+        <w:t xml:space="preserve">Patient care spans multiple visits without a clear case history or plan</w:t>
+      </w:r>
+    </w:p>
+    <w:p>
+      <w:pPr>
         <w:pStyle w:val="Compact"/>
-      </w:pPr>
-      <w:r>
-        <w:t xml:space="preserve">Patient care spans multiple visits without a clear case history or plan</w:t>
-      </w:r>
-    </w:p>
-    <w:p>
-      <w:pPr>
         <w:numPr>
           <w:ilvl w:val="0"/>
           <w:numId w:val="1001"/>
         </w:numPr>
+      </w:pPr>
+      <w:r>
+        <w:t xml:space="preserve">Follow-up, protocols, or clinical recommendations are applied inconsistently</w:t>
+      </w:r>
+    </w:p>
+    <w:p>
+      <w:pPr>
         <w:pStyle w:val="Compact"/>
-      </w:pPr>
-      <w:r>
-        <w:t xml:space="preserve">Follow-up, protocols, or clinical recommendations are applied inconsistently</w:t>
-      </w:r>
-    </w:p>
-    <w:p>
-      <w:pPr>
         <w:numPr>
           <w:ilvl w:val="0"/>
           <w:numId w:val="1001"/>
         </w:numPr>
-        <w:pStyle w:val="Compact"/>
       </w:pPr>
       <w:r>
         <w:t xml:space="preserve">Some combination; identify the first workflow you intend to launch</w:t>
@@ -208,8 +208,8 @@
       </w:pPr>
       <w:r>
         <w:rPr>
+          <w:i/>
           <w:iCs/>
-          <w:i/>
         </w:rPr>
         <w:t xml:space="preserve">Why: establishes whether the starting point is delegation, a work queue, longitudinal tracking, or a more structured care program.</w:t>
       </w:r>
@@ -220,55 +220,55 @@
       </w:pPr>
       <w:r>
         <w:rPr>
+          <w:b/>
           <w:bCs/>
-          <w:b/>
         </w:rPr>
         <w:t xml:space="preserve">1.2 Who participates, and where does responsibility sit?</w:t>
       </w:r>
     </w:p>
     <w:p>
       <w:pPr>
+        <w:pStyle w:val="Compact"/>
         <w:numPr>
           <w:ilvl w:val="0"/>
           <w:numId w:val="1002"/>
         </w:numPr>
+      </w:pPr>
+      <w:r>
+        <w:t xml:space="preserve">Which clinicians, nurses, assistants, coordinators, administrative staff, patients, and caregivers perform work?</w:t>
+      </w:r>
+    </w:p>
+    <w:p>
+      <w:pPr>
         <w:pStyle w:val="Compact"/>
-      </w:pPr>
-      <w:r>
-        <w:t xml:space="preserve">Which clinicians, nurses, assistants, coordinators, administrative staff, patients, and caregivers perform work?</w:t>
-      </w:r>
-    </w:p>
-    <w:p>
-      <w:pPr>
         <w:numPr>
           <w:ilvl w:val="0"/>
           <w:numId w:val="1002"/>
         </w:numPr>
+      </w:pPr>
+      <w:r>
+        <w:t xml:space="preserve">Is work organized by individual, role, care team, service line, location, or organization?</w:t>
+      </w:r>
+    </w:p>
+    <w:p>
+      <w:pPr>
         <w:pStyle w:val="Compact"/>
-      </w:pPr>
-      <w:r>
-        <w:t xml:space="preserve">Is work organized by individual, role, care team, service line, location, or organization?</w:t>
-      </w:r>
-    </w:p>
-    <w:p>
-      <w:pPr>
         <w:numPr>
           <w:ilvl w:val="0"/>
           <w:numId w:val="1002"/>
         </w:numPr>
+      </w:pPr>
+      <w:r>
+        <w:t xml:space="preserve">Who is accountable for a patient’s overall care, and who owns each individual action?</w:t>
+      </w:r>
+    </w:p>
+    <w:p>
+      <w:pPr>
         <w:pStyle w:val="Compact"/>
-      </w:pPr>
-      <w:r>
-        <w:t xml:space="preserve">Who is accountable for a patient’s overall care, and who owns each individual action?</w:t>
-      </w:r>
-    </w:p>
-    <w:p>
-      <w:pPr>
         <w:numPr>
           <w:ilvl w:val="0"/>
           <w:numId w:val="1002"/>
         </w:numPr>
-        <w:pStyle w:val="Compact"/>
       </w:pPr>
       <w:r>
         <w:t xml:space="preserve">Do outside providers or partner organizations participate directly, or through exchanged messages and documents?</w:t>
@@ -280,8 +280,8 @@
       </w:pPr>
       <w:r>
         <w:rPr>
+          <w:i/>
           <w:iCs/>
-          <w:i/>
         </w:rPr>
         <w:t xml:space="preserve">Why: separates ongoing care responsibility from task ownership and identifies the access and handoff boundaries.</w:t>
       </w:r>
@@ -292,43 +292,43 @@
       </w:pPr>
       <w:r>
         <w:rPr>
+          <w:b/>
           <w:bCs/>
-          <w:b/>
         </w:rPr>
         <w:t xml:space="preserve">1.3 What creates work, and where is it managed today?</w:t>
       </w:r>
     </w:p>
     <w:p>
       <w:pPr>
+        <w:pStyle w:val="Compact"/>
         <w:numPr>
           <w:ilvl w:val="0"/>
           <w:numId w:val="1003"/>
         </w:numPr>
+      </w:pPr>
+      <w:r>
+        <w:t xml:space="preserve">Staff action, completed intake, an incoming message, an admission/discharge event, an order or result, a missed appointment, a scheduled follow-up, or a recommendation?</w:t>
+      </w:r>
+    </w:p>
+    <w:p>
+      <w:pPr>
         <w:pStyle w:val="Compact"/>
-      </w:pPr>
-      <w:r>
-        <w:t xml:space="preserve">Staff action, completed intake, an incoming message, an order or result, a missed appointment, a scheduled follow-up, or a recommendation?</w:t>
-      </w:r>
-    </w:p>
-    <w:p>
-      <w:pPr>
         <w:numPr>
           <w:ilvl w:val="0"/>
           <w:numId w:val="1003"/>
         </w:numPr>
+      </w:pPr>
+      <w:r>
+        <w:t xml:space="preserve">Are you replacing spreadsheets, inboxes, or another task system, or coordinating work that will remain in those systems?</w:t>
+      </w:r>
+    </w:p>
+    <w:p>
+      <w:pPr>
         <w:pStyle w:val="Compact"/>
-      </w:pPr>
-      <w:r>
-        <w:t xml:space="preserve">Are you replacing spreadsheets, inboxes, or another task system, or coordinating work that will remain in those systems?</w:t>
-      </w:r>
-    </w:p>
-    <w:p>
-      <w:pPr>
         <w:numPr>
           <w:ilvl w:val="0"/>
           <w:numId w:val="1003"/>
         </w:numPr>
-        <w:pStyle w:val="Compact"/>
       </w:pPr>
       <w:r>
         <w:t xml:space="preserve">Which system owns the clinical record, the work item, and its completion status?</w:t>
@@ -340,8 +340,8 @@
       </w:pPr>
       <w:r>
         <w:rPr>
+          <w:i/>
           <w:iCs/>
-          <w:i/>
         </w:rPr>
         <w:t xml:space="preserve">Why: establishes entry points, integration needs, and which system can authoritatively change each state.</w:t>
       </w:r>
@@ -352,55 +352,55 @@
       </w:pPr>
       <w:r>
         <w:rPr>
+          <w:b/>
           <w:bCs/>
-          <w:b/>
         </w:rPr>
         <w:t xml:space="preserve">1.4 How much continuity and scale do you need?</w:t>
       </w:r>
     </w:p>
     <w:p>
       <w:pPr>
+        <w:pStyle w:val="Compact"/>
         <w:numPr>
           <w:ilvl w:val="0"/>
           <w:numId w:val="1004"/>
         </w:numPr>
+      </w:pPr>
+      <w:r>
+        <w:t xml:space="preserve">Does work end with one action or encounter, or continue across months of care?</w:t>
+      </w:r>
+    </w:p>
+    <w:p>
+      <w:pPr>
         <w:pStyle w:val="Compact"/>
-      </w:pPr>
-      <w:r>
-        <w:t xml:space="preserve">Does work end with one action or encounter, or continue across months of care?</w:t>
-      </w:r>
-    </w:p>
-    <w:p>
-      <w:pPr>
         <w:numPr>
           <w:ilvl w:val="0"/>
           <w:numId w:val="1004"/>
         </w:numPr>
+      </w:pPr>
+      <w:r>
+        <w:t xml:space="preserve">Can a patient participate in several programs or cases at once?</w:t>
+      </w:r>
+    </w:p>
+    <w:p>
+      <w:pPr>
         <w:pStyle w:val="Compact"/>
-      </w:pPr>
-      <w:r>
-        <w:t xml:space="preserve">Can a patient participate in several programs or cases at once?</w:t>
-      </w:r>
-    </w:p>
-    <w:p>
-      <w:pPr>
         <w:numPr>
           <w:ilvl w:val="0"/>
           <w:numId w:val="1004"/>
         </w:numPr>
+      </w:pPr>
+      <w:r>
+        <w:t xml:space="preserve">How many staff share a queue, how much work arrives, and are operations limited to business hours?</w:t>
+      </w:r>
+    </w:p>
+    <w:p>
+      <w:pPr>
         <w:pStyle w:val="Compact"/>
-      </w:pPr>
-      <w:r>
-        <w:t xml:space="preserve">How many staff share a queue, how much work arrives, and are operations limited to business hours?</w:t>
-      </w:r>
-    </w:p>
-    <w:p>
-      <w:pPr>
         <w:numPr>
           <w:ilvl w:val="0"/>
           <w:numId w:val="1004"/>
         </w:numPr>
-        <w:pStyle w:val="Compact"/>
       </w:pPr>
       <w:r>
         <w:t xml:space="preserve">What must improve to consider the first release successful?</w:t>
@@ -412,10 +412,94 @@
       </w:pPr>
       <w:r>
         <w:rPr>
+          <w:i/>
           <w:iCs/>
-          <w:i/>
         </w:rPr>
         <w:t xml:space="preserve">Why: determines the need for case grouping, concurrent assignment controls, escalation, and reporting.</w:t>
+      </w:r>
+    </w:p>
+    <w:p>
+      <w:pPr>
+        <w:pStyle w:val="BodyText"/>
+      </w:pPr>
+      <w:r>
+        <w:rPr>
+          <w:b/>
+          <w:bCs/>
+        </w:rPr>
+        <w:t xml:space="preserve">1.5 Does a care program require consent or service-time records?</w:t>
+      </w:r>
+    </w:p>
+    <w:p>
+      <w:pPr>
+        <w:pStyle w:val="Compact"/>
+        <w:numPr>
+          <w:ilvl w:val="0"/>
+          <w:numId w:val="1005"/>
+        </w:numPr>
+      </w:pPr>
+      <w:r>
+        <w:t xml:space="preserve">What program consent must be captured, reviewed, renewed, or withdrawn before enrollment or ongoing work?</w:t>
+      </w:r>
+    </w:p>
+    <w:p>
+      <w:pPr>
+        <w:pStyle w:val="Compact"/>
+        <w:numPr>
+          <w:ilvl w:val="0"/>
+          <w:numId w:val="1005"/>
+        </w:numPr>
+      </w:pPr>
+      <w:r>
+        <w:t xml:space="preserve">Which activities require time records, and who performed them for which patient and program?</w:t>
+      </w:r>
+    </w:p>
+    <w:p>
+      <w:pPr>
+        <w:pStyle w:val="Compact"/>
+        <w:numPr>
+          <w:ilvl w:val="0"/>
+          <w:numId w:val="1005"/>
+        </w:numPr>
+      </w:pPr>
+      <w:r>
+        <w:t xml:space="preserve">How will you record actual effort, corrections, overlapping activity, and the reporting period required by the program or payer?</w:t>
+      </w:r>
+    </w:p>
+    <w:p>
+      <w:pPr>
+        <w:pStyle w:val="FirstParagraph"/>
+      </w:pPr>
+      <w:r>
+        <w:rPr>
+          <w:i/>
+          <w:iCs/>
+        </w:rPr>
+        <w:t xml:space="preserve">Why: identifies program-specific consent and time-recording requirements. Task execution windows alone do not establish billable effort. Choose the time-record model and any Consent representation after confirming the program’s requirements; see</w:t>
+      </w:r>
+      <w:r>
+        <w:rPr>
+          <w:i/>
+          <w:iCs/>
+        </w:rPr>
+        <w:t xml:space="preserve"> </w:t>
+      </w:r>
+      <w:hyperlink r:id="rId13">
+        <w:r>
+          <w:rPr>
+            <w:rStyle w:val="Hyperlink"/>
+            <w:i/>
+            <w:iCs/>
+          </w:rPr>
+          <w:t xml:space="preserve">Consent</w:t>
+        </w:r>
+      </w:hyperlink>
+      <w:r>
+        <w:rPr>
+          <w:i/>
+          <w:iCs/>
+        </w:rPr>
+        <w:t xml:space="preserve">.</w:t>
       </w:r>
     </w:p>
     <w:p>
@@ -425,8 +509,8 @@
         </w:pict>
       </w:r>
     </w:p>
-    <w:bookmarkEnd w:id="24"/>
-    <w:bookmarkStart w:id="25" w:name="section-2-feature-scoping"/>
+    <w:bookmarkEnd w:id="14"/>
+    <w:bookmarkStart w:id="15" w:name="section-2-feature-scoping"/>
     <w:p>
       <w:pPr>
         <w:pStyle w:val="Heading2"/>
@@ -441,8 +525,8 @@
       </w:pPr>
       <w:r>
         <w:rPr>
+          <w:i/>
           <w:iCs/>
-          <w:i/>
         </w:rPr>
         <w:t xml:space="preserve">For each feature, mark Yes / No / Nice-to-have / Not sure. The § column points to the relevant deep dive. Cover 3.1 for every implementation.</w:t>
       </w:r>
@@ -451,9 +535,8 @@
       <w:tblPr>
         <w:tblStyle w:val="Table"/>
         <w:tblW w:w="9360" w:type="dxa"/>
+        <w:tblLayout w:type="fixed"/>
         <w:tblLook w:firstRow="1" w:lastRow="0" w:firstColumn="0" w:lastColumn="0" w:noHBand="0" w:noVBand="0" w:val="0020"/>
-        <w:jc w:val="start"/>
-        <w:tblLayout w:type="fixed"/>
       </w:tblPr>
       <w:tblGrid>
         <w:gridCol w:w="600"/>
@@ -467,7 +550,7 @@
       <w:tr>
         <w:trPr>
           <w:cantSplit/>
-          <w:tblHeader w:val="true"/>
+          <w:tblHeader w:val="on"/>
         </w:trPr>
         <w:tc>
           <w:tcPr/>
@@ -1365,8 +1448,8 @@
         </w:pict>
       </w:r>
     </w:p>
-    <w:bookmarkEnd w:id="25"/>
-    <w:bookmarkStart w:id="56" w:name="section-3-feature-deep-dives"/>
+    <w:bookmarkEnd w:id="15"/>
+    <w:bookmarkStart w:id="50" w:name="section-3-feature-deep-dives"/>
     <w:p>
       <w:pPr>
         <w:pStyle w:val="Heading2"/>
@@ -1381,8 +1464,8 @@
       </w:pPr>
       <w:r>
         <w:rPr>
+          <w:i/>
           <w:iCs/>
-          <w:i/>
         </w:rPr>
         <w:t xml:space="preserve">Cover each feature selected above. Record the chosen approach and unresolved decisions for the first workflow before expanding to additional workflows.</w:t>
       </w:r>
@@ -1395,7 +1478,7 @@
         <w:t xml:space="preserve">The approaches below name recommended resources and fields. Local workflow stages, eligibility checks, and automation are application conventions that you implement; storing these resources does not execute those rules automatically.</w:t>
       </w:r>
     </w:p>
-    <w:bookmarkStart w:id="27" w:name="work-items-clinical-context"/>
+    <w:bookmarkStart w:id="17" w:name="work-items-clinical-context"/>
     <w:p>
       <w:pPr>
         <w:pStyle w:val="Heading3"/>
@@ -1414,47 +1497,47 @@
     </w:p>
     <w:p>
       <w:pPr>
+        <w:pStyle w:val="Compact"/>
         <w:numPr>
           <w:ilvl w:val="0"/>
-          <w:numId w:val="1005"/>
+          <w:numId w:val="1006"/>
         </w:numPr>
+      </w:pPr>
+      <w:r>
+        <w:t xml:space="preserve">What is the smallest unit of work that needs its own owner, status, and completion criteria?</w:t>
+      </w:r>
+    </w:p>
+    <w:p>
+      <w:pPr>
         <w:pStyle w:val="Compact"/>
-      </w:pPr>
-      <w:r>
-        <w:t xml:space="preserve">What is the smallest unit of work that needs its own owner, status, and completion criteria?</w:t>
-      </w:r>
-    </w:p>
-    <w:p>
-      <w:pPr>
         <w:numPr>
           <w:ilvl w:val="0"/>
-          <w:numId w:val="1005"/>
+          <w:numId w:val="1006"/>
         </w:numPr>
+      </w:pPr>
+      <w:r>
+        <w:t xml:space="preserve">Is each item about a patient, a particular encounter, or practice administration?</w:t>
+      </w:r>
+    </w:p>
+    <w:p>
+      <w:pPr>
         <w:pStyle w:val="Compact"/>
-      </w:pPr>
-      <w:r>
-        <w:t xml:space="preserve">Is each item about a patient, a particular encounter, or practice administration?</w:t>
-      </w:r>
-    </w:p>
-    <w:p>
-      <w:pPr>
         <w:numPr>
           <w:ilvl w:val="0"/>
-          <w:numId w:val="1005"/>
+          <w:numId w:val="1006"/>
         </w:numPr>
+      </w:pPr>
+      <w:r>
+        <w:t xml:space="preserve">What is being acted on: a referral, result, questionnaire, message thread, or another resource?</w:t>
+      </w:r>
+    </w:p>
+    <w:p>
+      <w:pPr>
         <w:pStyle w:val="Compact"/>
-      </w:pPr>
-      <w:r>
-        <w:t xml:space="preserve">What is being acted on: a referral, result, questionnaire, message thread, or another resource?</w:t>
-      </w:r>
-    </w:p>
-    <w:p>
-      <w:pPr>
         <w:numPr>
           <w:ilvl w:val="0"/>
-          <w:numId w:val="1005"/>
+          <w:numId w:val="1006"/>
         </w:numPr>
-        <w:pStyle w:val="Compact"/>
       </w:pPr>
       <w:r>
         <w:t xml:space="preserve">Does one person perform the whole activity, or do independently assigned steps need separate work items?</w:t>
@@ -1464,9 +1547,8 @@
       <w:tblPr>
         <w:tblStyle w:val="Table"/>
         <w:tblW w:w="9360" w:type="dxa"/>
+        <w:tblLayout w:type="fixed"/>
         <w:tblLook w:firstRow="1" w:lastRow="0" w:firstColumn="0" w:lastColumn="0" w:noHBand="0" w:noVBand="0" w:val="0020"/>
-        <w:jc w:val="start"/>
-        <w:tblLayout w:type="fixed"/>
       </w:tblPr>
       <w:tblGrid>
         <w:gridCol w:w="4680"/>
@@ -1475,7 +1557,7 @@
       <w:tr>
         <w:trPr>
           <w:cantSplit/>
-          <w:tblHeader w:val="true"/>
+          <w:tblHeader w:val="on"/>
         </w:trPr>
         <w:tc>
           <w:tcPr/>
@@ -1820,7 +1902,7 @@
       <w:r>
         <w:t xml:space="preserve"> </w:t>
       </w:r>
-      <w:hyperlink r:id="rId26">
+      <w:hyperlink r:id="rId16">
         <w:r>
           <w:rPr>
             <w:rStyle w:val="Hyperlink"/>
@@ -1832,8 +1914,8 @@
         <w:t xml:space="preserve">.</w:t>
       </w:r>
     </w:p>
-    <w:bookmarkEnd w:id="27"/>
-    <w:bookmarkStart w:id="30" w:name="top-of-license-care-delegation"/>
+    <w:bookmarkEnd w:id="17"/>
+    <w:bookmarkStart w:id="20" w:name="top-of-license-care-delegation"/>
     <w:p>
       <w:pPr>
         <w:pStyle w:val="Heading3"/>
@@ -1852,47 +1934,47 @@
     </w:p>
     <w:p>
       <w:pPr>
+        <w:pStyle w:val="Compact"/>
         <w:numPr>
           <w:ilvl w:val="0"/>
-          <w:numId w:val="1006"/>
+          <w:numId w:val="1007"/>
         </w:numPr>
+      </w:pPr>
+      <w:r>
+        <w:t xml:space="preserve">Which steps currently reach a clinician that another qualified team member could prepare or complete?</w:t>
+      </w:r>
+    </w:p>
+    <w:p>
+      <w:pPr>
         <w:pStyle w:val="Compact"/>
-      </w:pPr>
-      <w:r>
-        <w:t xml:space="preserve">Which steps currently reach a clinician that another qualified team member could prepare or complete?</w:t>
-      </w:r>
-    </w:p>
-    <w:p>
-      <w:pPr>
         <w:numPr>
           <w:ilvl w:val="0"/>
-          <w:numId w:val="1006"/>
+          <w:numId w:val="1007"/>
         </w:numPr>
+      </w:pPr>
+      <w:r>
+        <w:t xml:space="preserve">Which actions require clinical judgment, sign-off, supervision, or escalation?</w:t>
+      </w:r>
+    </w:p>
+    <w:p>
+      <w:pPr>
         <w:pStyle w:val="Compact"/>
-      </w:pPr>
-      <w:r>
-        <w:t xml:space="preserve">Which actions require clinical judgment, sign-off, supervision, or escalation?</w:t>
-      </w:r>
-    </w:p>
-    <w:p>
-      <w:pPr>
         <w:numPr>
           <w:ilvl w:val="0"/>
-          <w:numId w:val="1006"/>
+          <w:numId w:val="1007"/>
         </w:numPr>
+      </w:pPr>
+      <w:r>
+        <w:t xml:space="preserve">Do eligibility rules depend on credentials, specialty, service line, jurisdiction, or the patient’s program?</w:t>
+      </w:r>
+    </w:p>
+    <w:p>
+      <w:pPr>
         <w:pStyle w:val="Compact"/>
-      </w:pPr>
-      <w:r>
-        <w:t xml:space="preserve">Do eligibility rules depend on credentials, specialty, service line, jurisdiction, or the patient’s program?</w:t>
-      </w:r>
-    </w:p>
-    <w:p>
-      <w:pPr>
         <w:numPr>
           <w:ilvl w:val="0"/>
-          <w:numId w:val="1006"/>
+          <w:numId w:val="1007"/>
         </w:numPr>
-        <w:pStyle w:val="Compact"/>
       </w:pPr>
       <w:r>
         <w:t xml:space="preserve">Who maintains those rules, and what happens when no eligible person is available?</w:t>
@@ -1902,9 +1984,8 @@
       <w:tblPr>
         <w:tblStyle w:val="Table"/>
         <w:tblW w:w="9360" w:type="dxa"/>
+        <w:tblLayout w:type="fixed"/>
         <w:tblLook w:firstRow="1" w:lastRow="0" w:firstColumn="0" w:lastColumn="0" w:noHBand="0" w:noVBand="0" w:val="0020"/>
-        <w:jc w:val="start"/>
-        <w:tblLayout w:type="fixed"/>
       </w:tblPr>
       <w:tblGrid>
         <w:gridCol w:w="3979"/>
@@ -1913,7 +1994,7 @@
       <w:tr>
         <w:trPr>
           <w:cantSplit/>
-          <w:tblHeader w:val="true"/>
+          <w:tblHeader w:val="on"/>
         </w:trPr>
         <w:tc>
           <w:tcPr/>
@@ -2232,7 +2313,7 @@
       <w:r>
         <w:t xml:space="preserve"> </w:t>
       </w:r>
-      <w:hyperlink r:id="rId28">
+      <w:hyperlink r:id="rId18">
         <w:r>
           <w:rPr>
             <w:rStyle w:val="Hyperlink"/>
@@ -2246,7 +2327,7 @@
       <w:r>
         <w:t xml:space="preserve"> </w:t>
       </w:r>
-      <w:hyperlink r:id="rId29">
+      <w:hyperlink r:id="rId19">
         <w:r>
           <w:rPr>
             <w:rStyle w:val="Hyperlink"/>
@@ -2258,8 +2339,8 @@
         <w:t xml:space="preserve">; scheduling operations do not enforce licensure themselves.</w:t>
       </w:r>
     </w:p>
-    <w:bookmarkEnd w:id="30"/>
-    <w:bookmarkStart w:id="33" w:name="queues-ownership-care-teams"/>
+    <w:bookmarkEnd w:id="20"/>
+    <w:bookmarkStart w:id="25" w:name="queues-ownership-care-teams"/>
     <w:p>
       <w:pPr>
         <w:pStyle w:val="Heading3"/>
@@ -2278,71 +2359,96 @@
     </w:p>
     <w:p>
       <w:pPr>
+        <w:pStyle w:val="Compact"/>
         <w:numPr>
           <w:ilvl w:val="0"/>
-          <w:numId w:val="1007"/>
+          <w:numId w:val="1008"/>
         </w:numPr>
+      </w:pPr>
+      <w:r>
+        <w:t xml:space="preserve">Is work assigned directly, claimed from a shared queue, or distributed automatically?</w:t>
+      </w:r>
+    </w:p>
+    <w:p>
+      <w:pPr>
         <w:pStyle w:val="Compact"/>
-      </w:pPr>
-      <w:r>
-        <w:t xml:space="preserve">Is work assigned directly, claimed from a shared queue, or distributed automatically?</w:t>
-      </w:r>
-    </w:p>
-    <w:p>
-      <w:pPr>
         <w:numPr>
           <w:ilvl w:val="0"/>
-          <w:numId w:val="1007"/>
+          <w:numId w:val="1008"/>
         </w:numPr>
+      </w:pPr>
+      <w:r>
+        <w:t xml:space="preserve">Which queue dimensions matter: role, service, location, urgency, or workflow stage?</w:t>
+      </w:r>
+    </w:p>
+    <w:p>
+      <w:pPr>
         <w:pStyle w:val="Compact"/>
-      </w:pPr>
-      <w:r>
-        <w:t xml:space="preserve">Which queue dimensions matter: role, service, location, urgency, or workflow stage?</w:t>
-      </w:r>
-    </w:p>
-    <w:p>
-      <w:pPr>
         <w:numPr>
           <w:ilvl w:val="0"/>
-          <w:numId w:val="1007"/>
+          <w:numId w:val="1008"/>
         </w:numPr>
+      </w:pPr>
+      <w:r>
+        <w:t xml:space="preserve">Can two staff members attempt to claim the same item? Who resolves conflicts?</w:t>
+      </w:r>
+    </w:p>
+    <w:p>
+      <w:pPr>
         <w:pStyle w:val="Compact"/>
-      </w:pPr>
-      <w:r>
-        <w:t xml:space="preserve">Can two staff members attempt to claim the same item? Who resolves conflicts?</w:t>
-      </w:r>
-    </w:p>
-    <w:p>
-      <w:pPr>
         <w:numPr>
           <w:ilvl w:val="0"/>
-          <w:numId w:val="1007"/>
+          <w:numId w:val="1008"/>
         </w:numPr>
+      </w:pPr>
+      <w:r>
+        <w:t xml:space="preserve">Does the patient have an ongoing care team or coordinator distinct from the person handling today’s task?</w:t>
+      </w:r>
+    </w:p>
+    <w:p>
+      <w:pPr>
         <w:pStyle w:val="Compact"/>
-      </w:pPr>
-      <w:r>
-        <w:t xml:space="preserve">Does the patient have an ongoing care team or coordinator distinct from the person handling today’s task?</w:t>
-      </w:r>
-    </w:p>
-    <w:p>
-      <w:pPr>
         <w:numPr>
           <w:ilvl w:val="0"/>
-          <w:numId w:val="1007"/>
+          <w:numId w:val="1008"/>
         </w:numPr>
+      </w:pPr>
+      <w:r>
+        <w:t xml:space="preserve">How do absence, workload, and shift changes affect assignment?</w:t>
+      </w:r>
+    </w:p>
+    <w:p>
+      <w:pPr>
         <w:pStyle w:val="Compact"/>
-      </w:pPr>
-      <w:r>
-        <w:t xml:space="preserve">How do absence, workload, and shift changes affect assignment?</w:t>
+        <w:numPr>
+          <w:ilvl w:val="0"/>
+          <w:numId w:val="1008"/>
+        </w:numPr>
+      </w:pPr>
+      <w:r>
+        <w:t xml:space="preserve">How do staff discover new or escalated work: a live queue, an outbound notification, or both? See</w:t>
+      </w:r>
+      <w:r>
+        <w:t xml:space="preserve"> </w:t>
+      </w:r>
+      <w:hyperlink r:id="rId21">
+        <w:r>
+          <w:rPr>
+            <w:rStyle w:val="Hyperlink"/>
+          </w:rPr>
+          <w:t xml:space="preserve">assignee notifications</w:t>
+        </w:r>
+      </w:hyperlink>
+      <w:r>
+        <w:t xml:space="preserve">.</w:t>
       </w:r>
     </w:p>
     <w:tbl>
       <w:tblPr>
         <w:tblStyle w:val="Table"/>
         <w:tblW w:w="9360" w:type="dxa"/>
+        <w:tblLayout w:type="fixed"/>
         <w:tblLook w:firstRow="1" w:lastRow="0" w:firstColumn="0" w:lastColumn="0" w:noHBand="0" w:noVBand="0" w:val="0020"/>
-        <w:jc w:val="start"/>
-        <w:tblLayout w:type="fixed"/>
       </w:tblPr>
       <w:tblGrid>
         <w:gridCol w:w="4121"/>
@@ -2351,7 +2457,7 @@
       <w:tr>
         <w:trPr>
           <w:cantSplit/>
-          <w:tblHeader w:val="true"/>
+          <w:tblHeader w:val="on"/>
         </w:trPr>
         <w:tc>
           <w:tcPr/>
@@ -2737,7 +2843,21 @@
       <w:r>
         <w:t xml:space="preserve"> </w:t>
       </w:r>
-      <w:hyperlink r:id="rId31">
+      <w:hyperlink r:id="rId22">
+        <w:r>
+          <w:rPr>
+            <w:rStyle w:val="Hyperlink"/>
+          </w:rPr>
+          <w:t xml:space="preserve">Message Response Tracking and Routing</w:t>
+        </w:r>
+      </w:hyperlink>
+      <w:r>
+        <w:t xml:space="preserve">,</w:t>
+      </w:r>
+      <w:r>
+        <w:t xml:space="preserve"> </w:t>
+      </w:r>
+      <w:hyperlink r:id="rId23">
         <w:r>
           <w:rPr>
             <w:rStyle w:val="Hyperlink"/>
@@ -2746,15 +2866,12 @@
         </w:r>
       </w:hyperlink>
       <w:r>
+        <w:t xml:space="preserve">, and</w:t>
+      </w:r>
+      <w:r>
         <w:t xml:space="preserve"> </w:t>
       </w:r>
-      <w:r>
-        <w:t xml:space="preserve">and</w:t>
-      </w:r>
-      <w:r>
-        <w:t xml:space="preserve"> </w:t>
-      </w:r>
-      <w:hyperlink r:id="rId32">
+      <w:hyperlink r:id="rId24">
         <w:r>
           <w:rPr>
             <w:rStyle w:val="Hyperlink"/>
@@ -2766,8 +2883,8 @@
         <w:t xml:space="preserve">.</w:t>
       </w:r>
     </w:p>
-    <w:bookmarkEnd w:id="33"/>
-    <w:bookmarkStart w:id="35" w:name="lifecycle-handoffs-deadlines"/>
+    <w:bookmarkEnd w:id="25"/>
+    <w:bookmarkStart w:id="28" w:name="lifecycle-handoffs-deadlines"/>
     <w:p>
       <w:pPr>
         <w:pStyle w:val="Heading3"/>
@@ -2786,59 +2903,59 @@
     </w:p>
     <w:p>
       <w:pPr>
+        <w:pStyle w:val="Compact"/>
         <w:numPr>
           <w:ilvl w:val="0"/>
-          <w:numId w:val="1008"/>
+          <w:numId w:val="1009"/>
         </w:numPr>
+      </w:pPr>
+      <w:r>
+        <w:t xml:space="preserve">Which stages do staff need to operate on, and which are useful only for reporting?</w:t>
+      </w:r>
+    </w:p>
+    <w:p>
+      <w:pPr>
         <w:pStyle w:val="Compact"/>
-      </w:pPr>
-      <w:r>
-        <w:t xml:space="preserve">Which stages do staff need to operate on, and which are useful only for reporting?</w:t>
-      </w:r>
-    </w:p>
-    <w:p>
-      <w:pPr>
         <w:numPr>
           <w:ilvl w:val="0"/>
-          <w:numId w:val="1008"/>
+          <w:numId w:val="1009"/>
         </w:numPr>
+      </w:pPr>
+      <w:r>
+        <w:t xml:space="preserve">What counts as ready, blocked, complete, cancelled, or entered in error?</w:t>
+      </w:r>
+    </w:p>
+    <w:p>
+      <w:pPr>
         <w:pStyle w:val="Compact"/>
-      </w:pPr>
-      <w:r>
-        <w:t xml:space="preserve">What counts as ready, blocked, complete, cancelled, or entered in error?</w:t>
-      </w:r>
-    </w:p>
-    <w:p>
-      <w:pPr>
         <w:numPr>
           <w:ilvl w:val="0"/>
-          <w:numId w:val="1008"/>
+          <w:numId w:val="1009"/>
         </w:numPr>
+      </w:pPr>
+      <w:r>
+        <w:t xml:space="preserve">Does handing off work require acknowledgment from the next owner?</w:t>
+      </w:r>
+    </w:p>
+    <w:p>
+      <w:pPr>
         <w:pStyle w:val="Compact"/>
-      </w:pPr>
-      <w:r>
-        <w:t xml:space="preserve">Does handing off work require acknowledgment from the next owner?</w:t>
-      </w:r>
-    </w:p>
-    <w:p>
-      <w:pPr>
         <w:numPr>
           <w:ilvl w:val="0"/>
-          <w:numId w:val="1008"/>
+          <w:numId w:val="1009"/>
         </w:numPr>
+      </w:pPr>
+      <w:r>
+        <w:t xml:space="preserve">Which deadlines use elapsed time versus business hours? Does waiting for a patient or outside party pause the clock?</w:t>
+      </w:r>
+    </w:p>
+    <w:p>
+      <w:pPr>
         <w:pStyle w:val="Compact"/>
-      </w:pPr>
-      <w:r>
-        <w:t xml:space="preserve">Which deadlines use elapsed time versus business hours? Does waiting for a patient or outside party pause the clock?</w:t>
-      </w:r>
-    </w:p>
-    <w:p>
-      <w:pPr>
         <w:numPr>
           <w:ilvl w:val="0"/>
-          <w:numId w:val="1008"/>
+          <w:numId w:val="1009"/>
         </w:numPr>
-        <w:pStyle w:val="Compact"/>
       </w:pPr>
       <w:r>
         <w:t xml:space="preserve">Who receives overdue work, and how are repeated reminders prevented?</w:t>
@@ -2848,9 +2965,8 @@
       <w:tblPr>
         <w:tblStyle w:val="Table"/>
         <w:tblW w:w="9360" w:type="dxa"/>
+        <w:tblLayout w:type="fixed"/>
         <w:tblLook w:firstRow="1" w:lastRow="0" w:firstColumn="0" w:lastColumn="0" w:noHBand="0" w:noVBand="0" w:val="0020"/>
-        <w:jc w:val="start"/>
-        <w:tblLayout w:type="fixed"/>
       </w:tblPr>
       <w:tblGrid>
         <w:gridCol w:w="4317"/>
@@ -2859,7 +2975,7 @@
       <w:tr>
         <w:trPr>
           <w:cantSplit/>
-          <w:tblHeader w:val="true"/>
+          <w:tblHeader w:val="on"/>
         </w:trPr>
         <w:tc>
           <w:tcPr/>
@@ -3118,7 +3234,21 @@
               <w:t xml:space="preserve"> </w:t>
             </w:r>
             <w:r>
-              <w:t xml:space="preserve">only for hierarchy; it does not encode a dependency or release the next step.</w:t>
+              <w:t xml:space="preserve">for hierarchy; implement transitions through the</w:t>
+            </w:r>
+            <w:r>
+              <w:t xml:space="preserve"> </w:t>
+            </w:r>
+            <w:hyperlink r:id="rId26">
+              <w:r>
+                <w:rPr>
+                  <w:rStyle w:val="Hyperlink"/>
+                </w:rPr>
+                <w:t xml:space="preserve">handoff workflow</w:t>
+              </w:r>
+            </w:hyperlink>
+            <w:r>
+              <w:t xml:space="preserve">.</w:t>
             </w:r>
           </w:p>
         </w:tc>
@@ -3177,7 +3307,24 @@
               <w:t xml:space="preserve"> </w:t>
             </w:r>
             <w:r>
-              <w:t xml:space="preserve">for actual work. Medplum applies this timing convention to general queues as well as request fulfillment; document that broader convention for exchange. Calculate business-hour deadlines and paused intervals in application or Bot logic.</w:t>
+              <w:t xml:space="preserve">for actual work. Follow the</w:t>
+            </w:r>
+            <w:r>
+              <w:t xml:space="preserve"> </w:t>
+            </w:r>
+            <w:hyperlink r:id="rId27">
+              <w:r>
+                <w:rPr>
+                  <w:rStyle w:val="Hyperlink"/>
+                </w:rPr>
+                <w:t xml:space="preserve">planned-date convention</w:t>
+              </w:r>
+            </w:hyperlink>
+            <w:r>
+              <w:t xml:space="preserve"> </w:t>
+            </w:r>
+            <w:r>
+              <w:t xml:space="preserve">for general queues and exchange. Calculate business-hour deadlines and paused intervals in application or Bot logic.</w:t>
             </w:r>
           </w:p>
         </w:tc>
@@ -3252,7 +3399,7 @@
       <w:r>
         <w:t xml:space="preserve"> </w:t>
       </w:r>
-      <w:hyperlink r:id="rId26">
+      <w:hyperlink r:id="rId16">
         <w:r>
           <w:rPr>
             <w:rStyle w:val="Hyperlink"/>
@@ -3267,45 +3414,8 @@
         <w:t xml:space="preserve">for status and timing fields. Queue ordering, deadline calculations, and escalation require application or Bot logic.</w:t>
       </w:r>
     </w:p>
-    <w:p>
-      <w:pPr>
-        <w:pStyle w:val="BodyText"/>
-      </w:pPr>
-      <w:r>
-        <w:t xml:space="preserve">For overdue searches, follow the Task guide’s</w:t>
-      </w:r>
-      <w:r>
-        <w:t xml:space="preserve"> </w:t>
-      </w:r>
-      <w:hyperlink r:id="rId34">
-        <w:r>
-          <w:rPr>
-            <w:rStyle w:val="Hyperlink"/>
-          </w:rPr>
-          <w:t xml:space="preserve">date-range guidance</w:t>
-        </w:r>
-      </w:hyperlink>
-      <w:r>
-        <w:t xml:space="preserve">. When both planned start and due dates are present, the default index can compare the start instead of the deadline; range-aware queries require the</w:t>
-      </w:r>
-      <w:r>
-        <w:t xml:space="preserve"> </w:t>
-      </w:r>
-      <w:r>
-        <w:rPr>
-          <w:rStyle w:val="VerbatimChar"/>
-        </w:rPr>
-        <w:t xml:space="preserve">range-search</w:t>
-      </w:r>
-      <w:r>
-        <w:t xml:space="preserve"> </w:t>
-      </w:r>
-      <w:r>
-        <w:t xml:space="preserve">project feature.</w:t>
-      </w:r>
-    </w:p>
-    <w:bookmarkEnd w:id="35"/>
-    <w:bookmarkStart w:id="37" w:name="longitudinal-patient-case-tracking"/>
+    <w:bookmarkEnd w:id="28"/>
+    <w:bookmarkStart w:id="30" w:name="longitudinal-patient-case-tracking"/>
     <w:p>
       <w:pPr>
         <w:pStyle w:val="Heading3"/>
@@ -3324,59 +3434,59 @@
     </w:p>
     <w:p>
       <w:pPr>
+        <w:pStyle w:val="Compact"/>
         <w:numPr>
           <w:ilvl w:val="0"/>
-          <w:numId w:val="1009"/>
+          <w:numId w:val="1010"/>
         </w:numPr>
+      </w:pPr>
+      <w:r>
+        <w:t xml:space="preserve">What defines a case: a condition, a treatment course, a service program, or a period of responsibility?</w:t>
+      </w:r>
+    </w:p>
+    <w:p>
+      <w:pPr>
         <w:pStyle w:val="Compact"/>
-      </w:pPr>
-      <w:r>
-        <w:t xml:space="preserve">What defines a case: a condition, a treatment course, a service program, or a period of responsibility?</w:t>
-      </w:r>
-    </w:p>
-    <w:p>
-      <w:pPr>
         <w:numPr>
           <w:ilvl w:val="0"/>
-          <w:numId w:val="1009"/>
+          <w:numId w:val="1010"/>
         </w:numPr>
+      </w:pPr>
+      <w:r>
+        <w:t xml:space="preserve">What starts, pauses, transfers, and ends that case?</w:t>
+      </w:r>
+    </w:p>
+    <w:p>
+      <w:pPr>
         <w:pStyle w:val="Compact"/>
-      </w:pPr>
-      <w:r>
-        <w:t xml:space="preserve">What starts, pauses, transfers, and ends that case?</w:t>
-      </w:r>
-    </w:p>
-    <w:p>
-      <w:pPr>
         <w:numPr>
           <w:ilvl w:val="0"/>
-          <w:numId w:val="1009"/>
+          <w:numId w:val="1010"/>
         </w:numPr>
+      </w:pPr>
+      <w:r>
+        <w:t xml:space="preserve">Can a patient have concurrent cases, including more than one addressing the same condition?</w:t>
+      </w:r>
+    </w:p>
+    <w:p>
+      <w:pPr>
         <w:pStyle w:val="Compact"/>
-      </w:pPr>
-      <w:r>
-        <w:t xml:space="preserve">Can a patient have concurrent cases, including more than one addressing the same condition?</w:t>
-      </w:r>
-    </w:p>
-    <w:p>
-      <w:pPr>
         <w:numPr>
           <w:ilvl w:val="0"/>
-          <w:numId w:val="1009"/>
+          <w:numId w:val="1010"/>
         </w:numPr>
+      </w:pPr>
+      <w:r>
+        <w:t xml:space="preserve">Can one encounter contribute to multiple cases?</w:t>
+      </w:r>
+    </w:p>
+    <w:p>
+      <w:pPr>
         <w:pStyle w:val="Compact"/>
-      </w:pPr>
-      <w:r>
-        <w:t xml:space="preserve">Can one encounter contribute to multiple cases?</w:t>
-      </w:r>
-    </w:p>
-    <w:p>
-      <w:pPr>
         <w:numPr>
           <w:ilvl w:val="0"/>
-          <w:numId w:val="1009"/>
+          <w:numId w:val="1010"/>
         </w:numPr>
-        <w:pStyle w:val="Compact"/>
       </w:pPr>
       <w:r>
         <w:t xml:space="preserve">Which organization, coordinator, or care team is responsible over time?</w:t>
@@ -3386,9 +3496,8 @@
       <w:tblPr>
         <w:tblStyle w:val="Table"/>
         <w:tblW w:w="9360" w:type="dxa"/>
+        <w:tblLayout w:type="fixed"/>
         <w:tblLook w:firstRow="1" w:lastRow="0" w:firstColumn="0" w:lastColumn="0" w:noHBand="0" w:noVBand="0" w:val="0020"/>
-        <w:jc w:val="start"/>
-        <w:tblLayout w:type="fixed"/>
       </w:tblPr>
       <w:tblGrid>
         <w:gridCol w:w="4012"/>
@@ -3397,7 +3506,7 @@
       <w:tr>
         <w:trPr>
           <w:cantSplit/>
-          <w:tblHeader w:val="true"/>
+          <w:tblHeader w:val="on"/>
         </w:trPr>
         <w:tc>
           <w:tcPr/>
@@ -3754,7 +3863,7 @@
       <w:r>
         <w:t xml:space="preserve"> </w:t>
       </w:r>
-      <w:hyperlink r:id="rId36">
+      <w:hyperlink r:id="rId29">
         <w:r>
           <w:rPr>
             <w:rStyle w:val="Hyperlink"/>
@@ -3766,8 +3875,8 @@
         <w:t xml:space="preserve">.</w:t>
       </w:r>
     </w:p>
-    <w:bookmarkEnd w:id="37"/>
-    <w:bookmarkStart w:id="40" w:name="care-plans-goals-progress"/>
+    <w:bookmarkEnd w:id="30"/>
+    <w:bookmarkStart w:id="33" w:name="care-plans-goals-progress"/>
     <w:p>
       <w:pPr>
         <w:pStyle w:val="Heading3"/>
@@ -3786,59 +3895,59 @@
     </w:p>
     <w:p>
       <w:pPr>
+        <w:pStyle w:val="Compact"/>
         <w:numPr>
           <w:ilvl w:val="0"/>
-          <w:numId w:val="1010"/>
+          <w:numId w:val="1011"/>
         </w:numPr>
+      </w:pPr>
+      <w:r>
+        <w:t xml:space="preserve">Do staff need to see agreed goals and planned activities together for a patient?</w:t>
+      </w:r>
+    </w:p>
+    <w:p>
+      <w:pPr>
         <w:pStyle w:val="Compact"/>
-      </w:pPr>
-      <w:r>
-        <w:t xml:space="preserve">Do staff need to see agreed goals and planned activities together for a patient?</w:t>
-      </w:r>
-    </w:p>
-    <w:p>
-      <w:pPr>
         <w:numPr>
           <w:ilvl w:val="0"/>
-          <w:numId w:val="1010"/>
+          <w:numId w:val="1011"/>
         </w:numPr>
+      </w:pPr>
+      <w:r>
+        <w:t xml:space="preserve">Who authors, approves, reviews, and changes the plan? Does the patient participate?</w:t>
+      </w:r>
+    </w:p>
+    <w:p>
+      <w:pPr>
         <w:pStyle w:val="Compact"/>
-      </w:pPr>
-      <w:r>
-        <w:t xml:space="preserve">Who authors, approves, reviews, and changes the plan? Does the patient participate?</w:t>
-      </w:r>
-    </w:p>
-    <w:p>
-      <w:pPr>
         <w:numPr>
           <w:ilvl w:val="0"/>
-          <w:numId w:val="1010"/>
+          <w:numId w:val="1011"/>
         </w:numPr>
+      </w:pPr>
+      <w:r>
+        <w:t xml:space="preserve">How is goal progress assessed, and which observations or assessments support it?</w:t>
+      </w:r>
+    </w:p>
+    <w:p>
+      <w:pPr>
         <w:pStyle w:val="Compact"/>
-      </w:pPr>
-      <w:r>
-        <w:t xml:space="preserve">How is goal progress assessed, and which observations or assessments support it?</w:t>
-      </w:r>
-    </w:p>
-    <w:p>
-      <w:pPr>
         <w:numPr>
           <w:ilvl w:val="0"/>
-          <w:numId w:val="1010"/>
+          <w:numId w:val="1011"/>
         </w:numPr>
+      </w:pPr>
+      <w:r>
+        <w:t xml:space="preserve">When a plan changes, what happens to already assigned work?</w:t>
+      </w:r>
+    </w:p>
+    <w:p>
+      <w:pPr>
         <w:pStyle w:val="Compact"/>
-      </w:pPr>
-      <w:r>
-        <w:t xml:space="preserve">When a plan changes, what happens to already assigned work?</w:t>
-      </w:r>
-    </w:p>
-    <w:p>
-      <w:pPr>
         <w:numPr>
           <w:ilvl w:val="0"/>
-          <w:numId w:val="1010"/>
+          <w:numId w:val="1011"/>
         </w:numPr>
-        <w:pStyle w:val="Compact"/>
       </w:pPr>
       <w:r>
         <w:t xml:space="preserve">What closes the plan, and can individual goals or activities finish at different times?</w:t>
@@ -3848,9 +3957,8 @@
       <w:tblPr>
         <w:tblStyle w:val="Table"/>
         <w:tblW w:w="9360" w:type="dxa"/>
+        <w:tblLayout w:type="fixed"/>
         <w:tblLook w:firstRow="1" w:lastRow="0" w:firstColumn="0" w:lastColumn="0" w:noHBand="0" w:noVBand="0" w:val="0020"/>
-        <w:jc w:val="start"/>
-        <w:tblLayout w:type="fixed"/>
       </w:tblPr>
       <w:tblGrid>
         <w:gridCol w:w="4255"/>
@@ -3859,7 +3967,7 @@
       <w:tr>
         <w:trPr>
           <w:cantSplit/>
-          <w:tblHeader w:val="true"/>
+          <w:tblHeader w:val="on"/>
         </w:trPr>
         <w:tc>
           <w:tcPr/>
@@ -4217,7 +4325,7 @@
       <w:r>
         <w:t xml:space="preserve"> </w:t>
       </w:r>
-      <w:hyperlink r:id="rId38">
+      <w:hyperlink r:id="rId31">
         <w:r>
           <w:rPr>
             <w:rStyle w:val="Hyperlink"/>
@@ -4234,7 +4342,7 @@
       <w:r>
         <w:t xml:space="preserve"> </w:t>
       </w:r>
-      <w:hyperlink r:id="rId39">
+      <w:hyperlink r:id="rId32">
         <w:r>
           <w:rPr>
             <w:rStyle w:val="Hyperlink"/>
@@ -4249,8 +4357,8 @@
         <w:t xml:space="preserve">for the distinction between a patient’s plan and a reusable protocol.</w:t>
       </w:r>
     </w:p>
-    <w:bookmarkEnd w:id="40"/>
-    <w:bookmarkStart w:id="45" w:name="protocols-recurring-work-automation"/>
+    <w:bookmarkEnd w:id="33"/>
+    <w:bookmarkStart w:id="38" w:name="protocols-recurring-work-automation"/>
     <w:p>
       <w:pPr>
         <w:pStyle w:val="Heading3"/>
@@ -4269,59 +4377,59 @@
     </w:p>
     <w:p>
       <w:pPr>
+        <w:pStyle w:val="Compact"/>
         <w:numPr>
           <w:ilvl w:val="0"/>
-          <w:numId w:val="1011"/>
+          <w:numId w:val="1012"/>
         </w:numPr>
+      </w:pPr>
+      <w:r>
+        <w:t xml:space="preserve">Is work created manually, from events, on a schedule, or from a reusable protocol?</w:t>
+      </w:r>
+    </w:p>
+    <w:p>
+      <w:pPr>
         <w:pStyle w:val="Compact"/>
-      </w:pPr>
-      <w:r>
-        <w:t xml:space="preserve">Is work created manually, from events, on a schedule, or from a reusable protocol?</w:t>
-      </w:r>
-    </w:p>
-    <w:p>
-      <w:pPr>
         <w:numPr>
           <w:ilvl w:val="0"/>
-          <w:numId w:val="1011"/>
+          <w:numId w:val="1012"/>
         </w:numPr>
+      </w:pPr>
+      <w:r>
+        <w:t xml:space="preserve">Which steps repeat for every patient, and which depend on prior outcomes?</w:t>
+      </w:r>
+    </w:p>
+    <w:p>
+      <w:pPr>
         <w:pStyle w:val="Compact"/>
-      </w:pPr>
-      <w:r>
-        <w:t xml:space="preserve">Which steps repeat for every patient, and which depend on prior outcomes?</w:t>
-      </w:r>
-    </w:p>
-    <w:p>
-      <w:pPr>
         <w:numPr>
           <w:ilvl w:val="0"/>
-          <w:numId w:val="1011"/>
+          <w:numId w:val="1012"/>
         </w:numPr>
+      </w:pPr>
+      <w:r>
+        <w:t xml:space="preserve">Are there dependencies, delays, repeated attempts, or stop conditions?</w:t>
+      </w:r>
+    </w:p>
+    <w:p>
+      <w:pPr>
         <w:pStyle w:val="Compact"/>
-      </w:pPr>
-      <w:r>
-        <w:t xml:space="preserve">Are there dependencies, delays, repeated attempts, or stop conditions?</w:t>
-      </w:r>
-    </w:p>
-    <w:p>
-      <w:pPr>
         <w:numPr>
           <w:ilvl w:val="0"/>
-          <w:numId w:val="1011"/>
+          <w:numId w:val="1012"/>
         </w:numPr>
+      </w:pPr>
+      <w:r>
+        <w:t xml:space="preserve">When a protocol changes, do existing patients continue their current version or migrate?</w:t>
+      </w:r>
+    </w:p>
+    <w:p>
+      <w:pPr>
         <w:pStyle w:val="Compact"/>
-      </w:pPr>
-      <w:r>
-        <w:t xml:space="preserve">When a protocol changes, do existing patients continue their current version or migrate?</w:t>
-      </w:r>
-    </w:p>
-    <w:p>
-      <w:pPr>
         <w:numPr>
           <w:ilvl w:val="0"/>
-          <w:numId w:val="1011"/>
+          <w:numId w:val="1012"/>
         </w:numPr>
-        <w:pStyle w:val="Compact"/>
       </w:pPr>
       <w:r>
         <w:t xml:space="preserve">How are failed runs, duplicate events, and missed follow-ups detected and recovered?</w:t>
@@ -4331,9 +4439,8 @@
       <w:tblPr>
         <w:tblStyle w:val="Table"/>
         <w:tblW w:w="9360" w:type="dxa"/>
+        <w:tblLayout w:type="fixed"/>
         <w:tblLook w:firstRow="1" w:lastRow="0" w:firstColumn="0" w:lastColumn="0" w:noHBand="0" w:noVBand="0" w:val="0020"/>
-        <w:jc w:val="start"/>
-        <w:tblLayout w:type="fixed"/>
       </w:tblPr>
       <w:tblGrid>
         <w:gridCol w:w="4318"/>
@@ -4342,7 +4449,7 @@
       <w:tr>
         <w:trPr>
           <w:cantSplit/>
-          <w:tblHeader w:val="true"/>
+          <w:tblHeader w:val="on"/>
         </w:trPr>
         <w:tc>
           <w:tcPr/>
@@ -4505,7 +4612,7 @@
             <w:r>
               <w:t xml:space="preserve"> </w:t>
             </w:r>
-            <w:hyperlink r:id="rId41">
+            <w:hyperlink r:id="rId34">
               <w:r>
                 <w:rPr>
                   <w:rStyle w:val="VerbatimChar"/>
@@ -4669,37 +4776,7 @@
               <w:jc w:val="left"/>
             </w:pPr>
             <w:r>
-              <w:t xml:space="preserve">Use scoped transition Subscriptions and Bots to evaluate prerequisites and create or release the next Task. Do not treat</w:t>
-            </w:r>
-            <w:r>
-              <w:t xml:space="preserve"> </w:t>
-            </w:r>
-            <w:r>
-              <w:rPr>
-                <w:rStyle w:val="VerbatimChar"/>
-              </w:rPr>
-              <w:t xml:space="preserve">Task.partOf</w:t>
-            </w:r>
-            <w:r>
-              <w:t xml:space="preserve"> </w:t>
-            </w:r>
-            <w:r>
-              <w:t xml:space="preserve">or a stored</w:t>
-            </w:r>
-            <w:r>
-              <w:t xml:space="preserve"> </w:t>
-            </w:r>
-            <w:r>
-              <w:rPr>
-                <w:rStyle w:val="VerbatimChar"/>
-              </w:rPr>
-              <w:t xml:space="preserve">PlanDefinition</w:t>
-            </w:r>
-            <w:r>
-              <w:t xml:space="preserve"> </w:t>
-            </w:r>
-            <w:r>
-              <w:t xml:space="preserve">as an executing dependency engine.</w:t>
+              <w:t xml:space="preserve">Use scoped transition Subscriptions and Bots to evaluate prerequisites and create or release the next Task. Implement the dependency rules in the application or Bot.</w:t>
             </w:r>
           </w:p>
         </w:tc>
@@ -4715,7 +4792,7 @@
       <w:r>
         <w:t xml:space="preserve"> </w:t>
       </w:r>
-      <w:hyperlink r:id="rId39">
+      <w:hyperlink r:id="rId32">
         <w:r>
           <w:rPr>
             <w:rStyle w:val="Hyperlink"/>
@@ -4729,7 +4806,7 @@
       <w:r>
         <w:t xml:space="preserve"> </w:t>
       </w:r>
-      <w:hyperlink r:id="rId42">
+      <w:hyperlink r:id="rId35">
         <w:r>
           <w:rPr>
             <w:rStyle w:val="Hyperlink"/>
@@ -4743,7 +4820,7 @@
       <w:r>
         <w:t xml:space="preserve"> </w:t>
       </w:r>
-      <w:hyperlink r:id="rId43">
+      <w:hyperlink r:id="rId36">
         <w:r>
           <w:rPr>
             <w:rStyle w:val="Hyperlink"/>
@@ -4757,7 +4834,7 @@
       <w:r>
         <w:t xml:space="preserve"> </w:t>
       </w:r>
-      <w:hyperlink r:id="rId44">
+      <w:hyperlink r:id="rId37">
         <w:r>
           <w:rPr>
             <w:rStyle w:val="Hyperlink"/>
@@ -4769,8 +4846,8 @@
         <w:t xml:space="preserve">.</w:t>
       </w:r>
     </w:p>
-    <w:bookmarkEnd w:id="45"/>
-    <w:bookmarkStart w:id="49" w:name="clinical-decision-support-follow-through"/>
+    <w:bookmarkEnd w:id="38"/>
+    <w:bookmarkStart w:id="42" w:name="clinical-decision-support-follow-through"/>
     <w:p>
       <w:pPr>
         <w:pStyle w:val="Heading3"/>
@@ -4789,59 +4866,59 @@
     </w:p>
     <w:p>
       <w:pPr>
+        <w:pStyle w:val="Compact"/>
         <w:numPr>
           <w:ilvl w:val="0"/>
-          <w:numId w:val="1012"/>
+          <w:numId w:val="1013"/>
         </w:numPr>
+      </w:pPr>
+      <w:r>
+        <w:t xml:space="preserve">Do clinicians need contextual reference material, rules-based recommendations, or predictive outputs?</w:t>
+      </w:r>
+    </w:p>
+    <w:p>
+      <w:pPr>
         <w:pStyle w:val="Compact"/>
-      </w:pPr>
-      <w:r>
-        <w:t xml:space="preserve">Do clinicians need contextual reference material, rules-based recommendations, or predictive outputs?</w:t>
-      </w:r>
-    </w:p>
-    <w:p>
-      <w:pPr>
         <w:numPr>
           <w:ilvl w:val="0"/>
-          <w:numId w:val="1012"/>
+          <w:numId w:val="1013"/>
         </w:numPr>
+      </w:pPr>
+      <w:r>
+        <w:t xml:space="preserve">When should guidance appear: chart review, order entry, assessment review, or background monitoring?</w:t>
+      </w:r>
+    </w:p>
+    <w:p>
+      <w:pPr>
         <w:pStyle w:val="Compact"/>
-      </w:pPr>
-      <w:r>
-        <w:t xml:space="preserve">When should guidance appear: chart review, order entry, assessment review, or background monitoring?</w:t>
-      </w:r>
-    </w:p>
-    <w:p>
-      <w:pPr>
         <w:numPr>
           <w:ilvl w:val="0"/>
-          <w:numId w:val="1012"/>
+          <w:numId w:val="1013"/>
         </w:numPr>
+      </w:pPr>
+      <w:r>
+        <w:t xml:space="preserve">Is the output informational, does it require acknowledgment, or should accepted recommendations create work?</w:t>
+      </w:r>
+    </w:p>
+    <w:p>
+      <w:pPr>
         <w:pStyle w:val="Compact"/>
-      </w:pPr>
-      <w:r>
-        <w:t xml:space="preserve">Is the output informational, does it require acknowledgment, or should accepted recommendations create work?</w:t>
-      </w:r>
-    </w:p>
-    <w:p>
-      <w:pPr>
         <w:numPr>
           <w:ilvl w:val="0"/>
-          <w:numId w:val="1012"/>
+          <w:numId w:val="1013"/>
         </w:numPr>
+      </w:pPr>
+      <w:r>
+        <w:t xml:space="preserve">Who can accept, dismiss, or override a recommendation, and what reason or evidence should be recorded?</w:t>
+      </w:r>
+    </w:p>
+    <w:p>
+      <w:pPr>
         <w:pStyle w:val="Compact"/>
-      </w:pPr>
-      <w:r>
-        <w:t xml:space="preserve">Who can accept, dismiss, or override a recommendation, and what reason or evidence should be recorded?</w:t>
-      </w:r>
-    </w:p>
-    <w:p>
-      <w:pPr>
         <w:numPr>
           <w:ilvl w:val="0"/>
-          <w:numId w:val="1012"/>
+          <w:numId w:val="1013"/>
         </w:numPr>
-        <w:pStyle w:val="Compact"/>
       </w:pPr>
       <w:r>
         <w:t xml:space="preserve">Who maintains the knowledge or model, and how will you evaluate usefulness, missed follow-up, and excessive alerts?</w:t>
@@ -4851,9 +4928,8 @@
       <w:tblPr>
         <w:tblStyle w:val="Table"/>
         <w:tblW w:w="9360" w:type="dxa"/>
+        <w:tblLayout w:type="fixed"/>
         <w:tblLook w:firstRow="1" w:lastRow="0" w:firstColumn="0" w:lastColumn="0" w:noHBand="0" w:noVBand="0" w:val="0020"/>
-        <w:jc w:val="start"/>
-        <w:tblLayout w:type="fixed"/>
       </w:tblPr>
       <w:tblGrid>
         <w:gridCol w:w="4680"/>
@@ -4862,7 +4938,7 @@
       <w:tr>
         <w:trPr>
           <w:cantSplit/>
-          <w:tblHeader w:val="true"/>
+          <w:tblHeader w:val="on"/>
         </w:trPr>
         <w:tc>
           <w:tcPr/>
@@ -5151,7 +5227,7 @@
       <w:r>
         <w:t xml:space="preserve"> </w:t>
       </w:r>
-      <w:hyperlink r:id="rId46">
+      <w:hyperlink r:id="rId39">
         <w:r>
           <w:rPr>
             <w:rStyle w:val="Hyperlink"/>
@@ -5168,7 +5244,7 @@
       <w:r>
         <w:t xml:space="preserve"> </w:t>
       </w:r>
-      <w:hyperlink r:id="rId47">
+      <w:hyperlink r:id="rId40">
         <w:r>
           <w:rPr>
             <w:rStyle w:val="Hyperlink"/>
@@ -5193,7 +5269,7 @@
       <w:r>
         <w:t xml:space="preserve"> </w:t>
       </w:r>
-      <w:hyperlink r:id="rId48">
+      <w:hyperlink r:id="rId41">
         <w:r>
           <w:rPr>
             <w:rStyle w:val="Hyperlink"/>
@@ -5205,8 +5281,8 @@
         <w:t xml:space="preserve">.</w:t>
       </w:r>
     </w:p>
-    <w:bookmarkEnd w:id="49"/>
-    <w:bookmarkStart w:id="54" w:name="participation-access-external-handoffs"/>
+    <w:bookmarkEnd w:id="42"/>
+    <w:bookmarkStart w:id="48" w:name="participation-access-external-handoffs"/>
     <w:p>
       <w:pPr>
         <w:pStyle w:val="Heading3"/>
@@ -5225,59 +5301,59 @@
     </w:p>
     <w:p>
       <w:pPr>
+        <w:pStyle w:val="Compact"/>
         <w:numPr>
           <w:ilvl w:val="0"/>
-          <w:numId w:val="1013"/>
+          <w:numId w:val="1014"/>
         </w:numPr>
+      </w:pPr>
+      <w:r>
+        <w:t xml:space="preserve">Do patients or caregivers perform assigned actions, see progress, or only receive updates?</w:t>
+      </w:r>
+    </w:p>
+    <w:p>
+      <w:pPr>
         <w:pStyle w:val="Compact"/>
-      </w:pPr>
-      <w:r>
-        <w:t xml:space="preserve">Do patients or caregivers perform assigned actions, see progress, or only receive updates?</w:t>
-      </w:r>
-    </w:p>
-    <w:p>
-      <w:pPr>
         <w:numPr>
           <w:ilvl w:val="0"/>
-          <w:numId w:val="1013"/>
+          <w:numId w:val="1014"/>
         </w:numPr>
+      </w:pPr>
+      <w:r>
+        <w:t xml:space="preserve">Which notes and documents are internal, patient-visible, or intended for an external recipient?</w:t>
+      </w:r>
+    </w:p>
+    <w:p>
+      <w:pPr>
         <w:pStyle w:val="Compact"/>
-      </w:pPr>
-      <w:r>
-        <w:t xml:space="preserve">Which notes and documents are internal, patient-visible, or intended for an external recipient?</w:t>
-      </w:r>
-    </w:p>
-    <w:p>
-      <w:pPr>
         <w:numPr>
           <w:ilvl w:val="0"/>
-          <w:numId w:val="1013"/>
+          <w:numId w:val="1014"/>
         </w:numPr>
+      </w:pPr>
+      <w:r>
+        <w:t xml:space="preserve">After reassignment or discharge, who retains access to the record?</w:t>
+      </w:r>
+    </w:p>
+    <w:p>
+      <w:pPr>
         <w:pStyle w:val="Compact"/>
-      </w:pPr>
-      <w:r>
-        <w:t xml:space="preserve">After reassignment or discharge, who retains access to the record?</w:t>
-      </w:r>
-    </w:p>
-    <w:p>
-      <w:pPr>
         <w:numPr>
           <w:ilvl w:val="0"/>
-          <w:numId w:val="1013"/>
+          <w:numId w:val="1014"/>
         </w:numPr>
+      </w:pPr>
+      <w:r>
+        <w:t xml:space="preserve">Do external partners update shared records, exchange structured data, or return documents and messages?</w:t>
+      </w:r>
+    </w:p>
+    <w:p>
+      <w:pPr>
         <w:pStyle w:val="Compact"/>
-      </w:pPr>
-      <w:r>
-        <w:t xml:space="preserve">Do external partners update shared records, exchange structured data, or return documents and messages?</w:t>
-      </w:r>
-    </w:p>
-    <w:p>
-      <w:pPr>
         <w:numPr>
           <w:ilvl w:val="0"/>
-          <w:numId w:val="1013"/>
+          <w:numId w:val="1014"/>
         </w:numPr>
-        <w:pStyle w:val="Compact"/>
       </w:pPr>
       <w:r>
         <w:t xml:space="preserve">How are replies matched to the original request, and who handles unmatched responses?</w:t>
@@ -5287,9 +5363,8 @@
       <w:tblPr>
         <w:tblStyle w:val="Table"/>
         <w:tblW w:w="9360" w:type="dxa"/>
+        <w:tblLayout w:type="fixed"/>
         <w:tblLook w:firstRow="1" w:lastRow="0" w:firstColumn="0" w:lastColumn="0" w:noHBand="0" w:noVBand="0" w:val="0020"/>
-        <w:jc w:val="start"/>
-        <w:tblLayout w:type="fixed"/>
       </w:tblPr>
       <w:tblGrid>
         <w:gridCol w:w="4356"/>
@@ -5298,7 +5373,7 @@
       <w:tr>
         <w:trPr>
           <w:cantSplit/>
-          <w:tblHeader w:val="true"/>
+          <w:tblHeader w:val="on"/>
         </w:trPr>
         <w:tc>
           <w:tcPr/>
@@ -5337,46 +5412,63 @@
               <w:jc w:val="left"/>
             </w:pPr>
             <w:r>
-              <w:t xml:space="preserve">Participants need different visibility</w:t>
-            </w:r>
-          </w:p>
-        </w:tc>
-        <w:tc>
-          <w:tcPr/>
-          <w:p>
-            <w:pPr>
-              <w:pStyle w:val="Compact"/>
-              <w:jc w:val="left"/>
-            </w:pPr>
-            <w:r>
-              <w:t xml:space="preserve">Enforce access through</w:t>
-            </w:r>
-            <w:r>
-              <w:t xml:space="preserve"> </w:t>
-            </w:r>
-            <w:r>
-              <w:rPr>
-                <w:rStyle w:val="VerbatimChar"/>
-              </w:rPr>
-              <w:t xml:space="preserve">AccessPolicy</w:t>
-            </w:r>
-            <w:r>
-              <w:t xml:space="preserve"> </w:t>
-            </w:r>
-            <w:r>
-              <w:t xml:space="preserve">and</w:t>
-            </w:r>
-            <w:r>
-              <w:t xml:space="preserve"> </w:t>
-            </w:r>
-            <w:r>
-              <w:rPr>
-                <w:rStyle w:val="VerbatimChar"/>
-              </w:rPr>
-              <w:t xml:space="preserve">ProjectMembership</w:t>
-            </w:r>
-            <w:r>
-              <w:t xml:space="preserve">; define permissions for each relevant resource type.</w:t>
+              <w:t xml:space="preserve">Patients or caregivers complete assigned work</w:t>
+            </w:r>
+          </w:p>
+        </w:tc>
+        <w:tc>
+          <w:tcPr/>
+          <w:p>
+            <w:pPr>
+              <w:pStyle w:val="Compact"/>
+              <w:jc w:val="left"/>
+            </w:pPr>
+            <w:r>
+              <w:t xml:space="preserve">Set</w:t>
+            </w:r>
+            <w:r>
+              <w:t xml:space="preserve"> </w:t>
+            </w:r>
+            <w:r>
+              <w:rPr>
+                <w:rStyle w:val="VerbatimChar"/>
+              </w:rPr>
+              <w:t xml:space="preserve">owner</w:t>
+            </w:r>
+            <w:r>
+              <w:t xml:space="preserve"> </w:t>
+            </w:r>
+            <w:r>
+              <w:t xml:space="preserve">to Patient or RelatedPerson and</w:t>
+            </w:r>
+            <w:r>
+              <w:t xml:space="preserve"> </w:t>
+            </w:r>
+            <w:r>
+              <w:rPr>
+                <w:rStyle w:val="VerbatimChar"/>
+              </w:rPr>
+              <w:t xml:space="preserve">for</w:t>
+            </w:r>
+            <w:r>
+              <w:t xml:space="preserve"> </w:t>
+            </w:r>
+            <w:r>
+              <w:t xml:space="preserve">to the patient. For forms, focus on the Questionnaire and return the QuestionnaireResponse in Task output; give staff review a separate Task. See</w:t>
+            </w:r>
+            <w:r>
+              <w:t xml:space="preserve"> </w:t>
+            </w:r>
+            <w:hyperlink r:id="rId43">
+              <w:r>
+                <w:rPr>
+                  <w:rStyle w:val="Hyperlink"/>
+                </w:rPr>
+                <w:t xml:space="preserve">patient work lists</w:t>
+              </w:r>
+            </w:hyperlink>
+            <w:r>
+              <w:t xml:space="preserve">.</w:t>
             </w:r>
           </w:p>
         </w:tc>
@@ -5393,19 +5485,46 @@
               <w:jc w:val="left"/>
             </w:pPr>
             <w:r>
-              <w:t xml:space="preserve">Patient-related resources are linked together</w:t>
-            </w:r>
-          </w:p>
-        </w:tc>
-        <w:tc>
-          <w:tcPr/>
-          <w:p>
-            <w:pPr>
-              <w:pStyle w:val="Compact"/>
-              <w:jc w:val="left"/>
-            </w:pPr>
-            <w:r>
-              <w:t xml:space="preserve">Populate each resource’s own patient-compartment references. A link to a Task, CarePlan, or message thread does not by itself propagate patient access.</w:t>
+              <w:t xml:space="preserve">Participants need different visibility</w:t>
+            </w:r>
+          </w:p>
+        </w:tc>
+        <w:tc>
+          <w:tcPr/>
+          <w:p>
+            <w:pPr>
+              <w:pStyle w:val="Compact"/>
+              <w:jc w:val="left"/>
+            </w:pPr>
+            <w:r>
+              <w:t xml:space="preserve">Enforce access through</w:t>
+            </w:r>
+            <w:r>
+              <w:t xml:space="preserve"> </w:t>
+            </w:r>
+            <w:r>
+              <w:rPr>
+                <w:rStyle w:val="VerbatimChar"/>
+              </w:rPr>
+              <w:t xml:space="preserve">AccessPolicy</w:t>
+            </w:r>
+            <w:r>
+              <w:t xml:space="preserve"> </w:t>
+            </w:r>
+            <w:r>
+              <w:t xml:space="preserve">and</w:t>
+            </w:r>
+            <w:r>
+              <w:t xml:space="preserve"> </w:t>
+            </w:r>
+            <w:r>
+              <w:rPr>
+                <w:rStyle w:val="VerbatimChar"/>
+              </w:rPr>
+              <w:t xml:space="preserve">ProjectMembership</w:t>
+            </w:r>
+            <w:r>
+              <w:t xml:space="preserve">; define permissions for each relevant resource type.</w:t>
             </w:r>
           </w:p>
         </w:tc>
@@ -5422,76 +5541,19 @@
               <w:jc w:val="left"/>
             </w:pPr>
             <w:r>
-              <w:t xml:space="preserve">Work includes messaging</w:t>
-            </w:r>
-          </w:p>
-        </w:tc>
-        <w:tc>
-          <w:tcPr/>
-          <w:p>
-            <w:pPr>
-              <w:pStyle w:val="Compact"/>
-              <w:jc w:val="left"/>
-            </w:pPr>
-            <w:r>
-              <w:t xml:space="preserve">Point</w:t>
-            </w:r>
-            <w:r>
-              <w:t xml:space="preserve"> </w:t>
-            </w:r>
-            <w:r>
-              <w:rPr>
-                <w:rStyle w:val="VerbatimChar"/>
-              </w:rPr>
-              <w:t xml:space="preserve">Task.focus</w:t>
-            </w:r>
-            <w:r>
-              <w:t xml:space="preserve"> </w:t>
-            </w:r>
-            <w:r>
-              <w:t xml:space="preserve">to the</w:t>
-            </w:r>
-            <w:r>
-              <w:t xml:space="preserve"> </w:t>
-            </w:r>
-            <w:r>
-              <w:rPr>
-                <w:rStyle w:val="VerbatimChar"/>
-              </w:rPr>
-              <w:t xml:space="preserve">Communication</w:t>
-            </w:r>
-            <w:r>
-              <w:t xml:space="preserve"> </w:t>
-            </w:r>
-            <w:r>
-              <w:t xml:space="preserve">thread header and</w:t>
-            </w:r>
-            <w:r>
-              <w:t xml:space="preserve"> </w:t>
-            </w:r>
-            <w:r>
-              <w:rPr>
-                <w:rStyle w:val="VerbatimChar"/>
-              </w:rPr>
-              <w:t xml:space="preserve">Task.for</w:t>
-            </w:r>
-            <w:r>
-              <w:t xml:space="preserve"> </w:t>
-            </w:r>
-            <w:r>
-              <w:t xml:space="preserve">to the patient. Reference the resolving message in</w:t>
-            </w:r>
-            <w:r>
-              <w:t xml:space="preserve"> </w:t>
-            </w:r>
-            <w:r>
-              <w:rPr>
-                <w:rStyle w:val="VerbatimChar"/>
-              </w:rPr>
-              <w:t xml:space="preserve">Task.output.valueReference</w:t>
-            </w:r>
-            <w:r>
-              <w:t xml:space="preserve">. Complete the Task only when the response satisfies the workflow’s completion criteria.</w:t>
+              <w:t xml:space="preserve">Patient-related resources are linked together</w:t>
+            </w:r>
+          </w:p>
+        </w:tc>
+        <w:tc>
+          <w:tcPr/>
+          <w:p>
+            <w:pPr>
+              <w:pStyle w:val="Compact"/>
+              <w:jc w:val="left"/>
+            </w:pPr>
+            <w:r>
+              <w:t xml:space="preserve">Populate each resource’s own patient-compartment references. A link to a Task, CarePlan, or message thread does not by itself propagate patient access.</w:t>
             </w:r>
           </w:p>
         </w:tc>
@@ -5508,88 +5570,76 @@
               <w:jc w:val="left"/>
             </w:pPr>
             <w:r>
-              <w:t xml:space="preserve">Documents support a handoff</w:t>
-            </w:r>
-          </w:p>
-        </w:tc>
-        <w:tc>
-          <w:tcPr/>
-          <w:p>
-            <w:pPr>
-              <w:pStyle w:val="Compact"/>
-              <w:jc w:val="left"/>
-            </w:pPr>
-            <w:r>
-              <w:t xml:space="preserve">Store file content in</w:t>
-            </w:r>
-            <w:r>
-              <w:t xml:space="preserve"> </w:t>
-            </w:r>
-            <w:r>
-              <w:rPr>
-                <w:rStyle w:val="VerbatimChar"/>
-              </w:rPr>
-              <w:t xml:space="preserve">Binary</w:t>
-            </w:r>
-            <w:r>
-              <w:t xml:space="preserve"> </w:t>
-            </w:r>
-            <w:r>
-              <w:t xml:space="preserve">and describe it with</w:t>
-            </w:r>
-            <w:r>
-              <w:t xml:space="preserve"> </w:t>
-            </w:r>
-            <w:r>
-              <w:rPr>
-                <w:rStyle w:val="VerbatimChar"/>
-              </w:rPr>
-              <w:t xml:space="preserve">DocumentReference</w:t>
-            </w:r>
-            <w:r>
-              <w:t xml:space="preserve">. Use an attachment URL such as</w:t>
-            </w:r>
-            <w:r>
-              <w:t xml:space="preserve"> </w:t>
-            </w:r>
-            <w:r>
-              <w:rPr>
-                <w:rStyle w:val="VerbatimChar"/>
-              </w:rPr>
-              <w:t xml:space="preserve">Binary/{id}</w:t>
-            </w:r>
-            <w:r>
-              <w:t xml:space="preserve"> </w:t>
-            </w:r>
-            <w:r>
-              <w:t xml:space="preserve">and set the Binary’s</w:t>
-            </w:r>
-            <w:r>
-              <w:t xml:space="preserve"> </w:t>
-            </w:r>
-            <w:r>
-              <w:rPr>
-                <w:rStyle w:val="VerbatimChar"/>
-              </w:rPr>
-              <w:t xml:space="preserve">securityContext</w:t>
-            </w:r>
-            <w:r>
-              <w:t xml:space="preserve"> </w:t>
-            </w:r>
-            <w:r>
-              <w:t xml:space="preserve">appropriately; do not embed base64 in</w:t>
-            </w:r>
-            <w:r>
-              <w:t xml:space="preserve"> </w:t>
-            </w:r>
-            <w:r>
-              <w:rPr>
-                <w:rStyle w:val="VerbatimChar"/>
-              </w:rPr>
-              <w:t xml:space="preserve">Attachment.data</w:t>
-            </w:r>
-            <w:r>
-              <w:t xml:space="preserve">.</w:t>
+              <w:t xml:space="preserve">Work includes messaging</w:t>
+            </w:r>
+          </w:p>
+        </w:tc>
+        <w:tc>
+          <w:tcPr/>
+          <w:p>
+            <w:pPr>
+              <w:pStyle w:val="Compact"/>
+              <w:jc w:val="left"/>
+            </w:pPr>
+            <w:r>
+              <w:t xml:space="preserve">Point</w:t>
+            </w:r>
+            <w:r>
+              <w:t xml:space="preserve"> </w:t>
+            </w:r>
+            <w:r>
+              <w:rPr>
+                <w:rStyle w:val="VerbatimChar"/>
+              </w:rPr>
+              <w:t xml:space="preserve">Task.focus</w:t>
+            </w:r>
+            <w:r>
+              <w:t xml:space="preserve"> </w:t>
+            </w:r>
+            <w:r>
+              <w:t xml:space="preserve">to the</w:t>
+            </w:r>
+            <w:r>
+              <w:t xml:space="preserve"> </w:t>
+            </w:r>
+            <w:r>
+              <w:rPr>
+                <w:rStyle w:val="VerbatimChar"/>
+              </w:rPr>
+              <w:t xml:space="preserve">Communication</w:t>
+            </w:r>
+            <w:r>
+              <w:t xml:space="preserve"> </w:t>
+            </w:r>
+            <w:r>
+              <w:t xml:space="preserve">thread header and</w:t>
+            </w:r>
+            <w:r>
+              <w:t xml:space="preserve"> </w:t>
+            </w:r>
+            <w:r>
+              <w:rPr>
+                <w:rStyle w:val="VerbatimChar"/>
+              </w:rPr>
+              <w:t xml:space="preserve">Task.for</w:t>
+            </w:r>
+            <w:r>
+              <w:t xml:space="preserve"> </w:t>
+            </w:r>
+            <w:r>
+              <w:t xml:space="preserve">to the patient. Reference the resolving message in</w:t>
+            </w:r>
+            <w:r>
+              <w:t xml:space="preserve"> </w:t>
+            </w:r>
+            <w:r>
+              <w:rPr>
+                <w:rStyle w:val="VerbatimChar"/>
+              </w:rPr>
+              <w:t xml:space="preserve">Task.output.valueReference</w:t>
+            </w:r>
+            <w:r>
+              <w:t xml:space="preserve">. Complete the Task only when the response satisfies the workflow’s completion criteria.</w:t>
             </w:r>
           </w:p>
         </w:tc>
@@ -5606,6 +5656,104 @@
               <w:jc w:val="left"/>
             </w:pPr>
             <w:r>
+              <w:t xml:space="preserve">Documents support a handoff</w:t>
+            </w:r>
+          </w:p>
+        </w:tc>
+        <w:tc>
+          <w:tcPr/>
+          <w:p>
+            <w:pPr>
+              <w:pStyle w:val="Compact"/>
+              <w:jc w:val="left"/>
+            </w:pPr>
+            <w:r>
+              <w:t xml:space="preserve">Store file content in</w:t>
+            </w:r>
+            <w:r>
+              <w:t xml:space="preserve"> </w:t>
+            </w:r>
+            <w:r>
+              <w:rPr>
+                <w:rStyle w:val="VerbatimChar"/>
+              </w:rPr>
+              <w:t xml:space="preserve">Binary</w:t>
+            </w:r>
+            <w:r>
+              <w:t xml:space="preserve"> </w:t>
+            </w:r>
+            <w:r>
+              <w:t xml:space="preserve">and describe it with</w:t>
+            </w:r>
+            <w:r>
+              <w:t xml:space="preserve"> </w:t>
+            </w:r>
+            <w:r>
+              <w:rPr>
+                <w:rStyle w:val="VerbatimChar"/>
+              </w:rPr>
+              <w:t xml:space="preserve">DocumentReference</w:t>
+            </w:r>
+            <w:r>
+              <w:t xml:space="preserve">. Use an attachment URL such as</w:t>
+            </w:r>
+            <w:r>
+              <w:t xml:space="preserve"> </w:t>
+            </w:r>
+            <w:r>
+              <w:rPr>
+                <w:rStyle w:val="VerbatimChar"/>
+              </w:rPr>
+              <w:t xml:space="preserve">Binary/{id}</w:t>
+            </w:r>
+            <w:r>
+              <w:t xml:space="preserve"> </w:t>
+            </w:r>
+            <w:r>
+              <w:t xml:space="preserve">and set the Binary’s</w:t>
+            </w:r>
+            <w:r>
+              <w:t xml:space="preserve"> </w:t>
+            </w:r>
+            <w:r>
+              <w:rPr>
+                <w:rStyle w:val="VerbatimChar"/>
+              </w:rPr>
+              <w:t xml:space="preserve">securityContext</w:t>
+            </w:r>
+            <w:r>
+              <w:t xml:space="preserve"> </w:t>
+            </w:r>
+            <w:r>
+              <w:t xml:space="preserve">appropriately; do not embed base64 in</w:t>
+            </w:r>
+            <w:r>
+              <w:t xml:space="preserve"> </w:t>
+            </w:r>
+            <w:r>
+              <w:rPr>
+                <w:rStyle w:val="VerbatimChar"/>
+              </w:rPr>
+              <w:t xml:space="preserve">Attachment.data</w:t>
+            </w:r>
+            <w:r>
+              <w:t xml:space="preserve">.</w:t>
+            </w:r>
+          </w:p>
+        </w:tc>
+      </w:tr>
+      <w:tr>
+        <w:trPr>
+          <w:cantSplit/>
+        </w:trPr>
+        <w:tc>
+          <w:tcPr/>
+          <w:p>
+            <w:pPr>
+              <w:pStyle w:val="Compact"/>
+              <w:jc w:val="left"/>
+            </w:pPr>
+            <w:r>
               <w:t xml:space="preserve">A referral transfers a request for services</w:t>
             </w:r>
           </w:p>
@@ -5623,7 +5771,7 @@
             <w:r>
               <w:t xml:space="preserve"> </w:t>
             </w:r>
-            <w:hyperlink r:id="rId50">
+            <w:hyperlink r:id="rId44">
               <w:r>
                 <w:rPr>
                   <w:rStyle w:val="Hyperlink"/>
@@ -5651,7 +5799,7 @@
       <w:r>
         <w:t xml:space="preserve"> </w:t>
       </w:r>
-      <w:hyperlink r:id="rId51">
+      <w:hyperlink r:id="rId45">
         <w:r>
           <w:rPr>
             <w:rStyle w:val="Hyperlink"/>
@@ -5665,7 +5813,7 @@
       <w:r>
         <w:t xml:space="preserve"> </w:t>
       </w:r>
-      <w:hyperlink r:id="rId52">
+      <w:hyperlink r:id="rId46">
         <w:r>
           <w:rPr>
             <w:rStyle w:val="Hyperlink"/>
@@ -5679,7 +5827,7 @@
       <w:r>
         <w:t xml:space="preserve"> </w:t>
       </w:r>
-      <w:hyperlink r:id="rId53">
+      <w:hyperlink r:id="rId47">
         <w:r>
           <w:rPr>
             <w:rStyle w:val="Hyperlink"/>
@@ -5694,8 +5842,8 @@
         <w:t xml:space="preserve">docs for the detailed designs. Scheduling and billing decisions should likewise link to their respective workflow documentation.</w:t>
       </w:r>
     </w:p>
-    <w:bookmarkEnd w:id="54"/>
-    <w:bookmarkStart w:id="55" w:name="operational-reporting-closure"/>
+    <w:bookmarkEnd w:id="48"/>
+    <w:bookmarkStart w:id="49" w:name="operational-reporting-closure"/>
     <w:p>
       <w:pPr>
         <w:pStyle w:val="Heading3"/>
@@ -5714,47 +5862,47 @@
     </w:p>
     <w:p>
       <w:pPr>
+        <w:pStyle w:val="Compact"/>
         <w:numPr>
           <w:ilvl w:val="0"/>
-          <w:numId w:val="1014"/>
+          <w:numId w:val="1015"/>
         </w:numPr>
+      </w:pPr>
+      <w:r>
+        <w:t xml:space="preserve">Which daily views do staff need: unassigned work, due work, blocked items, workload by team, or patients needing follow-up?</w:t>
+      </w:r>
+    </w:p>
+    <w:p>
+      <w:pPr>
         <w:pStyle w:val="Compact"/>
-      </w:pPr>
-      <w:r>
-        <w:t xml:space="preserve">Which daily views do staff need: unassigned work, due work, blocked items, workload by team, or patients needing follow-up?</w:t>
-      </w:r>
-    </w:p>
-    <w:p>
-      <w:pPr>
         <w:numPr>
           <w:ilvl w:val="0"/>
-          <w:numId w:val="1014"/>
+          <w:numId w:val="1015"/>
         </w:numPr>
+      </w:pPr>
+      <w:r>
+        <w:t xml:space="preserve">Which measures demonstrate improvement: turnaround time, fewer handoffs, appropriate delegation, successful follow-up, or goal progress?</w:t>
+      </w:r>
+    </w:p>
+    <w:p>
+      <w:pPr>
         <w:pStyle w:val="Compact"/>
-      </w:pPr>
-      <w:r>
-        <w:t xml:space="preserve">Which measures demonstrate improvement: turnaround time, fewer handoffs, appropriate delegation, successful follow-up, or goal progress?</w:t>
-      </w:r>
-    </w:p>
-    <w:p>
-      <w:pPr>
         <w:numPr>
           <w:ilvl w:val="0"/>
-          <w:numId w:val="1014"/>
+          <w:numId w:val="1015"/>
         </w:numPr>
+      </w:pPr>
+      <w:r>
+        <w:t xml:space="preserve">What timestamps and event history support those measures, including reopened work and paused clocks?</w:t>
+      </w:r>
+    </w:p>
+    <w:p>
+      <w:pPr>
         <w:pStyle w:val="Compact"/>
-      </w:pPr>
-      <w:r>
-        <w:t xml:space="preserve">What timestamps and event history support those measures, including reopened work and paused clocks?</w:t>
-      </w:r>
-    </w:p>
-    <w:p>
-      <w:pPr>
         <w:numPr>
           <w:ilvl w:val="0"/>
-          <w:numId w:val="1014"/>
+          <w:numId w:val="1015"/>
         </w:numPr>
-        <w:pStyle w:val="Compact"/>
       </w:pPr>
       <w:r>
         <w:t xml:space="preserve">Does completing a Task also complete an activity, referral, plan, or case? Under what conditions?</w:t>
@@ -5764,9 +5912,8 @@
       <w:tblPr>
         <w:tblStyle w:val="Table"/>
         <w:tblW w:w="9360" w:type="dxa"/>
+        <w:tblLayout w:type="fixed"/>
         <w:tblLook w:firstRow="1" w:lastRow="0" w:firstColumn="0" w:lastColumn="0" w:noHBand="0" w:noVBand="0" w:val="0020"/>
-        <w:jc w:val="start"/>
-        <w:tblLayout w:type="fixed"/>
       </w:tblPr>
       <w:tblGrid>
         <w:gridCol w:w="4452"/>
@@ -5775,7 +5922,7 @@
       <w:tr>
         <w:trPr>
           <w:cantSplit/>
-          <w:tblHeader w:val="true"/>
+          <w:tblHeader w:val="on"/>
         </w:trPr>
         <w:tc>
           <w:tcPr/>
@@ -5918,7 +6065,7 @@
               <w:jc w:val="left"/>
             </w:pPr>
             <w:r>
-              <w:t xml:space="preserve">Build a reporting table with Task ID, previous/new stage or owner, transition time, actor, and reason, derived from history and any explicit Provenance. Calculate stage durations and paused intervals from this event sequence. This is an analytics schema, not a new FHIR resource.</w:t>
+              <w:t xml:space="preserve">Build a reporting table with Task ID, previous/new stage or owner, transition time, actor, and reason, derived from history and any explicit Provenance. Calculate stage durations and paused intervals from this event sequence. Store the derived intervals in the reporting system.</w:t>
             </w:r>
           </w:p>
         </w:tc>
@@ -6054,9 +6201,9 @@
         </w:tc>
       </w:tr>
     </w:tbl>
-    <w:bookmarkEnd w:id="55"/>
-    <w:bookmarkEnd w:id="56"/>
-    <w:bookmarkStart w:id="61" w:name="X4c59cba664d03f8dc0701cf52eb20c40b875665"/>
+    <w:bookmarkEnd w:id="49"/>
+    <w:bookmarkEnd w:id="50"/>
+    <w:bookmarkStart w:id="51" w:name="X4c59cba664d03f8dc0701cf52eb20c40b875665"/>
     <w:p>
       <w:pPr>
         <w:pStyle w:val="Heading2"/>
@@ -6067,142 +6214,78 @@
     </w:p>
     <w:p>
       <w:pPr>
+        <w:pStyle w:val="Compact"/>
         <w:numPr>
           <w:ilvl w:val="0"/>
-          <w:numId w:val="1015"/>
+          <w:numId w:val="1016"/>
         </w:numPr>
+      </w:pPr>
+      <w:r>
+        <w:t xml:space="preserve">The first workflow, its entry event, and its source of truth</w:t>
+      </w:r>
+    </w:p>
+    <w:p>
+      <w:pPr>
         <w:pStyle w:val="Compact"/>
-      </w:pPr>
-      <w:r>
-        <w:t xml:space="preserve">The first workflow, its entry event, and its source of truth</w:t>
-      </w:r>
-    </w:p>
-    <w:p>
-      <w:pPr>
         <w:numPr>
           <w:ilvl w:val="0"/>
-          <w:numId w:val="1015"/>
+          <w:numId w:val="1016"/>
         </w:numPr>
+      </w:pPr>
+      <w:r>
+        <w:t xml:space="preserve">Work items, clinical context, and any longitudinal case or care-plan model</w:t>
+      </w:r>
+    </w:p>
+    <w:p>
+      <w:pPr>
         <w:pStyle w:val="Compact"/>
-      </w:pPr>
-      <w:r>
-        <w:t xml:space="preserve">Work items, clinical context, and any longitudinal case or care-plan model</w:t>
-      </w:r>
-    </w:p>
-    <w:p>
-      <w:pPr>
         <w:numPr>
           <w:ilvl w:val="0"/>
-          <w:numId w:val="1015"/>
+          <w:numId w:val="1016"/>
         </w:numPr>
+      </w:pPr>
+      <w:r>
+        <w:t xml:space="preserve">Eligible roles, accountable owners, review steps, and exception handling</w:t>
+      </w:r>
+    </w:p>
+    <w:p>
+      <w:pPr>
         <w:pStyle w:val="Compact"/>
-      </w:pPr>
-      <w:r>
-        <w:t xml:space="preserve">Eligible roles, accountable owners, review steps, and exception handling</w:t>
-      </w:r>
-    </w:p>
-    <w:p>
-      <w:pPr>
         <w:numPr>
           <w:ilvl w:val="0"/>
-          <w:numId w:val="1015"/>
+          <w:numId w:val="1016"/>
         </w:numPr>
+      </w:pPr>
+      <w:r>
+        <w:t xml:space="preserve">Lifecycle stages, completion evidence, deadlines, and escalation rules</w:t>
+      </w:r>
+    </w:p>
+    <w:p>
+      <w:pPr>
         <w:pStyle w:val="Compact"/>
-      </w:pPr>
-      <w:r>
-        <w:t xml:space="preserve">Lifecycle stages, completion evidence, deadlines, and escalation rules</w:t>
-      </w:r>
-    </w:p>
-    <w:p>
-      <w:pPr>
         <w:numPr>
           <w:ilvl w:val="0"/>
-          <w:numId w:val="1015"/>
+          <w:numId w:val="1016"/>
         </w:numPr>
+      </w:pPr>
+      <w:r>
+        <w:t xml:space="preserve">Automation and CDS behavior, including human review and failure recovery</w:t>
+      </w:r>
+    </w:p>
+    <w:p>
+      <w:pPr>
         <w:pStyle w:val="Compact"/>
-      </w:pPr>
-      <w:r>
-        <w:t xml:space="preserve">Automation and CDS behavior, including human review and failure recovery</w:t>
-      </w:r>
-    </w:p>
-    <w:p>
-      <w:pPr>
         <w:numPr>
           <w:ilvl w:val="0"/>
-          <w:numId w:val="1015"/>
+          <w:numId w:val="1016"/>
         </w:numPr>
-        <w:pStyle w:val="Compact"/>
       </w:pPr>
       <w:r>
         <w:t xml:space="preserve">Access boundaries, external handoffs, and the measures of success</w:t>
       </w:r>
     </w:p>
-    <w:p>
-      <w:pPr>
-        <w:pStyle w:val="FirstParagraph"/>
-      </w:pPr>
-      <w:r>
-        <w:t xml:space="preserve">Use these decisions to select the implementation guides and examples needed for the first release. Start with</w:t>
-      </w:r>
-      <w:r>
-        <w:t xml:space="preserve"> </w:t>
-      </w:r>
-      <w:hyperlink r:id="rId57">
-        <w:r>
-          <w:rPr>
-            <w:rStyle w:val="Hyperlink"/>
-          </w:rPr>
-          <w:t xml:space="preserve">Teams and Delegation</w:t>
-        </w:r>
-      </w:hyperlink>
-      <w:r>
-        <w:t xml:space="preserve">,</w:t>
-      </w:r>
-      <w:r>
-        <w:t xml:space="preserve"> </w:t>
-      </w:r>
-      <w:hyperlink r:id="rId58">
-        <w:r>
-          <w:rPr>
-            <w:rStyle w:val="Hyperlink"/>
-          </w:rPr>
-          <w:t xml:space="preserve">Handoffs and Escalation</w:t>
-        </w:r>
-      </w:hyperlink>
-      <w:r>
-        <w:t xml:space="preserve">,</w:t>
-      </w:r>
-      <w:r>
-        <w:t xml:space="preserve"> </w:t>
-      </w:r>
-      <w:hyperlink r:id="rId59">
-        <w:r>
-          <w:rPr>
-            <w:rStyle w:val="Hyperlink"/>
-          </w:rPr>
-          <w:t xml:space="preserve">Automation</w:t>
-        </w:r>
-      </w:hyperlink>
-      <w:r>
-        <w:t xml:space="preserve">, and</w:t>
-      </w:r>
-      <w:r>
-        <w:t xml:space="preserve"> </w:t>
-      </w:r>
-      <w:hyperlink r:id="rId60">
-        <w:r>
-          <w:rPr>
-            <w:rStyle w:val="Hyperlink"/>
-          </w:rPr>
-          <w:t xml:space="preserve">Operational Reporting</w:t>
-        </w:r>
-      </w:hyperlink>
-      <w:r>
-        <w:t xml:space="preserve">.</w:t>
-      </w:r>
-    </w:p>
-    <w:bookmarkEnd w:id="61"/>
-    <w:bookmarkEnd w:id="62"/>
+    <w:bookmarkEnd w:id="51"/>
+    <w:bookmarkEnd w:id="52"/>
     <w:sectPr>
       <w:pgSz w:h="15840" w:w="12240"/>
       <w:pgMar w:bottom="1440" w:footer="720" w:gutter="0" w:header="720" w:left="1440" w:right="1440" w:top="1440"/>
@@ -6240,14 +6323,14 @@
 <file path=word/numbering.xml><?xml version="1.0" encoding="utf-8"?>
 <w:numbering xmlns:w="http://schemas.openxmlformats.org/wordprocessingml/2006/main">
   <w:abstractNum w:abstractNumId="990">
-    <w:nsid w:val="A990"/>
+    <w:nsid w:val="0000A990"/>
     <w:multiLevelType w:val="multilevel"/>
     <w:lvl w:ilvl="0">
       <w:numFmt w:val="bullet"/>
       <w:lvlText w:val=" "/>
       <w:lvlJc w:val="left"/>
       <w:pPr>
-        <w:ind w:left="720" w:hanging="480"/>
+        <w:ind w:left="720" w:hanging="360"/>
       </w:pPr>
     </w:lvl>
     <w:lvl w:ilvl="1">
@@ -6255,7 +6338,7 @@
       <w:lvlText w:val=" "/>
       <w:lvlJc w:val="left"/>
       <w:pPr>
-        <w:ind w:left="1440" w:hanging="480"/>
+        <w:ind w:left="1440" w:hanging="360"/>
       </w:pPr>
     </w:lvl>
     <w:lvl w:ilvl="2">
@@ -6263,7 +6346,7 @@
       <w:lvlText w:val=" "/>
       <w:lvlJc w:val="left"/>
       <w:pPr>
-        <w:ind w:left="2160" w:hanging="480"/>
+        <w:ind w:left="2160" w:hanging="360"/>
       </w:pPr>
     </w:lvl>
     <w:lvl w:ilvl="3">
@@ -6271,7 +6354,7 @@
       <w:lvlText w:val=" "/>
       <w:lvlJc w:val="left"/>
       <w:pPr>
-        <w:ind w:left="2880" w:hanging="480"/>
+        <w:ind w:left="2880" w:hanging="360"/>
       </w:pPr>
     </w:lvl>
     <w:lvl w:ilvl="4">
@@ -6279,7 +6362,7 @@
       <w:lvlText w:val=" "/>
       <w:lvlJc w:val="left"/>
       <w:pPr>
-        <w:ind w:left="3600" w:hanging="480"/>
+        <w:ind w:left="3600" w:hanging="360"/>
       </w:pPr>
     </w:lvl>
     <w:lvl w:ilvl="5">
@@ -6287,7 +6370,7 @@
       <w:lvlText w:val=" "/>
       <w:lvlJc w:val="left"/>
       <w:pPr>
-        <w:ind w:left="4320" w:hanging="480"/>
+        <w:ind w:left="4320" w:hanging="360"/>
       </w:pPr>
     </w:lvl>
     <w:lvl w:ilvl="6">
@@ -6295,7 +6378,7 @@
       <w:lvlText w:val=" "/>
       <w:lvlJc w:val="left"/>
       <w:pPr>
-        <w:ind w:left="5040" w:hanging="480"/>
+        <w:ind w:left="5040" w:hanging="360"/>
       </w:pPr>
     </w:lvl>
     <w:lvl w:ilvl="7">
@@ -6303,7 +6386,7 @@
       <w:lvlText w:val=" "/>
       <w:lvlJc w:val="left"/>
       <w:pPr>
-        <w:ind w:left="5760" w:hanging="480"/>
+        <w:ind w:left="5760" w:hanging="360"/>
       </w:pPr>
     </w:lvl>
     <w:lvl w:ilvl="8">
@@ -6311,84 +6394,111 @@
       <w:lvlText w:val=" "/>
       <w:lvlJc w:val="left"/>
       <w:pPr>
-        <w:ind w:left="6480" w:hanging="480"/>
+        <w:ind w:left="6480" w:hanging="360"/>
       </w:pPr>
     </w:lvl>
   </w:abstractNum>
   <w:abstractNum w:abstractNumId="991">
-    <w:nsid w:val="A991"/>
+    <w:nsid w:val="0000A991"/>
     <w:multiLevelType w:val="multilevel"/>
     <w:lvl w:ilvl="0">
       <w:numFmt w:val="bullet"/>
-      <w:lvlText w:val="•"/>
+      <w:lvlText w:val=""/>
       <w:lvlJc w:val="left"/>
       <w:pPr>
-        <w:ind w:left="720" w:hanging="480"/>
-      </w:pPr>
+        <w:ind w:left="720" w:hanging="360"/>
+      </w:pPr>
+      <w:rPr>
+        <w:rFonts w:ascii="Symbol" w:hAnsi="Symbol" w:cs="Symbol" w:hint="default"/>
+      </w:rPr>
     </w:lvl>
     <w:lvl w:ilvl="1">
       <w:numFmt w:val="bullet"/>
-      <w:lvlText w:val="–"/>
+      <w:lvlText w:val="o"/>
       <w:lvlJc w:val="left"/>
       <w:pPr>
-        <w:ind w:left="1440" w:hanging="480"/>
-      </w:pPr>
+        <w:ind w:left="1440" w:hanging="360"/>
+      </w:pPr>
+      <w:rPr>
+        <w:rFonts w:ascii="Courier New" w:hAnsi="Courier New" w:cs="Courier New" w:hint="default"/>
+      </w:rPr>
     </w:lvl>
     <w:lvl w:ilvl="2">
       <w:numFmt w:val="bullet"/>
-      <w:lvlText w:val="•"/>
+      <w:lvlText w:val=""/>
       <w:lvlJc w:val="left"/>
       <w:pPr>
-        <w:ind w:left="2160" w:hanging="480"/>
-      </w:pPr>
+        <w:ind w:left="2160" w:hanging="360"/>
+      </w:pPr>
+      <w:rPr>
+        <w:rFonts w:ascii="Wingdings" w:hAnsi="Wingdings" w:cs="Wingdings" w:hint="default"/>
+      </w:rPr>
     </w:lvl>
     <w:lvl w:ilvl="3">
       <w:numFmt w:val="bullet"/>
-      <w:lvlText w:val="–"/>
+      <w:lvlText w:val=""/>
       <w:lvlJc w:val="left"/>
       <w:pPr>
-        <w:ind w:left="2880" w:hanging="480"/>
-      </w:pPr>
+        <w:ind w:left="2880" w:hanging="360"/>
+      </w:pPr>
+      <w:rPr>
+        <w:rFonts w:ascii="Symbol" w:hAnsi="Symbol" w:cs="Symbol" w:hint="default"/>
+      </w:rPr>
     </w:lvl>
     <w:lvl w:ilvl="4">
       <w:numFmt w:val="bullet"/>
-      <w:lvlText w:val="•"/>
+      <w:lvlText w:val="o"/>
       <w:lvlJc w:val="left"/>
       <w:pPr>
-        <w:ind w:left="3600" w:hanging="480"/>
-      </w:pPr>
+        <w:ind w:left="3600" w:hanging="360"/>
+      </w:pPr>
+      <w:rPr>
+        <w:rFonts w:ascii="Courier New" w:hAnsi="Courier New" w:cs="Courier New" w:hint="default"/>
+      </w:rPr>
     </w:lvl>
     <w:lvl w:ilvl="5">
       <w:numFmt w:val="bullet"/>
-      <w:lvlText w:val="–"/>
+      <w:lvlText w:val=""/>
       <w:lvlJc w:val="left"/>
       <w:pPr>
-        <w:ind w:left="4320" w:hanging="480"/>
-      </w:pPr>
+        <w:ind w:left="4320" w:hanging="360"/>
+      </w:pPr>
+      <w:rPr>
+        <w:rFonts w:ascii="Wingdings" w:hAnsi="Wingdings" w:cs="Wingdings" w:hint="default"/>
+      </w:rPr>
     </w:lvl>
     <w:lvl w:ilvl="6">
       <w:numFmt w:val="bullet"/>
-      <w:lvlText w:val="•"/>
+      <w:lvlText w:val=""/>
       <w:lvlJc w:val="left"/>
       <w:pPr>
-        <w:ind w:left="5040" w:hanging="480"/>
-      </w:pPr>
+        <w:ind w:left="5040" w:hanging="360"/>
+      </w:pPr>
+      <w:rPr>
+        <w:rFonts w:ascii="Symbol" w:hAnsi="Symbol" w:cs="Symbol" w:hint="default"/>
+      </w:rPr>
     </w:lvl>
     <w:lvl w:ilvl="7">
       <w:numFmt w:val="bullet"/>
-      <w:lvlText w:val="–"/>
+      <w:lvlText w:val="o"/>
       <w:lvlJc w:val="left"/>
       <w:pPr>
-        <w:ind w:left="5760" w:hanging="480"/>
-      </w:pPr>
+        <w:ind w:left="5760" w:hanging="360"/>
+      </w:pPr>
+      <w:rPr>
+        <w:rFonts w:ascii="Courier New" w:hAnsi="Courier New" w:cs="Courier New" w:hint="default"/>
+      </w:rPr>
     </w:lvl>
     <w:lvl w:ilvl="8">
       <w:numFmt w:val="bullet"/>
-      <w:lvlText w:val="•"/>
+      <w:lvlText w:val=""/>
       <w:lvlJc w:val="left"/>
       <w:pPr>
-        <w:ind w:left="6480" w:hanging="480"/>
-      </w:pPr>
+        <w:ind w:left="6480" w:hanging="360"/>
+      </w:pPr>
+      <w:rPr>
+        <w:rFonts w:ascii="Wingdings" w:hAnsi="Wingdings" w:cs="Wingdings" w:hint="default"/>
+      </w:rPr>
     </w:lvl>
   </w:abstractNum>
   <w:num w:numId="1000">
@@ -6439,6 +6549,9 @@
   <w:num w:numId="1015">
     <w:abstractNumId w:val="991"/>
   </w:num>
+  <w:num w:numId="1016">
+    <w:abstractNumId w:val="991"/>
+  </w:num>
 </w:numbering>
 </file>
 
@@ -7118,8 +7231,8 @@
     <w:name w:val="KeywordTok"/>
     <w:basedOn w:val="VerbatimChar"/>
     <w:rPr>
+      <w:b/>
       <w:color w:val="007020"/>
-      <w:b/>
     </w:rPr>
   </w:style>
   <w:style w:type="character" w:customStyle="1" w:styleId="DataTypeTok">
@@ -7196,42 +7309,42 @@
     <w:name w:val="ImportTok"/>
     <w:basedOn w:val="VerbatimChar"/>
     <w:rPr>
+      <w:b/>
       <w:color w:val="008000"/>
-      <w:b/>
     </w:rPr>
   </w:style>
   <w:style w:type="character" w:customStyle="1" w:styleId="CommentTok">
     <w:name w:val="CommentTok"/>
     <w:basedOn w:val="VerbatimChar"/>
     <w:rPr>
+      <w:i/>
       <w:color w:val="60a0b0"/>
-      <w:i/>
     </w:rPr>
   </w:style>
   <w:style w:type="character" w:customStyle="1" w:styleId="DocumentationTok">
     <w:name w:val="DocumentationTok"/>
     <w:basedOn w:val="VerbatimChar"/>
     <w:rPr>
+      <w:i/>
       <w:color w:val="ba2121"/>
-      <w:i/>
     </w:rPr>
   </w:style>
   <w:style w:type="character" w:customStyle="1" w:styleId="AnnotationTok">
     <w:name w:val="AnnotationTok"/>
     <w:basedOn w:val="VerbatimChar"/>
     <w:rPr>
-      <w:color w:val="60a0b0"/>
       <w:b/>
       <w:i/>
+      <w:color w:val="60a0b0"/>
     </w:rPr>
   </w:style>
   <w:style w:type="character" w:customStyle="1" w:styleId="CommentVarTok">
     <w:name w:val="CommentVarTok"/>
     <w:basedOn w:val="VerbatimChar"/>
     <w:rPr>
-      <w:color w:val="60a0b0"/>
       <w:b/>
       <w:i/>
+      <w:color w:val="60a0b0"/>
     </w:rPr>
   </w:style>
   <w:style w:type="character" w:customStyle="1" w:styleId="OtherTok">
@@ -7259,8 +7372,8 @@
     <w:name w:val="ControlFlowTok"/>
     <w:basedOn w:val="VerbatimChar"/>
     <w:rPr>
+      <w:b/>
       <w:color w:val="007020"/>
-      <w:b/>
     </w:rPr>
   </w:style>
   <w:style w:type="character" w:customStyle="1" w:styleId="OperatorTok">
@@ -7305,34 +7418,34 @@
     <w:name w:val="InformationTok"/>
     <w:basedOn w:val="VerbatimChar"/>
     <w:rPr>
-      <w:color w:val="60a0b0"/>
       <w:b/>
       <w:i/>
+      <w:color w:val="60a0b0"/>
     </w:rPr>
   </w:style>
   <w:style w:type="character" w:customStyle="1" w:styleId="WarningTok">
     <w:name w:val="WarningTok"/>
     <w:basedOn w:val="VerbatimChar"/>
     <w:rPr>
-      <w:color w:val="60a0b0"/>
       <w:b/>
       <w:i/>
+      <w:color w:val="60a0b0"/>
     </w:rPr>
   </w:style>
   <w:style w:type="character" w:customStyle="1" w:styleId="AlertTok">
     <w:name w:val="AlertTok"/>
     <w:basedOn w:val="VerbatimChar"/>
     <w:rPr>
+      <w:b/>
       <w:color w:val="ff0000"/>
-      <w:b/>
     </w:rPr>
   </w:style>
   <w:style w:type="character" w:customStyle="1" w:styleId="ErrorTok">
     <w:name w:val="ErrorTok"/>
     <w:basedOn w:val="VerbatimChar"/>
     <w:rPr>
+      <w:b/>
       <w:color w:val="ff0000"/>
-      <w:b/>
     </w:rPr>
   </w:style>
   <w:style w:type="character" w:customStyle="1" w:styleId="NormalTok">

</xml_diff>

<commit_message>
docs: add diagnostic orders guide and organize decision guides
Signed-off-by: Everett Williams <everett@medplum.com>
</commit_message>
<xml_diff>
--- a/packages/docs/static/decision-guides/care-coordination.docx
+++ b/packages/docs/static/decision-guides/care-coordination.docx
@@ -11,18 +11,18 @@
           <wp:inline>
             <wp:extent cx="5943600" cy="1289649"/>
             <wp:effectExtent b="0" l="0" r="0" t="0"/>
-            <wp:docPr descr="Medplum" title="" id="21" name="Picture"/>
+            <wp:docPr descr="Medplum" title="" id="10" name="Picture"/>
             <a:graphic>
               <a:graphicData uri="http://schemas.openxmlformats.org/drawingml/2006/picture">
                 <pic:pic>
                   <pic:nvPicPr>
-                    <pic:cNvPr descr="medplum-wordmark-grape.png" id="22" name="Picture"/>
+                    <pic:cNvPr descr="medplum-wordmark-grape.png" id="11" name="Picture"/>
                     <pic:cNvPicPr>
                       <a:picLocks noChangeArrowheads="1" noChangeAspect="1"/>
                     </pic:cNvPicPr>
                   </pic:nvPicPr>
                   <pic:blipFill>
-                    <a:blip r:embed="rId20"/>
+                    <a:blip r:embed="rId9"/>
                     <a:stretch>
                       <a:fillRect/>
                     </a:stretch>
@@ -49,7 +49,7 @@
         </w:drawing>
       </w:r>
     </w:p>
-    <w:bookmarkStart w:id="63" w:name="care-coordination-decision-guide"/>
+    <w:bookmarkStart w:id="52" w:name="care-coordination-decision-guide"/>
     <w:p>
       <w:pPr>
         <w:pStyle w:val="Heading1"/>
@@ -63,53 +63,53 @@
         <w:pStyle w:val="FirstParagraph"/>
       </w:pPr>
       <w:r>
+        <w:t xml:space="preserve">Use this guide with your clinical and operations teams to decide what work needs to happen, who owns it, and how to follow it through. Start with the practice’s first workflow, then add care plans, case tracking, or decision support as needed.</w:t>
+      </w:r>
+    </w:p>
+    <w:p>
+      <w:pPr>
+        <w:pStyle w:val="BodyText"/>
+      </w:pPr>
+      <w:r>
         <w:rPr>
+          <w:i/>
           <w:iCs/>
-          <w:i/>
         </w:rPr>
         <w:t xml:space="preserve">Companion to the</w:t>
       </w:r>
       <w:r>
         <w:rPr>
+          <w:i/>
           <w:iCs/>
-          <w:i/>
         </w:rPr>
         <w:t xml:space="preserve"> </w:t>
       </w:r>
-      <w:hyperlink r:id="rId23">
+      <w:hyperlink r:id="rId12">
         <w:r>
           <w:rPr>
             <w:rStyle w:val="Hyperlink"/>
+            <w:i/>
             <w:iCs/>
-            <w:i/>
           </w:rPr>
           <w:t xml:space="preserve">Care Coordination</w:t>
         </w:r>
       </w:hyperlink>
       <w:r>
         <w:rPr>
+          <w:i/>
           <w:iCs/>
-          <w:i/>
         </w:rPr>
         <w:t xml:space="preserve"> </w:t>
       </w:r>
       <w:r>
         <w:rPr>
+          <w:i/>
           <w:iCs/>
-          <w:i/>
         </w:rPr>
         <w:t xml:space="preserve">docs.</w:t>
       </w:r>
     </w:p>
-    <w:p>
-      <w:pPr>
-        <w:pStyle w:val="BodyText"/>
-      </w:pPr>
-      <w:r>
-        <w:t xml:space="preserve">Use this guide with your clinical and operations teams to decide what work needs to happen, who owns it, and how to follow it through. Start with the practice’s first workflow, then add care plans, case tracking, or decision support as needed.</w:t>
-      </w:r>
-    </w:p>
-    <w:bookmarkStart w:id="25" w:name="section-1-use-case-participants"/>
+    <w:bookmarkStart w:id="14" w:name="section-1-use-case-participants"/>
     <w:p>
       <w:pPr>
         <w:pStyle w:val="Heading2"/>
@@ -124,79 +124,79 @@
       </w:pPr>
       <w:r>
         <w:rPr>
+          <w:b/>
           <w:bCs/>
-          <w:b/>
         </w:rPr>
         <w:t xml:space="preserve">1.1 Which operational problems are you trying to solve first?</w:t>
       </w:r>
     </w:p>
     <w:p>
       <w:pPr>
+        <w:pStyle w:val="Compact"/>
         <w:numPr>
           <w:ilvl w:val="0"/>
           <w:numId w:val="1001"/>
         </w:numPr>
+      </w:pPr>
+      <w:r>
+        <w:t xml:space="preserve">Clinicians spend time on work that other team members could perform</w:t>
+      </w:r>
+    </w:p>
+    <w:p>
+      <w:pPr>
         <w:pStyle w:val="Compact"/>
-      </w:pPr>
-      <w:r>
-        <w:t xml:space="preserve">Clinicians spend time on work that other team members could perform</w:t>
-      </w:r>
-    </w:p>
-    <w:p>
-      <w:pPr>
         <w:numPr>
           <w:ilvl w:val="0"/>
           <w:numId w:val="1001"/>
         </w:numPr>
+      </w:pPr>
+      <w:r>
+        <w:t xml:space="preserve">Work gets lost between people, teams, visits, or systems</w:t>
+      </w:r>
+    </w:p>
+    <w:p>
+      <w:pPr>
         <w:pStyle w:val="Compact"/>
-      </w:pPr>
-      <w:r>
-        <w:t xml:space="preserve">Work gets lost between people, teams, visits, or systems</w:t>
-      </w:r>
-    </w:p>
-    <w:p>
-      <w:pPr>
         <w:numPr>
           <w:ilvl w:val="0"/>
           <w:numId w:val="1001"/>
         </w:numPr>
+      </w:pPr>
+      <w:r>
+        <w:t xml:space="preserve">Staff cannot see who owns the next action or what is overdue</w:t>
+      </w:r>
+    </w:p>
+    <w:p>
+      <w:pPr>
         <w:pStyle w:val="Compact"/>
-      </w:pPr>
-      <w:r>
-        <w:t xml:space="preserve">Staff cannot see who owns the next action or what is overdue</w:t>
-      </w:r>
-    </w:p>
-    <w:p>
-      <w:pPr>
         <w:numPr>
           <w:ilvl w:val="0"/>
           <w:numId w:val="1001"/>
         </w:numPr>
+      </w:pPr>
+      <w:r>
+        <w:t xml:space="preserve">Patient care spans multiple visits without a clear case history or plan</w:t>
+      </w:r>
+    </w:p>
+    <w:p>
+      <w:pPr>
         <w:pStyle w:val="Compact"/>
-      </w:pPr>
-      <w:r>
-        <w:t xml:space="preserve">Patient care spans multiple visits without a clear case history or plan</w:t>
-      </w:r>
-    </w:p>
-    <w:p>
-      <w:pPr>
         <w:numPr>
           <w:ilvl w:val="0"/>
           <w:numId w:val="1001"/>
         </w:numPr>
+      </w:pPr>
+      <w:r>
+        <w:t xml:space="preserve">Follow-up, protocols, or clinical recommendations are applied inconsistently</w:t>
+      </w:r>
+    </w:p>
+    <w:p>
+      <w:pPr>
         <w:pStyle w:val="Compact"/>
-      </w:pPr>
-      <w:r>
-        <w:t xml:space="preserve">Follow-up, protocols, or clinical recommendations are applied inconsistently</w:t>
-      </w:r>
-    </w:p>
-    <w:p>
-      <w:pPr>
         <w:numPr>
           <w:ilvl w:val="0"/>
           <w:numId w:val="1001"/>
         </w:numPr>
-        <w:pStyle w:val="Compact"/>
       </w:pPr>
       <w:r>
         <w:t xml:space="preserve">Some combination; identify the first workflow you intend to launch</w:t>
@@ -208,8 +208,8 @@
       </w:pPr>
       <w:r>
         <w:rPr>
+          <w:i/>
           <w:iCs/>
-          <w:i/>
         </w:rPr>
         <w:t xml:space="preserve">Why: establishes whether the starting point is delegation, a work queue, longitudinal tracking, or a more structured care program.</w:t>
       </w:r>
@@ -220,55 +220,55 @@
       </w:pPr>
       <w:r>
         <w:rPr>
+          <w:b/>
           <w:bCs/>
-          <w:b/>
         </w:rPr>
         <w:t xml:space="preserve">1.2 Who participates, and where does responsibility sit?</w:t>
       </w:r>
     </w:p>
     <w:p>
       <w:pPr>
+        <w:pStyle w:val="Compact"/>
         <w:numPr>
           <w:ilvl w:val="0"/>
           <w:numId w:val="1002"/>
         </w:numPr>
+      </w:pPr>
+      <w:r>
+        <w:t xml:space="preserve">Which clinicians, nurses, assistants, coordinators, administrative staff, patients, and caregivers perform work?</w:t>
+      </w:r>
+    </w:p>
+    <w:p>
+      <w:pPr>
         <w:pStyle w:val="Compact"/>
-      </w:pPr>
-      <w:r>
-        <w:t xml:space="preserve">Which clinicians, nurses, assistants, coordinators, administrative staff, patients, and caregivers perform work?</w:t>
-      </w:r>
-    </w:p>
-    <w:p>
-      <w:pPr>
         <w:numPr>
           <w:ilvl w:val="0"/>
           <w:numId w:val="1002"/>
         </w:numPr>
+      </w:pPr>
+      <w:r>
+        <w:t xml:space="preserve">Is work organized by individual, role, care team, service line, location, or organization?</w:t>
+      </w:r>
+    </w:p>
+    <w:p>
+      <w:pPr>
         <w:pStyle w:val="Compact"/>
-      </w:pPr>
-      <w:r>
-        <w:t xml:space="preserve">Is work organized by individual, role, care team, service line, location, or organization?</w:t>
-      </w:r>
-    </w:p>
-    <w:p>
-      <w:pPr>
         <w:numPr>
           <w:ilvl w:val="0"/>
           <w:numId w:val="1002"/>
         </w:numPr>
+      </w:pPr>
+      <w:r>
+        <w:t xml:space="preserve">Who is accountable for a patient’s overall care, and who owns each individual action?</w:t>
+      </w:r>
+    </w:p>
+    <w:p>
+      <w:pPr>
         <w:pStyle w:val="Compact"/>
-      </w:pPr>
-      <w:r>
-        <w:t xml:space="preserve">Who is accountable for a patient’s overall care, and who owns each individual action?</w:t>
-      </w:r>
-    </w:p>
-    <w:p>
-      <w:pPr>
         <w:numPr>
           <w:ilvl w:val="0"/>
           <w:numId w:val="1002"/>
         </w:numPr>
-        <w:pStyle w:val="Compact"/>
       </w:pPr>
       <w:r>
         <w:t xml:space="preserve">Do outside providers or partner organizations participate directly, or through exchanged messages and documents?</w:t>
@@ -280,8 +280,8 @@
       </w:pPr>
       <w:r>
         <w:rPr>
+          <w:i/>
           <w:iCs/>
-          <w:i/>
         </w:rPr>
         <w:t xml:space="preserve">Why: separates ongoing care responsibility from task ownership and identifies the access and handoff boundaries.</w:t>
       </w:r>
@@ -292,43 +292,43 @@
       </w:pPr>
       <w:r>
         <w:rPr>
+          <w:b/>
           <w:bCs/>
-          <w:b/>
         </w:rPr>
         <w:t xml:space="preserve">1.3 What creates work, and where is it managed today?</w:t>
       </w:r>
     </w:p>
     <w:p>
       <w:pPr>
+        <w:pStyle w:val="Compact"/>
         <w:numPr>
           <w:ilvl w:val="0"/>
           <w:numId w:val="1003"/>
         </w:numPr>
+      </w:pPr>
+      <w:r>
+        <w:t xml:space="preserve">Staff action, completed intake, an incoming message, an admission/discharge event, an order or result, a missed appointment, a scheduled follow-up, or a recommendation?</w:t>
+      </w:r>
+    </w:p>
+    <w:p>
+      <w:pPr>
         <w:pStyle w:val="Compact"/>
-      </w:pPr>
-      <w:r>
-        <w:t xml:space="preserve">Staff action, completed intake, an incoming message, an admission/discharge event, an order or result, a missed appointment, a scheduled follow-up, or a recommendation?</w:t>
-      </w:r>
-    </w:p>
-    <w:p>
-      <w:pPr>
         <w:numPr>
           <w:ilvl w:val="0"/>
           <w:numId w:val="1003"/>
         </w:numPr>
+      </w:pPr>
+      <w:r>
+        <w:t xml:space="preserve">Are you replacing spreadsheets, inboxes, or another task system, or coordinating work that will remain in those systems?</w:t>
+      </w:r>
+    </w:p>
+    <w:p>
+      <w:pPr>
         <w:pStyle w:val="Compact"/>
-      </w:pPr>
-      <w:r>
-        <w:t xml:space="preserve">Are you replacing spreadsheets, inboxes, or another task system, or coordinating work that will remain in those systems?</w:t>
-      </w:r>
-    </w:p>
-    <w:p>
-      <w:pPr>
         <w:numPr>
           <w:ilvl w:val="0"/>
           <w:numId w:val="1003"/>
         </w:numPr>
-        <w:pStyle w:val="Compact"/>
       </w:pPr>
       <w:r>
         <w:t xml:space="preserve">Which system owns the clinical record, the work item, and its completion status?</w:t>
@@ -340,8 +340,8 @@
       </w:pPr>
       <w:r>
         <w:rPr>
+          <w:i/>
           <w:iCs/>
-          <w:i/>
         </w:rPr>
         <w:t xml:space="preserve">Why: establishes entry points, integration needs, and which system can authoritatively change each state.</w:t>
       </w:r>
@@ -352,55 +352,55 @@
       </w:pPr>
       <w:r>
         <w:rPr>
+          <w:b/>
           <w:bCs/>
-          <w:b/>
         </w:rPr>
         <w:t xml:space="preserve">1.4 How much continuity and scale do you need?</w:t>
       </w:r>
     </w:p>
     <w:p>
       <w:pPr>
+        <w:pStyle w:val="Compact"/>
         <w:numPr>
           <w:ilvl w:val="0"/>
           <w:numId w:val="1004"/>
         </w:numPr>
+      </w:pPr>
+      <w:r>
+        <w:t xml:space="preserve">Does work end with one action or encounter, or continue across months of care?</w:t>
+      </w:r>
+    </w:p>
+    <w:p>
+      <w:pPr>
         <w:pStyle w:val="Compact"/>
-      </w:pPr>
-      <w:r>
-        <w:t xml:space="preserve">Does work end with one action or encounter, or continue across months of care?</w:t>
-      </w:r>
-    </w:p>
-    <w:p>
-      <w:pPr>
         <w:numPr>
           <w:ilvl w:val="0"/>
           <w:numId w:val="1004"/>
         </w:numPr>
+      </w:pPr>
+      <w:r>
+        <w:t xml:space="preserve">Can a patient participate in several programs or cases at once?</w:t>
+      </w:r>
+    </w:p>
+    <w:p>
+      <w:pPr>
         <w:pStyle w:val="Compact"/>
-      </w:pPr>
-      <w:r>
-        <w:t xml:space="preserve">Can a patient participate in several programs or cases at once?</w:t>
-      </w:r>
-    </w:p>
-    <w:p>
-      <w:pPr>
         <w:numPr>
           <w:ilvl w:val="0"/>
           <w:numId w:val="1004"/>
         </w:numPr>
+      </w:pPr>
+      <w:r>
+        <w:t xml:space="preserve">How many staff share a queue, how much work arrives, and are operations limited to business hours?</w:t>
+      </w:r>
+    </w:p>
+    <w:p>
+      <w:pPr>
         <w:pStyle w:val="Compact"/>
-      </w:pPr>
-      <w:r>
-        <w:t xml:space="preserve">How many staff share a queue, how much work arrives, and are operations limited to business hours?</w:t>
-      </w:r>
-    </w:p>
-    <w:p>
-      <w:pPr>
         <w:numPr>
           <w:ilvl w:val="0"/>
           <w:numId w:val="1004"/>
         </w:numPr>
-        <w:pStyle w:val="Compact"/>
       </w:pPr>
       <w:r>
         <w:t xml:space="preserve">What must improve to consider the first release successful?</w:t>
@@ -412,8 +412,8 @@
       </w:pPr>
       <w:r>
         <w:rPr>
+          <w:i/>
           <w:iCs/>
-          <w:i/>
         </w:rPr>
         <w:t xml:space="preserve">Why: determines the need for case grouping, concurrent assignment controls, escalation, and reporting.</w:t>
       </w:r>
@@ -424,43 +424,43 @@
       </w:pPr>
       <w:r>
         <w:rPr>
+          <w:b/>
           <w:bCs/>
-          <w:b/>
         </w:rPr>
         <w:t xml:space="preserve">1.5 Does a care program require consent or service-time records?</w:t>
       </w:r>
     </w:p>
     <w:p>
       <w:pPr>
+        <w:pStyle w:val="Compact"/>
         <w:numPr>
           <w:ilvl w:val="0"/>
           <w:numId w:val="1005"/>
         </w:numPr>
+      </w:pPr>
+      <w:r>
+        <w:t xml:space="preserve">What program consent must be captured, reviewed, renewed, or withdrawn before enrollment or ongoing work?</w:t>
+      </w:r>
+    </w:p>
+    <w:p>
+      <w:pPr>
         <w:pStyle w:val="Compact"/>
-      </w:pPr>
-      <w:r>
-        <w:t xml:space="preserve">What program consent must be captured, reviewed, renewed, or withdrawn before enrollment or ongoing work?</w:t>
-      </w:r>
-    </w:p>
-    <w:p>
-      <w:pPr>
         <w:numPr>
           <w:ilvl w:val="0"/>
           <w:numId w:val="1005"/>
         </w:numPr>
+      </w:pPr>
+      <w:r>
+        <w:t xml:space="preserve">Which activities require time records, and who performed them for which patient and program?</w:t>
+      </w:r>
+    </w:p>
+    <w:p>
+      <w:pPr>
         <w:pStyle w:val="Compact"/>
-      </w:pPr>
-      <w:r>
-        <w:t xml:space="preserve">Which activities require time records, and who performed them for which patient and program?</w:t>
-      </w:r>
-    </w:p>
-    <w:p>
-      <w:pPr>
         <w:numPr>
           <w:ilvl w:val="0"/>
           <w:numId w:val="1005"/>
         </w:numPr>
-        <w:pStyle w:val="Compact"/>
       </w:pPr>
       <w:r>
         <w:t xml:space="preserve">How will you record actual effort, corrections, overlapping activity, and the reporting period required by the program or payer?</w:t>
@@ -472,32 +472,32 @@
       </w:pPr>
       <w:r>
         <w:rPr>
+          <w:i/>
           <w:iCs/>
-          <w:i/>
         </w:rPr>
         <w:t xml:space="preserve">Why: identifies program-specific consent and time-recording requirements. Task execution windows alone do not establish billable effort. Choose the time-record model and any Consent representation after confirming the program’s requirements; see</w:t>
       </w:r>
       <w:r>
         <w:rPr>
+          <w:i/>
           <w:iCs/>
-          <w:i/>
         </w:rPr>
         <w:t xml:space="preserve"> </w:t>
       </w:r>
-      <w:hyperlink r:id="rId24">
+      <w:hyperlink r:id="rId13">
         <w:r>
           <w:rPr>
             <w:rStyle w:val="Hyperlink"/>
+            <w:i/>
             <w:iCs/>
-            <w:i/>
           </w:rPr>
           <w:t xml:space="preserve">Consent</w:t>
         </w:r>
       </w:hyperlink>
       <w:r>
         <w:rPr>
+          <w:i/>
           <w:iCs/>
-          <w:i/>
         </w:rPr>
         <w:t xml:space="preserve">.</w:t>
       </w:r>
@@ -509,8 +509,8 @@
         </w:pict>
       </w:r>
     </w:p>
-    <w:bookmarkEnd w:id="25"/>
-    <w:bookmarkStart w:id="26" w:name="section-2-feature-scoping"/>
+    <w:bookmarkEnd w:id="14"/>
+    <w:bookmarkStart w:id="15" w:name="section-2-feature-scoping"/>
     <w:p>
       <w:pPr>
         <w:pStyle w:val="Heading2"/>
@@ -525,8 +525,8 @@
       </w:pPr>
       <w:r>
         <w:rPr>
+          <w:i/>
           <w:iCs/>
-          <w:i/>
         </w:rPr>
         <w:t xml:space="preserve">For each feature, mark Yes / No / Nice-to-have / Not sure. The § column points to the relevant deep dive. Cover 3.1 for every implementation.</w:t>
       </w:r>
@@ -535,9 +535,8 @@
       <w:tblPr>
         <w:tblStyle w:val="Table"/>
         <w:tblW w:w="9360" w:type="dxa"/>
+        <w:tblLayout w:type="fixed"/>
         <w:tblLook w:firstRow="1" w:lastRow="0" w:firstColumn="0" w:lastColumn="0" w:noHBand="0" w:noVBand="0" w:val="0020"/>
-        <w:jc w:val="start"/>
-        <w:tblLayout w:type="fixed"/>
       </w:tblPr>
       <w:tblGrid>
         <w:gridCol w:w="600"/>
@@ -551,7 +550,7 @@
       <w:tr>
         <w:trPr>
           <w:cantSplit/>
-          <w:tblHeader w:val="true"/>
+          <w:tblHeader w:val="on"/>
         </w:trPr>
         <w:tc>
           <w:tcPr/>
@@ -1449,8 +1448,8 @@
         </w:pict>
       </w:r>
     </w:p>
-    <w:bookmarkEnd w:id="26"/>
-    <w:bookmarkStart w:id="61" w:name="section-3-feature-deep-dives"/>
+    <w:bookmarkEnd w:id="15"/>
+    <w:bookmarkStart w:id="50" w:name="section-3-feature-deep-dives"/>
     <w:p>
       <w:pPr>
         <w:pStyle w:val="Heading2"/>
@@ -1465,8 +1464,8 @@
       </w:pPr>
       <w:r>
         <w:rPr>
+          <w:i/>
           <w:iCs/>
-          <w:i/>
         </w:rPr>
         <w:t xml:space="preserve">Cover each feature selected above. Record the chosen approach and unresolved decisions for the first workflow before expanding to additional workflows.</w:t>
       </w:r>
@@ -1479,7 +1478,7 @@
         <w:t xml:space="preserve">The approaches below name recommended resources and fields. Local workflow stages, eligibility checks, and automation are application conventions that you implement; storing these resources does not execute those rules automatically.</w:t>
       </w:r>
     </w:p>
-    <w:bookmarkStart w:id="28" w:name="work-items-clinical-context"/>
+    <w:bookmarkStart w:id="17" w:name="work-items-clinical-context"/>
     <w:p>
       <w:pPr>
         <w:pStyle w:val="Heading3"/>
@@ -1498,47 +1497,47 @@
     </w:p>
     <w:p>
       <w:pPr>
+        <w:pStyle w:val="Compact"/>
         <w:numPr>
           <w:ilvl w:val="0"/>
           <w:numId w:val="1006"/>
         </w:numPr>
+      </w:pPr>
+      <w:r>
+        <w:t xml:space="preserve">What is the smallest unit of work that needs its own owner, status, and completion criteria?</w:t>
+      </w:r>
+    </w:p>
+    <w:p>
+      <w:pPr>
         <w:pStyle w:val="Compact"/>
-      </w:pPr>
-      <w:r>
-        <w:t xml:space="preserve">What is the smallest unit of work that needs its own owner, status, and completion criteria?</w:t>
-      </w:r>
-    </w:p>
-    <w:p>
-      <w:pPr>
         <w:numPr>
           <w:ilvl w:val="0"/>
           <w:numId w:val="1006"/>
         </w:numPr>
+      </w:pPr>
+      <w:r>
+        <w:t xml:space="preserve">Is each item about a patient, a particular encounter, or practice administration?</w:t>
+      </w:r>
+    </w:p>
+    <w:p>
+      <w:pPr>
         <w:pStyle w:val="Compact"/>
-      </w:pPr>
-      <w:r>
-        <w:t xml:space="preserve">Is each item about a patient, a particular encounter, or practice administration?</w:t>
-      </w:r>
-    </w:p>
-    <w:p>
-      <w:pPr>
         <w:numPr>
           <w:ilvl w:val="0"/>
           <w:numId w:val="1006"/>
         </w:numPr>
+      </w:pPr>
+      <w:r>
+        <w:t xml:space="preserve">What is being acted on: a referral, result, questionnaire, message thread, or another resource?</w:t>
+      </w:r>
+    </w:p>
+    <w:p>
+      <w:pPr>
         <w:pStyle w:val="Compact"/>
-      </w:pPr>
-      <w:r>
-        <w:t xml:space="preserve">What is being acted on: a referral, result, questionnaire, message thread, or another resource?</w:t>
-      </w:r>
-    </w:p>
-    <w:p>
-      <w:pPr>
         <w:numPr>
           <w:ilvl w:val="0"/>
           <w:numId w:val="1006"/>
         </w:numPr>
-        <w:pStyle w:val="Compact"/>
       </w:pPr>
       <w:r>
         <w:t xml:space="preserve">Does one person perform the whole activity, or do independently assigned steps need separate work items?</w:t>
@@ -1548,9 +1547,8 @@
       <w:tblPr>
         <w:tblStyle w:val="Table"/>
         <w:tblW w:w="9360" w:type="dxa"/>
+        <w:tblLayout w:type="fixed"/>
         <w:tblLook w:firstRow="1" w:lastRow="0" w:firstColumn="0" w:lastColumn="0" w:noHBand="0" w:noVBand="0" w:val="0020"/>
-        <w:jc w:val="start"/>
-        <w:tblLayout w:type="fixed"/>
       </w:tblPr>
       <w:tblGrid>
         <w:gridCol w:w="4680"/>
@@ -1559,7 +1557,7 @@
       <w:tr>
         <w:trPr>
           <w:cantSplit/>
-          <w:tblHeader w:val="true"/>
+          <w:tblHeader w:val="on"/>
         </w:trPr>
         <w:tc>
           <w:tcPr/>
@@ -1904,7 +1902,7 @@
       <w:r>
         <w:t xml:space="preserve"> </w:t>
       </w:r>
-      <w:hyperlink r:id="rId27">
+      <w:hyperlink r:id="rId16">
         <w:r>
           <w:rPr>
             <w:rStyle w:val="Hyperlink"/>
@@ -1916,8 +1914,8 @@
         <w:t xml:space="preserve">.</w:t>
       </w:r>
     </w:p>
-    <w:bookmarkEnd w:id="28"/>
-    <w:bookmarkStart w:id="31" w:name="top-of-license-care-delegation"/>
+    <w:bookmarkEnd w:id="17"/>
+    <w:bookmarkStart w:id="20" w:name="top-of-license-care-delegation"/>
     <w:p>
       <w:pPr>
         <w:pStyle w:val="Heading3"/>
@@ -1936,47 +1934,47 @@
     </w:p>
     <w:p>
       <w:pPr>
+        <w:pStyle w:val="Compact"/>
         <w:numPr>
           <w:ilvl w:val="0"/>
           <w:numId w:val="1007"/>
         </w:numPr>
+      </w:pPr>
+      <w:r>
+        <w:t xml:space="preserve">Which steps currently reach a clinician that another qualified team member could prepare or complete?</w:t>
+      </w:r>
+    </w:p>
+    <w:p>
+      <w:pPr>
         <w:pStyle w:val="Compact"/>
-      </w:pPr>
-      <w:r>
-        <w:t xml:space="preserve">Which steps currently reach a clinician that another qualified team member could prepare or complete?</w:t>
-      </w:r>
-    </w:p>
-    <w:p>
-      <w:pPr>
         <w:numPr>
           <w:ilvl w:val="0"/>
           <w:numId w:val="1007"/>
         </w:numPr>
+      </w:pPr>
+      <w:r>
+        <w:t xml:space="preserve">Which actions require clinical judgment, sign-off, supervision, or escalation?</w:t>
+      </w:r>
+    </w:p>
+    <w:p>
+      <w:pPr>
         <w:pStyle w:val="Compact"/>
-      </w:pPr>
-      <w:r>
-        <w:t xml:space="preserve">Which actions require clinical judgment, sign-off, supervision, or escalation?</w:t>
-      </w:r>
-    </w:p>
-    <w:p>
-      <w:pPr>
         <w:numPr>
           <w:ilvl w:val="0"/>
           <w:numId w:val="1007"/>
         </w:numPr>
+      </w:pPr>
+      <w:r>
+        <w:t xml:space="preserve">Do eligibility rules depend on credentials, specialty, service line, jurisdiction, or the patient’s program?</w:t>
+      </w:r>
+    </w:p>
+    <w:p>
+      <w:pPr>
         <w:pStyle w:val="Compact"/>
-      </w:pPr>
-      <w:r>
-        <w:t xml:space="preserve">Do eligibility rules depend on credentials, specialty, service line, jurisdiction, or the patient’s program?</w:t>
-      </w:r>
-    </w:p>
-    <w:p>
-      <w:pPr>
         <w:numPr>
           <w:ilvl w:val="0"/>
           <w:numId w:val="1007"/>
         </w:numPr>
-        <w:pStyle w:val="Compact"/>
       </w:pPr>
       <w:r>
         <w:t xml:space="preserve">Who maintains those rules, and what happens when no eligible person is available?</w:t>
@@ -1986,9 +1984,8 @@
       <w:tblPr>
         <w:tblStyle w:val="Table"/>
         <w:tblW w:w="9360" w:type="dxa"/>
+        <w:tblLayout w:type="fixed"/>
         <w:tblLook w:firstRow="1" w:lastRow="0" w:firstColumn="0" w:lastColumn="0" w:noHBand="0" w:noVBand="0" w:val="0020"/>
-        <w:jc w:val="start"/>
-        <w:tblLayout w:type="fixed"/>
       </w:tblPr>
       <w:tblGrid>
         <w:gridCol w:w="3979"/>
@@ -1997,7 +1994,7 @@
       <w:tr>
         <w:trPr>
           <w:cantSplit/>
-          <w:tblHeader w:val="true"/>
+          <w:tblHeader w:val="on"/>
         </w:trPr>
         <w:tc>
           <w:tcPr/>
@@ -2316,7 +2313,7 @@
       <w:r>
         <w:t xml:space="preserve"> </w:t>
       </w:r>
-      <w:hyperlink r:id="rId29">
+      <w:hyperlink r:id="rId18">
         <w:r>
           <w:rPr>
             <w:rStyle w:val="Hyperlink"/>
@@ -2330,7 +2327,7 @@
       <w:r>
         <w:t xml:space="preserve"> </w:t>
       </w:r>
-      <w:hyperlink r:id="rId30">
+      <w:hyperlink r:id="rId19">
         <w:r>
           <w:rPr>
             <w:rStyle w:val="Hyperlink"/>
@@ -2342,8 +2339,8 @@
         <w:t xml:space="preserve">; scheduling operations do not enforce licensure themselves.</w:t>
       </w:r>
     </w:p>
-    <w:bookmarkEnd w:id="31"/>
-    <w:bookmarkStart w:id="36" w:name="queues-ownership-care-teams"/>
+    <w:bookmarkEnd w:id="20"/>
+    <w:bookmarkStart w:id="25" w:name="queues-ownership-care-teams"/>
     <w:p>
       <w:pPr>
         <w:pStyle w:val="Heading3"/>
@@ -2362,71 +2359,71 @@
     </w:p>
     <w:p>
       <w:pPr>
+        <w:pStyle w:val="Compact"/>
         <w:numPr>
           <w:ilvl w:val="0"/>
           <w:numId w:val="1008"/>
         </w:numPr>
+      </w:pPr>
+      <w:r>
+        <w:t xml:space="preserve">Is work assigned directly, claimed from a shared queue, or distributed automatically?</w:t>
+      </w:r>
+    </w:p>
+    <w:p>
+      <w:pPr>
         <w:pStyle w:val="Compact"/>
-      </w:pPr>
-      <w:r>
-        <w:t xml:space="preserve">Is work assigned directly, claimed from a shared queue, or distributed automatically?</w:t>
-      </w:r>
-    </w:p>
-    <w:p>
-      <w:pPr>
         <w:numPr>
           <w:ilvl w:val="0"/>
           <w:numId w:val="1008"/>
         </w:numPr>
+      </w:pPr>
+      <w:r>
+        <w:t xml:space="preserve">Which queue dimensions matter: role, service, location, urgency, or workflow stage?</w:t>
+      </w:r>
+    </w:p>
+    <w:p>
+      <w:pPr>
         <w:pStyle w:val="Compact"/>
-      </w:pPr>
-      <w:r>
-        <w:t xml:space="preserve">Which queue dimensions matter: role, service, location, urgency, or workflow stage?</w:t>
-      </w:r>
-    </w:p>
-    <w:p>
-      <w:pPr>
         <w:numPr>
           <w:ilvl w:val="0"/>
           <w:numId w:val="1008"/>
         </w:numPr>
+      </w:pPr>
+      <w:r>
+        <w:t xml:space="preserve">Can two staff members attempt to claim the same item? Who resolves conflicts?</w:t>
+      </w:r>
+    </w:p>
+    <w:p>
+      <w:pPr>
         <w:pStyle w:val="Compact"/>
-      </w:pPr>
-      <w:r>
-        <w:t xml:space="preserve">Can two staff members attempt to claim the same item? Who resolves conflicts?</w:t>
-      </w:r>
-    </w:p>
-    <w:p>
-      <w:pPr>
         <w:numPr>
           <w:ilvl w:val="0"/>
           <w:numId w:val="1008"/>
         </w:numPr>
+      </w:pPr>
+      <w:r>
+        <w:t xml:space="preserve">Does the patient have an ongoing care team or coordinator distinct from the person handling today’s task?</w:t>
+      </w:r>
+    </w:p>
+    <w:p>
+      <w:pPr>
         <w:pStyle w:val="Compact"/>
-      </w:pPr>
-      <w:r>
-        <w:t xml:space="preserve">Does the patient have an ongoing care team or coordinator distinct from the person handling today’s task?</w:t>
-      </w:r>
-    </w:p>
-    <w:p>
-      <w:pPr>
         <w:numPr>
           <w:ilvl w:val="0"/>
           <w:numId w:val="1008"/>
         </w:numPr>
+      </w:pPr>
+      <w:r>
+        <w:t xml:space="preserve">How do absence, workload, and shift changes affect assignment?</w:t>
+      </w:r>
+    </w:p>
+    <w:p>
+      <w:pPr>
         <w:pStyle w:val="Compact"/>
-      </w:pPr>
-      <w:r>
-        <w:t xml:space="preserve">How do absence, workload, and shift changes affect assignment?</w:t>
-      </w:r>
-    </w:p>
-    <w:p>
-      <w:pPr>
         <w:numPr>
           <w:ilvl w:val="0"/>
           <w:numId w:val="1008"/>
         </w:numPr>
-        <w:pStyle w:val="Compact"/>
       </w:pPr>
       <w:r>
         <w:t xml:space="preserve">How do staff discover new or escalated work: a live queue, an outbound notification, or both? See</w:t>
@@ -2434,7 +2431,7 @@
       <w:r>
         <w:t xml:space="preserve"> </w:t>
       </w:r>
-      <w:hyperlink r:id="rId32">
+      <w:hyperlink r:id="rId21">
         <w:r>
           <w:rPr>
             <w:rStyle w:val="Hyperlink"/>
@@ -2450,9 +2447,8 @@
       <w:tblPr>
         <w:tblStyle w:val="Table"/>
         <w:tblW w:w="9360" w:type="dxa"/>
+        <w:tblLayout w:type="fixed"/>
         <w:tblLook w:firstRow="1" w:lastRow="0" w:firstColumn="0" w:lastColumn="0" w:noHBand="0" w:noVBand="0" w:val="0020"/>
-        <w:jc w:val="start"/>
-        <w:tblLayout w:type="fixed"/>
       </w:tblPr>
       <w:tblGrid>
         <w:gridCol w:w="4121"/>
@@ -2461,7 +2457,7 @@
       <w:tr>
         <w:trPr>
           <w:cantSplit/>
-          <w:tblHeader w:val="true"/>
+          <w:tblHeader w:val="on"/>
         </w:trPr>
         <w:tc>
           <w:tcPr/>
@@ -2847,7 +2843,7 @@
       <w:r>
         <w:t xml:space="preserve"> </w:t>
       </w:r>
-      <w:hyperlink r:id="rId33">
+      <w:hyperlink r:id="rId22">
         <w:r>
           <w:rPr>
             <w:rStyle w:val="Hyperlink"/>
@@ -2861,7 +2857,7 @@
       <w:r>
         <w:t xml:space="preserve"> </w:t>
       </w:r>
-      <w:hyperlink r:id="rId34">
+      <w:hyperlink r:id="rId23">
         <w:r>
           <w:rPr>
             <w:rStyle w:val="Hyperlink"/>
@@ -2875,7 +2871,7 @@
       <w:r>
         <w:t xml:space="preserve"> </w:t>
       </w:r>
-      <w:hyperlink r:id="rId35">
+      <w:hyperlink r:id="rId24">
         <w:r>
           <w:rPr>
             <w:rStyle w:val="Hyperlink"/>
@@ -2887,8 +2883,8 @@
         <w:t xml:space="preserve">.</w:t>
       </w:r>
     </w:p>
-    <w:bookmarkEnd w:id="36"/>
-    <w:bookmarkStart w:id="39" w:name="lifecycle-handoffs-deadlines"/>
+    <w:bookmarkEnd w:id="25"/>
+    <w:bookmarkStart w:id="28" w:name="lifecycle-handoffs-deadlines"/>
     <w:p>
       <w:pPr>
         <w:pStyle w:val="Heading3"/>
@@ -2907,59 +2903,59 @@
     </w:p>
     <w:p>
       <w:pPr>
+        <w:pStyle w:val="Compact"/>
         <w:numPr>
           <w:ilvl w:val="0"/>
           <w:numId w:val="1009"/>
         </w:numPr>
+      </w:pPr>
+      <w:r>
+        <w:t xml:space="preserve">Which stages do staff need to operate on, and which are useful only for reporting?</w:t>
+      </w:r>
+    </w:p>
+    <w:p>
+      <w:pPr>
         <w:pStyle w:val="Compact"/>
-      </w:pPr>
-      <w:r>
-        <w:t xml:space="preserve">Which stages do staff need to operate on, and which are useful only for reporting?</w:t>
-      </w:r>
-    </w:p>
-    <w:p>
-      <w:pPr>
         <w:numPr>
           <w:ilvl w:val="0"/>
           <w:numId w:val="1009"/>
         </w:numPr>
+      </w:pPr>
+      <w:r>
+        <w:t xml:space="preserve">What counts as ready, blocked, complete, cancelled, or entered in error?</w:t>
+      </w:r>
+    </w:p>
+    <w:p>
+      <w:pPr>
         <w:pStyle w:val="Compact"/>
-      </w:pPr>
-      <w:r>
-        <w:t xml:space="preserve">What counts as ready, blocked, complete, cancelled, or entered in error?</w:t>
-      </w:r>
-    </w:p>
-    <w:p>
-      <w:pPr>
         <w:numPr>
           <w:ilvl w:val="0"/>
           <w:numId w:val="1009"/>
         </w:numPr>
+      </w:pPr>
+      <w:r>
+        <w:t xml:space="preserve">Does handing off work require acknowledgment from the next owner?</w:t>
+      </w:r>
+    </w:p>
+    <w:p>
+      <w:pPr>
         <w:pStyle w:val="Compact"/>
-      </w:pPr>
-      <w:r>
-        <w:t xml:space="preserve">Does handing off work require acknowledgment from the next owner?</w:t>
-      </w:r>
-    </w:p>
-    <w:p>
-      <w:pPr>
         <w:numPr>
           <w:ilvl w:val="0"/>
           <w:numId w:val="1009"/>
         </w:numPr>
+      </w:pPr>
+      <w:r>
+        <w:t xml:space="preserve">Which deadlines use elapsed time versus business hours? Does waiting for a patient or outside party pause the clock?</w:t>
+      </w:r>
+    </w:p>
+    <w:p>
+      <w:pPr>
         <w:pStyle w:val="Compact"/>
-      </w:pPr>
-      <w:r>
-        <w:t xml:space="preserve">Which deadlines use elapsed time versus business hours? Does waiting for a patient or outside party pause the clock?</w:t>
-      </w:r>
-    </w:p>
-    <w:p>
-      <w:pPr>
         <w:numPr>
           <w:ilvl w:val="0"/>
           <w:numId w:val="1009"/>
         </w:numPr>
-        <w:pStyle w:val="Compact"/>
       </w:pPr>
       <w:r>
         <w:t xml:space="preserve">Who receives overdue work, and how are repeated reminders prevented?</w:t>
@@ -2969,9 +2965,8 @@
       <w:tblPr>
         <w:tblStyle w:val="Table"/>
         <w:tblW w:w="9360" w:type="dxa"/>
+        <w:tblLayout w:type="fixed"/>
         <w:tblLook w:firstRow="1" w:lastRow="0" w:firstColumn="0" w:lastColumn="0" w:noHBand="0" w:noVBand="0" w:val="0020"/>
-        <w:jc w:val="start"/>
-        <w:tblLayout w:type="fixed"/>
       </w:tblPr>
       <w:tblGrid>
         <w:gridCol w:w="4317"/>
@@ -2980,7 +2975,7 @@
       <w:tr>
         <w:trPr>
           <w:cantSplit/>
-          <w:tblHeader w:val="true"/>
+          <w:tblHeader w:val="on"/>
         </w:trPr>
         <w:tc>
           <w:tcPr/>
@@ -3244,7 +3239,7 @@
             <w:r>
               <w:t xml:space="preserve"> </w:t>
             </w:r>
-            <w:hyperlink r:id="rId37">
+            <w:hyperlink r:id="rId26">
               <w:r>
                 <w:rPr>
                   <w:rStyle w:val="Hyperlink"/>
@@ -3317,7 +3312,7 @@
             <w:r>
               <w:t xml:space="preserve"> </w:t>
             </w:r>
-            <w:hyperlink r:id="rId38">
+            <w:hyperlink r:id="rId27">
               <w:r>
                 <w:rPr>
                   <w:rStyle w:val="Hyperlink"/>
@@ -3404,7 +3399,7 @@
       <w:r>
         <w:t xml:space="preserve"> </w:t>
       </w:r>
-      <w:hyperlink r:id="rId27">
+      <w:hyperlink r:id="rId16">
         <w:r>
           <w:rPr>
             <w:rStyle w:val="Hyperlink"/>
@@ -3419,8 +3414,8 @@
         <w:t xml:space="preserve">for status and timing fields. Queue ordering, deadline calculations, and escalation require application or Bot logic.</w:t>
       </w:r>
     </w:p>
-    <w:bookmarkEnd w:id="39"/>
-    <w:bookmarkStart w:id="41" w:name="longitudinal-patient-case-tracking"/>
+    <w:bookmarkEnd w:id="28"/>
+    <w:bookmarkStart w:id="30" w:name="longitudinal-patient-case-tracking"/>
     <w:p>
       <w:pPr>
         <w:pStyle w:val="Heading3"/>
@@ -3439,59 +3434,59 @@
     </w:p>
     <w:p>
       <w:pPr>
+        <w:pStyle w:val="Compact"/>
         <w:numPr>
           <w:ilvl w:val="0"/>
           <w:numId w:val="1010"/>
         </w:numPr>
+      </w:pPr>
+      <w:r>
+        <w:t xml:space="preserve">What defines a case: a condition, a treatment course, a service program, or a period of responsibility?</w:t>
+      </w:r>
+    </w:p>
+    <w:p>
+      <w:pPr>
         <w:pStyle w:val="Compact"/>
-      </w:pPr>
-      <w:r>
-        <w:t xml:space="preserve">What defines a case: a condition, a treatment course, a service program, or a period of responsibility?</w:t>
-      </w:r>
-    </w:p>
-    <w:p>
-      <w:pPr>
         <w:numPr>
           <w:ilvl w:val="0"/>
           <w:numId w:val="1010"/>
         </w:numPr>
+      </w:pPr>
+      <w:r>
+        <w:t xml:space="preserve">What starts, pauses, transfers, and ends that case?</w:t>
+      </w:r>
+    </w:p>
+    <w:p>
+      <w:pPr>
         <w:pStyle w:val="Compact"/>
-      </w:pPr>
-      <w:r>
-        <w:t xml:space="preserve">What starts, pauses, transfers, and ends that case?</w:t>
-      </w:r>
-    </w:p>
-    <w:p>
-      <w:pPr>
         <w:numPr>
           <w:ilvl w:val="0"/>
           <w:numId w:val="1010"/>
         </w:numPr>
+      </w:pPr>
+      <w:r>
+        <w:t xml:space="preserve">Can a patient have concurrent cases, including more than one addressing the same condition?</w:t>
+      </w:r>
+    </w:p>
+    <w:p>
+      <w:pPr>
         <w:pStyle w:val="Compact"/>
-      </w:pPr>
-      <w:r>
-        <w:t xml:space="preserve">Can a patient have concurrent cases, including more than one addressing the same condition?</w:t>
-      </w:r>
-    </w:p>
-    <w:p>
-      <w:pPr>
         <w:numPr>
           <w:ilvl w:val="0"/>
           <w:numId w:val="1010"/>
         </w:numPr>
+      </w:pPr>
+      <w:r>
+        <w:t xml:space="preserve">Can one encounter contribute to multiple cases?</w:t>
+      </w:r>
+    </w:p>
+    <w:p>
+      <w:pPr>
         <w:pStyle w:val="Compact"/>
-      </w:pPr>
-      <w:r>
-        <w:t xml:space="preserve">Can one encounter contribute to multiple cases?</w:t>
-      </w:r>
-    </w:p>
-    <w:p>
-      <w:pPr>
         <w:numPr>
           <w:ilvl w:val="0"/>
           <w:numId w:val="1010"/>
         </w:numPr>
-        <w:pStyle w:val="Compact"/>
       </w:pPr>
       <w:r>
         <w:t xml:space="preserve">Which organization, coordinator, or care team is responsible over time?</w:t>
@@ -3501,9 +3496,8 @@
       <w:tblPr>
         <w:tblStyle w:val="Table"/>
         <w:tblW w:w="9360" w:type="dxa"/>
+        <w:tblLayout w:type="fixed"/>
         <w:tblLook w:firstRow="1" w:lastRow="0" w:firstColumn="0" w:lastColumn="0" w:noHBand="0" w:noVBand="0" w:val="0020"/>
-        <w:jc w:val="start"/>
-        <w:tblLayout w:type="fixed"/>
       </w:tblPr>
       <w:tblGrid>
         <w:gridCol w:w="4012"/>
@@ -3512,7 +3506,7 @@
       <w:tr>
         <w:trPr>
           <w:cantSplit/>
-          <w:tblHeader w:val="true"/>
+          <w:tblHeader w:val="on"/>
         </w:trPr>
         <w:tc>
           <w:tcPr/>
@@ -3869,7 +3863,7 @@
       <w:r>
         <w:t xml:space="preserve"> </w:t>
       </w:r>
-      <w:hyperlink r:id="rId40">
+      <w:hyperlink r:id="rId29">
         <w:r>
           <w:rPr>
             <w:rStyle w:val="Hyperlink"/>
@@ -3881,8 +3875,8 @@
         <w:t xml:space="preserve">.</w:t>
       </w:r>
     </w:p>
-    <w:bookmarkEnd w:id="41"/>
-    <w:bookmarkStart w:id="44" w:name="care-plans-goals-progress"/>
+    <w:bookmarkEnd w:id="30"/>
+    <w:bookmarkStart w:id="33" w:name="care-plans-goals-progress"/>
     <w:p>
       <w:pPr>
         <w:pStyle w:val="Heading3"/>
@@ -3901,59 +3895,59 @@
     </w:p>
     <w:p>
       <w:pPr>
+        <w:pStyle w:val="Compact"/>
         <w:numPr>
           <w:ilvl w:val="0"/>
           <w:numId w:val="1011"/>
         </w:numPr>
+      </w:pPr>
+      <w:r>
+        <w:t xml:space="preserve">Do staff need to see agreed goals and planned activities together for a patient?</w:t>
+      </w:r>
+    </w:p>
+    <w:p>
+      <w:pPr>
         <w:pStyle w:val="Compact"/>
-      </w:pPr>
-      <w:r>
-        <w:t xml:space="preserve">Do staff need to see agreed goals and planned activities together for a patient?</w:t>
-      </w:r>
-    </w:p>
-    <w:p>
-      <w:pPr>
         <w:numPr>
           <w:ilvl w:val="0"/>
           <w:numId w:val="1011"/>
         </w:numPr>
+      </w:pPr>
+      <w:r>
+        <w:t xml:space="preserve">Who authors, approves, reviews, and changes the plan? Does the patient participate?</w:t>
+      </w:r>
+    </w:p>
+    <w:p>
+      <w:pPr>
         <w:pStyle w:val="Compact"/>
-      </w:pPr>
-      <w:r>
-        <w:t xml:space="preserve">Who authors, approves, reviews, and changes the plan? Does the patient participate?</w:t>
-      </w:r>
-    </w:p>
-    <w:p>
-      <w:pPr>
         <w:numPr>
           <w:ilvl w:val="0"/>
           <w:numId w:val="1011"/>
         </w:numPr>
+      </w:pPr>
+      <w:r>
+        <w:t xml:space="preserve">How is goal progress assessed, and which observations or assessments support it?</w:t>
+      </w:r>
+    </w:p>
+    <w:p>
+      <w:pPr>
         <w:pStyle w:val="Compact"/>
-      </w:pPr>
-      <w:r>
-        <w:t xml:space="preserve">How is goal progress assessed, and which observations or assessments support it?</w:t>
-      </w:r>
-    </w:p>
-    <w:p>
-      <w:pPr>
         <w:numPr>
           <w:ilvl w:val="0"/>
           <w:numId w:val="1011"/>
         </w:numPr>
+      </w:pPr>
+      <w:r>
+        <w:t xml:space="preserve">When a plan changes, what happens to already assigned work?</w:t>
+      </w:r>
+    </w:p>
+    <w:p>
+      <w:pPr>
         <w:pStyle w:val="Compact"/>
-      </w:pPr>
-      <w:r>
-        <w:t xml:space="preserve">When a plan changes, what happens to already assigned work?</w:t>
-      </w:r>
-    </w:p>
-    <w:p>
-      <w:pPr>
         <w:numPr>
           <w:ilvl w:val="0"/>
           <w:numId w:val="1011"/>
         </w:numPr>
-        <w:pStyle w:val="Compact"/>
       </w:pPr>
       <w:r>
         <w:t xml:space="preserve">What closes the plan, and can individual goals or activities finish at different times?</w:t>
@@ -3963,9 +3957,8 @@
       <w:tblPr>
         <w:tblStyle w:val="Table"/>
         <w:tblW w:w="9360" w:type="dxa"/>
+        <w:tblLayout w:type="fixed"/>
         <w:tblLook w:firstRow="1" w:lastRow="0" w:firstColumn="0" w:lastColumn="0" w:noHBand="0" w:noVBand="0" w:val="0020"/>
-        <w:jc w:val="start"/>
-        <w:tblLayout w:type="fixed"/>
       </w:tblPr>
       <w:tblGrid>
         <w:gridCol w:w="4255"/>
@@ -3974,7 +3967,7 @@
       <w:tr>
         <w:trPr>
           <w:cantSplit/>
-          <w:tblHeader w:val="true"/>
+          <w:tblHeader w:val="on"/>
         </w:trPr>
         <w:tc>
           <w:tcPr/>
@@ -4332,7 +4325,7 @@
       <w:r>
         <w:t xml:space="preserve"> </w:t>
       </w:r>
-      <w:hyperlink r:id="rId42">
+      <w:hyperlink r:id="rId31">
         <w:r>
           <w:rPr>
             <w:rStyle w:val="Hyperlink"/>
@@ -4349,7 +4342,7 @@
       <w:r>
         <w:t xml:space="preserve"> </w:t>
       </w:r>
-      <w:hyperlink r:id="rId43">
+      <w:hyperlink r:id="rId32">
         <w:r>
           <w:rPr>
             <w:rStyle w:val="Hyperlink"/>
@@ -4364,8 +4357,8 @@
         <w:t xml:space="preserve">for the distinction between a patient’s plan and a reusable protocol.</w:t>
       </w:r>
     </w:p>
-    <w:bookmarkEnd w:id="44"/>
-    <w:bookmarkStart w:id="49" w:name="protocols-recurring-work-automation"/>
+    <w:bookmarkEnd w:id="33"/>
+    <w:bookmarkStart w:id="38" w:name="protocols-recurring-work-automation"/>
     <w:p>
       <w:pPr>
         <w:pStyle w:val="Heading3"/>
@@ -4384,59 +4377,59 @@
     </w:p>
     <w:p>
       <w:pPr>
+        <w:pStyle w:val="Compact"/>
         <w:numPr>
           <w:ilvl w:val="0"/>
           <w:numId w:val="1012"/>
         </w:numPr>
+      </w:pPr>
+      <w:r>
+        <w:t xml:space="preserve">Is work created manually, from events, on a schedule, or from a reusable protocol?</w:t>
+      </w:r>
+    </w:p>
+    <w:p>
+      <w:pPr>
         <w:pStyle w:val="Compact"/>
-      </w:pPr>
-      <w:r>
-        <w:t xml:space="preserve">Is work created manually, from events, on a schedule, or from a reusable protocol?</w:t>
-      </w:r>
-    </w:p>
-    <w:p>
-      <w:pPr>
         <w:numPr>
           <w:ilvl w:val="0"/>
           <w:numId w:val="1012"/>
         </w:numPr>
+      </w:pPr>
+      <w:r>
+        <w:t xml:space="preserve">Which steps repeat for every patient, and which depend on prior outcomes?</w:t>
+      </w:r>
+    </w:p>
+    <w:p>
+      <w:pPr>
         <w:pStyle w:val="Compact"/>
-      </w:pPr>
-      <w:r>
-        <w:t xml:space="preserve">Which steps repeat for every patient, and which depend on prior outcomes?</w:t>
-      </w:r>
-    </w:p>
-    <w:p>
-      <w:pPr>
         <w:numPr>
           <w:ilvl w:val="0"/>
           <w:numId w:val="1012"/>
         </w:numPr>
+      </w:pPr>
+      <w:r>
+        <w:t xml:space="preserve">Are there dependencies, delays, repeated attempts, or stop conditions?</w:t>
+      </w:r>
+    </w:p>
+    <w:p>
+      <w:pPr>
         <w:pStyle w:val="Compact"/>
-      </w:pPr>
-      <w:r>
-        <w:t xml:space="preserve">Are there dependencies, delays, repeated attempts, or stop conditions?</w:t>
-      </w:r>
-    </w:p>
-    <w:p>
-      <w:pPr>
         <w:numPr>
           <w:ilvl w:val="0"/>
           <w:numId w:val="1012"/>
         </w:numPr>
+      </w:pPr>
+      <w:r>
+        <w:t xml:space="preserve">When a protocol changes, do existing patients continue their current version or migrate?</w:t>
+      </w:r>
+    </w:p>
+    <w:p>
+      <w:pPr>
         <w:pStyle w:val="Compact"/>
-      </w:pPr>
-      <w:r>
-        <w:t xml:space="preserve">When a protocol changes, do existing patients continue their current version or migrate?</w:t>
-      </w:r>
-    </w:p>
-    <w:p>
-      <w:pPr>
         <w:numPr>
           <w:ilvl w:val="0"/>
           <w:numId w:val="1012"/>
         </w:numPr>
-        <w:pStyle w:val="Compact"/>
       </w:pPr>
       <w:r>
         <w:t xml:space="preserve">How are failed runs, duplicate events, and missed follow-ups detected and recovered?</w:t>
@@ -4446,9 +4439,8 @@
       <w:tblPr>
         <w:tblStyle w:val="Table"/>
         <w:tblW w:w="9360" w:type="dxa"/>
+        <w:tblLayout w:type="fixed"/>
         <w:tblLook w:firstRow="1" w:lastRow="0" w:firstColumn="0" w:lastColumn="0" w:noHBand="0" w:noVBand="0" w:val="0020"/>
-        <w:jc w:val="start"/>
-        <w:tblLayout w:type="fixed"/>
       </w:tblPr>
       <w:tblGrid>
         <w:gridCol w:w="4318"/>
@@ -4457,7 +4449,7 @@
       <w:tr>
         <w:trPr>
           <w:cantSplit/>
-          <w:tblHeader w:val="true"/>
+          <w:tblHeader w:val="on"/>
         </w:trPr>
         <w:tc>
           <w:tcPr/>
@@ -4620,7 +4612,7 @@
             <w:r>
               <w:t xml:space="preserve"> </w:t>
             </w:r>
-            <w:hyperlink r:id="rId45">
+            <w:hyperlink r:id="rId34">
               <w:r>
                 <w:rPr>
                   <w:rStyle w:val="VerbatimChar"/>
@@ -4800,7 +4792,7 @@
       <w:r>
         <w:t xml:space="preserve"> </w:t>
       </w:r>
-      <w:hyperlink r:id="rId43">
+      <w:hyperlink r:id="rId32">
         <w:r>
           <w:rPr>
             <w:rStyle w:val="Hyperlink"/>
@@ -4814,7 +4806,7 @@
       <w:r>
         <w:t xml:space="preserve"> </w:t>
       </w:r>
-      <w:hyperlink r:id="rId46">
+      <w:hyperlink r:id="rId35">
         <w:r>
           <w:rPr>
             <w:rStyle w:val="Hyperlink"/>
@@ -4828,7 +4820,7 @@
       <w:r>
         <w:t xml:space="preserve"> </w:t>
       </w:r>
-      <w:hyperlink r:id="rId47">
+      <w:hyperlink r:id="rId36">
         <w:r>
           <w:rPr>
             <w:rStyle w:val="Hyperlink"/>
@@ -4842,7 +4834,7 @@
       <w:r>
         <w:t xml:space="preserve"> </w:t>
       </w:r>
-      <w:hyperlink r:id="rId48">
+      <w:hyperlink r:id="rId37">
         <w:r>
           <w:rPr>
             <w:rStyle w:val="Hyperlink"/>
@@ -4854,8 +4846,8 @@
         <w:t xml:space="preserve">.</w:t>
       </w:r>
     </w:p>
-    <w:bookmarkEnd w:id="49"/>
-    <w:bookmarkStart w:id="53" w:name="clinical-decision-support-follow-through"/>
+    <w:bookmarkEnd w:id="38"/>
+    <w:bookmarkStart w:id="42" w:name="clinical-decision-support-follow-through"/>
     <w:p>
       <w:pPr>
         <w:pStyle w:val="Heading3"/>
@@ -4874,59 +4866,59 @@
     </w:p>
     <w:p>
       <w:pPr>
+        <w:pStyle w:val="Compact"/>
         <w:numPr>
           <w:ilvl w:val="0"/>
           <w:numId w:val="1013"/>
         </w:numPr>
+      </w:pPr>
+      <w:r>
+        <w:t xml:space="preserve">Do clinicians need contextual reference material, rules-based recommendations, or predictive outputs?</w:t>
+      </w:r>
+    </w:p>
+    <w:p>
+      <w:pPr>
         <w:pStyle w:val="Compact"/>
-      </w:pPr>
-      <w:r>
-        <w:t xml:space="preserve">Do clinicians need contextual reference material, rules-based recommendations, or predictive outputs?</w:t>
-      </w:r>
-    </w:p>
-    <w:p>
-      <w:pPr>
         <w:numPr>
           <w:ilvl w:val="0"/>
           <w:numId w:val="1013"/>
         </w:numPr>
+      </w:pPr>
+      <w:r>
+        <w:t xml:space="preserve">When should guidance appear: chart review, order entry, assessment review, or background monitoring?</w:t>
+      </w:r>
+    </w:p>
+    <w:p>
+      <w:pPr>
         <w:pStyle w:val="Compact"/>
-      </w:pPr>
-      <w:r>
-        <w:t xml:space="preserve">When should guidance appear: chart review, order entry, assessment review, or background monitoring?</w:t>
-      </w:r>
-    </w:p>
-    <w:p>
-      <w:pPr>
         <w:numPr>
           <w:ilvl w:val="0"/>
           <w:numId w:val="1013"/>
         </w:numPr>
+      </w:pPr>
+      <w:r>
+        <w:t xml:space="preserve">Is the output informational, does it require acknowledgment, or should accepted recommendations create work?</w:t>
+      </w:r>
+    </w:p>
+    <w:p>
+      <w:pPr>
         <w:pStyle w:val="Compact"/>
-      </w:pPr>
-      <w:r>
-        <w:t xml:space="preserve">Is the output informational, does it require acknowledgment, or should accepted recommendations create work?</w:t>
-      </w:r>
-    </w:p>
-    <w:p>
-      <w:pPr>
         <w:numPr>
           <w:ilvl w:val="0"/>
           <w:numId w:val="1013"/>
         </w:numPr>
+      </w:pPr>
+      <w:r>
+        <w:t xml:space="preserve">Who can accept, dismiss, or override a recommendation, and what reason or evidence should be recorded?</w:t>
+      </w:r>
+    </w:p>
+    <w:p>
+      <w:pPr>
         <w:pStyle w:val="Compact"/>
-      </w:pPr>
-      <w:r>
-        <w:t xml:space="preserve">Who can accept, dismiss, or override a recommendation, and what reason or evidence should be recorded?</w:t>
-      </w:r>
-    </w:p>
-    <w:p>
-      <w:pPr>
         <w:numPr>
           <w:ilvl w:val="0"/>
           <w:numId w:val="1013"/>
         </w:numPr>
-        <w:pStyle w:val="Compact"/>
       </w:pPr>
       <w:r>
         <w:t xml:space="preserve">Who maintains the knowledge or model, and how will you evaluate usefulness, missed follow-up, and excessive alerts?</w:t>
@@ -4936,9 +4928,8 @@
       <w:tblPr>
         <w:tblStyle w:val="Table"/>
         <w:tblW w:w="9360" w:type="dxa"/>
+        <w:tblLayout w:type="fixed"/>
         <w:tblLook w:firstRow="1" w:lastRow="0" w:firstColumn="0" w:lastColumn="0" w:noHBand="0" w:noVBand="0" w:val="0020"/>
-        <w:jc w:val="start"/>
-        <w:tblLayout w:type="fixed"/>
       </w:tblPr>
       <w:tblGrid>
         <w:gridCol w:w="4680"/>
@@ -4947,7 +4938,7 @@
       <w:tr>
         <w:trPr>
           <w:cantSplit/>
-          <w:tblHeader w:val="true"/>
+          <w:tblHeader w:val="on"/>
         </w:trPr>
         <w:tc>
           <w:tcPr/>
@@ -5236,7 +5227,7 @@
       <w:r>
         <w:t xml:space="preserve"> </w:t>
       </w:r>
-      <w:hyperlink r:id="rId50">
+      <w:hyperlink r:id="rId39">
         <w:r>
           <w:rPr>
             <w:rStyle w:val="Hyperlink"/>
@@ -5253,7 +5244,7 @@
       <w:r>
         <w:t xml:space="preserve"> </w:t>
       </w:r>
-      <w:hyperlink r:id="rId51">
+      <w:hyperlink r:id="rId40">
         <w:r>
           <w:rPr>
             <w:rStyle w:val="Hyperlink"/>
@@ -5278,7 +5269,7 @@
       <w:r>
         <w:t xml:space="preserve"> </w:t>
       </w:r>
-      <w:hyperlink r:id="rId52">
+      <w:hyperlink r:id="rId41">
         <w:r>
           <w:rPr>
             <w:rStyle w:val="Hyperlink"/>
@@ -5290,8 +5281,8 @@
         <w:t xml:space="preserve">.</w:t>
       </w:r>
     </w:p>
-    <w:bookmarkEnd w:id="53"/>
-    <w:bookmarkStart w:id="59" w:name="participation-access-external-handoffs"/>
+    <w:bookmarkEnd w:id="42"/>
+    <w:bookmarkStart w:id="48" w:name="participation-access-external-handoffs"/>
     <w:p>
       <w:pPr>
         <w:pStyle w:val="Heading3"/>
@@ -5310,59 +5301,59 @@
     </w:p>
     <w:p>
       <w:pPr>
+        <w:pStyle w:val="Compact"/>
         <w:numPr>
           <w:ilvl w:val="0"/>
           <w:numId w:val="1014"/>
         </w:numPr>
+      </w:pPr>
+      <w:r>
+        <w:t xml:space="preserve">Do patients or caregivers perform assigned actions, see progress, or only receive updates?</w:t>
+      </w:r>
+    </w:p>
+    <w:p>
+      <w:pPr>
         <w:pStyle w:val="Compact"/>
-      </w:pPr>
-      <w:r>
-        <w:t xml:space="preserve">Do patients or caregivers perform assigned actions, see progress, or only receive updates?</w:t>
-      </w:r>
-    </w:p>
-    <w:p>
-      <w:pPr>
         <w:numPr>
           <w:ilvl w:val="0"/>
           <w:numId w:val="1014"/>
         </w:numPr>
+      </w:pPr>
+      <w:r>
+        <w:t xml:space="preserve">Which notes and documents are internal, patient-visible, or intended for an external recipient?</w:t>
+      </w:r>
+    </w:p>
+    <w:p>
+      <w:pPr>
         <w:pStyle w:val="Compact"/>
-      </w:pPr>
-      <w:r>
-        <w:t xml:space="preserve">Which notes and documents are internal, patient-visible, or intended for an external recipient?</w:t>
-      </w:r>
-    </w:p>
-    <w:p>
-      <w:pPr>
         <w:numPr>
           <w:ilvl w:val="0"/>
           <w:numId w:val="1014"/>
         </w:numPr>
+      </w:pPr>
+      <w:r>
+        <w:t xml:space="preserve">After reassignment or discharge, who retains access to the record?</w:t>
+      </w:r>
+    </w:p>
+    <w:p>
+      <w:pPr>
         <w:pStyle w:val="Compact"/>
-      </w:pPr>
-      <w:r>
-        <w:t xml:space="preserve">After reassignment or discharge, who retains access to the record?</w:t>
-      </w:r>
-    </w:p>
-    <w:p>
-      <w:pPr>
         <w:numPr>
           <w:ilvl w:val="0"/>
           <w:numId w:val="1014"/>
         </w:numPr>
+      </w:pPr>
+      <w:r>
+        <w:t xml:space="preserve">Do external partners update shared records, exchange structured data, or return documents and messages?</w:t>
+      </w:r>
+    </w:p>
+    <w:p>
+      <w:pPr>
         <w:pStyle w:val="Compact"/>
-      </w:pPr>
-      <w:r>
-        <w:t xml:space="preserve">Do external partners update shared records, exchange structured data, or return documents and messages?</w:t>
-      </w:r>
-    </w:p>
-    <w:p>
-      <w:pPr>
         <w:numPr>
           <w:ilvl w:val="0"/>
           <w:numId w:val="1014"/>
         </w:numPr>
-        <w:pStyle w:val="Compact"/>
       </w:pPr>
       <w:r>
         <w:t xml:space="preserve">How are replies matched to the original request, and who handles unmatched responses?</w:t>
@@ -5372,9 +5363,8 @@
       <w:tblPr>
         <w:tblStyle w:val="Table"/>
         <w:tblW w:w="9360" w:type="dxa"/>
+        <w:tblLayout w:type="fixed"/>
         <w:tblLook w:firstRow="1" w:lastRow="0" w:firstColumn="0" w:lastColumn="0" w:noHBand="0" w:noVBand="0" w:val="0020"/>
-        <w:jc w:val="start"/>
-        <w:tblLayout w:type="fixed"/>
       </w:tblPr>
       <w:tblGrid>
         <w:gridCol w:w="4356"/>
@@ -5383,7 +5373,7 @@
       <w:tr>
         <w:trPr>
           <w:cantSplit/>
-          <w:tblHeader w:val="true"/>
+          <w:tblHeader w:val="on"/>
         </w:trPr>
         <w:tc>
           <w:tcPr/>
@@ -5469,7 +5459,7 @@
             <w:r>
               <w:t xml:space="preserve"> </w:t>
             </w:r>
-            <w:hyperlink r:id="rId54">
+            <w:hyperlink r:id="rId43">
               <w:r>
                 <w:rPr>
                   <w:rStyle w:val="Hyperlink"/>
@@ -5781,7 +5771,7 @@
             <w:r>
               <w:t xml:space="preserve"> </w:t>
             </w:r>
-            <w:hyperlink r:id="rId55">
+            <w:hyperlink r:id="rId44">
               <w:r>
                 <w:rPr>
                   <w:rStyle w:val="Hyperlink"/>
@@ -5809,7 +5799,7 @@
       <w:r>
         <w:t xml:space="preserve"> </w:t>
       </w:r>
-      <w:hyperlink r:id="rId56">
+      <w:hyperlink r:id="rId45">
         <w:r>
           <w:rPr>
             <w:rStyle w:val="Hyperlink"/>
@@ -5823,7 +5813,7 @@
       <w:r>
         <w:t xml:space="preserve"> </w:t>
       </w:r>
-      <w:hyperlink r:id="rId57">
+      <w:hyperlink r:id="rId46">
         <w:r>
           <w:rPr>
             <w:rStyle w:val="Hyperlink"/>
@@ -5837,7 +5827,7 @@
       <w:r>
         <w:t xml:space="preserve"> </w:t>
       </w:r>
-      <w:hyperlink r:id="rId58">
+      <w:hyperlink r:id="rId47">
         <w:r>
           <w:rPr>
             <w:rStyle w:val="Hyperlink"/>
@@ -5852,8 +5842,8 @@
         <w:t xml:space="preserve">docs for the detailed designs. Scheduling and billing decisions should likewise link to their respective workflow documentation.</w:t>
       </w:r>
     </w:p>
-    <w:bookmarkEnd w:id="59"/>
-    <w:bookmarkStart w:id="60" w:name="operational-reporting-closure"/>
+    <w:bookmarkEnd w:id="48"/>
+    <w:bookmarkStart w:id="49" w:name="operational-reporting-closure"/>
     <w:p>
       <w:pPr>
         <w:pStyle w:val="Heading3"/>
@@ -5872,47 +5862,47 @@
     </w:p>
     <w:p>
       <w:pPr>
+        <w:pStyle w:val="Compact"/>
         <w:numPr>
           <w:ilvl w:val="0"/>
           <w:numId w:val="1015"/>
         </w:numPr>
+      </w:pPr>
+      <w:r>
+        <w:t xml:space="preserve">Which daily views do staff need: unassigned work, due work, blocked items, workload by team, or patients needing follow-up?</w:t>
+      </w:r>
+    </w:p>
+    <w:p>
+      <w:pPr>
         <w:pStyle w:val="Compact"/>
-      </w:pPr>
-      <w:r>
-        <w:t xml:space="preserve">Which daily views do staff need: unassigned work, due work, blocked items, workload by team, or patients needing follow-up?</w:t>
-      </w:r>
-    </w:p>
-    <w:p>
-      <w:pPr>
         <w:numPr>
           <w:ilvl w:val="0"/>
           <w:numId w:val="1015"/>
         </w:numPr>
+      </w:pPr>
+      <w:r>
+        <w:t xml:space="preserve">Which measures demonstrate improvement: turnaround time, fewer handoffs, appropriate delegation, successful follow-up, or goal progress?</w:t>
+      </w:r>
+    </w:p>
+    <w:p>
+      <w:pPr>
         <w:pStyle w:val="Compact"/>
-      </w:pPr>
-      <w:r>
-        <w:t xml:space="preserve">Which measures demonstrate improvement: turnaround time, fewer handoffs, appropriate delegation, successful follow-up, or goal progress?</w:t>
-      </w:r>
-    </w:p>
-    <w:p>
-      <w:pPr>
         <w:numPr>
           <w:ilvl w:val="0"/>
           <w:numId w:val="1015"/>
         </w:numPr>
+      </w:pPr>
+      <w:r>
+        <w:t xml:space="preserve">What timestamps and event history support those measures, including reopened work and paused clocks?</w:t>
+      </w:r>
+    </w:p>
+    <w:p>
+      <w:pPr>
         <w:pStyle w:val="Compact"/>
-      </w:pPr>
-      <w:r>
-        <w:t xml:space="preserve">What timestamps and event history support those measures, including reopened work and paused clocks?</w:t>
-      </w:r>
-    </w:p>
-    <w:p>
-      <w:pPr>
         <w:numPr>
           <w:ilvl w:val="0"/>
           <w:numId w:val="1015"/>
         </w:numPr>
-        <w:pStyle w:val="Compact"/>
       </w:pPr>
       <w:r>
         <w:t xml:space="preserve">Does completing a Task also complete an activity, referral, plan, or case? Under what conditions?</w:t>
@@ -5922,9 +5912,8 @@
       <w:tblPr>
         <w:tblStyle w:val="Table"/>
         <w:tblW w:w="9360" w:type="dxa"/>
+        <w:tblLayout w:type="fixed"/>
         <w:tblLook w:firstRow="1" w:lastRow="0" w:firstColumn="0" w:lastColumn="0" w:noHBand="0" w:noVBand="0" w:val="0020"/>
-        <w:jc w:val="start"/>
-        <w:tblLayout w:type="fixed"/>
       </w:tblPr>
       <w:tblGrid>
         <w:gridCol w:w="4452"/>
@@ -5933,7 +5922,7 @@
       <w:tr>
         <w:trPr>
           <w:cantSplit/>
-          <w:tblHeader w:val="true"/>
+          <w:tblHeader w:val="on"/>
         </w:trPr>
         <w:tc>
           <w:tcPr/>
@@ -6212,9 +6201,9 @@
         </w:tc>
       </w:tr>
     </w:tbl>
-    <w:bookmarkEnd w:id="60"/>
-    <w:bookmarkEnd w:id="61"/>
-    <w:bookmarkStart w:id="62" w:name="X4c59cba664d03f8dc0701cf52eb20c40b875665"/>
+    <w:bookmarkEnd w:id="49"/>
+    <w:bookmarkEnd w:id="50"/>
+    <w:bookmarkStart w:id="51" w:name="X4c59cba664d03f8dc0701cf52eb20c40b875665"/>
     <w:p>
       <w:pPr>
         <w:pStyle w:val="Heading2"/>
@@ -6225,78 +6214,78 @@
     </w:p>
     <w:p>
       <w:pPr>
+        <w:pStyle w:val="Compact"/>
         <w:numPr>
           <w:ilvl w:val="0"/>
           <w:numId w:val="1016"/>
         </w:numPr>
+      </w:pPr>
+      <w:r>
+        <w:t xml:space="preserve">The first workflow, its entry event, and its source of truth</w:t>
+      </w:r>
+    </w:p>
+    <w:p>
+      <w:pPr>
         <w:pStyle w:val="Compact"/>
-      </w:pPr>
-      <w:r>
-        <w:t xml:space="preserve">The first workflow, its entry event, and its source of truth</w:t>
-      </w:r>
-    </w:p>
-    <w:p>
-      <w:pPr>
         <w:numPr>
           <w:ilvl w:val="0"/>
           <w:numId w:val="1016"/>
         </w:numPr>
+      </w:pPr>
+      <w:r>
+        <w:t xml:space="preserve">Work items, clinical context, and any longitudinal case or care-plan model</w:t>
+      </w:r>
+    </w:p>
+    <w:p>
+      <w:pPr>
         <w:pStyle w:val="Compact"/>
-      </w:pPr>
-      <w:r>
-        <w:t xml:space="preserve">Work items, clinical context, and any longitudinal case or care-plan model</w:t>
-      </w:r>
-    </w:p>
-    <w:p>
-      <w:pPr>
         <w:numPr>
           <w:ilvl w:val="0"/>
           <w:numId w:val="1016"/>
         </w:numPr>
+      </w:pPr>
+      <w:r>
+        <w:t xml:space="preserve">Eligible roles, accountable owners, review steps, and exception handling</w:t>
+      </w:r>
+    </w:p>
+    <w:p>
+      <w:pPr>
         <w:pStyle w:val="Compact"/>
-      </w:pPr>
-      <w:r>
-        <w:t xml:space="preserve">Eligible roles, accountable owners, review steps, and exception handling</w:t>
-      </w:r>
-    </w:p>
-    <w:p>
-      <w:pPr>
         <w:numPr>
           <w:ilvl w:val="0"/>
           <w:numId w:val="1016"/>
         </w:numPr>
+      </w:pPr>
+      <w:r>
+        <w:t xml:space="preserve">Lifecycle stages, completion evidence, deadlines, and escalation rules</w:t>
+      </w:r>
+    </w:p>
+    <w:p>
+      <w:pPr>
         <w:pStyle w:val="Compact"/>
-      </w:pPr>
-      <w:r>
-        <w:t xml:space="preserve">Lifecycle stages, completion evidence, deadlines, and escalation rules</w:t>
-      </w:r>
-    </w:p>
-    <w:p>
-      <w:pPr>
         <w:numPr>
           <w:ilvl w:val="0"/>
           <w:numId w:val="1016"/>
         </w:numPr>
+      </w:pPr>
+      <w:r>
+        <w:t xml:space="preserve">Automation and CDS behavior, including human review and failure recovery</w:t>
+      </w:r>
+    </w:p>
+    <w:p>
+      <w:pPr>
         <w:pStyle w:val="Compact"/>
-      </w:pPr>
-      <w:r>
-        <w:t xml:space="preserve">Automation and CDS behavior, including human review and failure recovery</w:t>
-      </w:r>
-    </w:p>
-    <w:p>
-      <w:pPr>
         <w:numPr>
           <w:ilvl w:val="0"/>
           <w:numId w:val="1016"/>
         </w:numPr>
-        <w:pStyle w:val="Compact"/>
       </w:pPr>
       <w:r>
         <w:t xml:space="preserve">Access boundaries, external handoffs, and the measures of success</w:t>
       </w:r>
     </w:p>
-    <w:bookmarkEnd w:id="62"/>
-    <w:bookmarkEnd w:id="63"/>
+    <w:bookmarkEnd w:id="51"/>
+    <w:bookmarkEnd w:id="52"/>
     <w:sectPr>
       <w:pgSz w:h="15840" w:w="12240"/>
       <w:pgMar w:bottom="1440" w:footer="720" w:gutter="0" w:header="720" w:left="1440" w:right="1440" w:top="1440"/>
@@ -6334,14 +6323,14 @@
 <file path=word/numbering.xml><?xml version="1.0" encoding="utf-8"?>
 <w:numbering xmlns:w="http://schemas.openxmlformats.org/wordprocessingml/2006/main">
   <w:abstractNum w:abstractNumId="990">
-    <w:nsid w:val="A990"/>
+    <w:nsid w:val="0000A990"/>
     <w:multiLevelType w:val="multilevel"/>
     <w:lvl w:ilvl="0">
       <w:numFmt w:val="bullet"/>
       <w:lvlText w:val=" "/>
       <w:lvlJc w:val="left"/>
       <w:pPr>
-        <w:ind w:left="720" w:hanging="480"/>
+        <w:ind w:left="720" w:hanging="360"/>
       </w:pPr>
     </w:lvl>
     <w:lvl w:ilvl="1">
@@ -6349,7 +6338,7 @@
       <w:lvlText w:val=" "/>
       <w:lvlJc w:val="left"/>
       <w:pPr>
-        <w:ind w:left="1440" w:hanging="480"/>
+        <w:ind w:left="1440" w:hanging="360"/>
       </w:pPr>
     </w:lvl>
     <w:lvl w:ilvl="2">
@@ -6357,7 +6346,7 @@
       <w:lvlText w:val=" "/>
       <w:lvlJc w:val="left"/>
       <w:pPr>
-        <w:ind w:left="2160" w:hanging="480"/>
+        <w:ind w:left="2160" w:hanging="360"/>
       </w:pPr>
     </w:lvl>
     <w:lvl w:ilvl="3">
@@ -6365,7 +6354,7 @@
       <w:lvlText w:val=" "/>
       <w:lvlJc w:val="left"/>
       <w:pPr>
-        <w:ind w:left="2880" w:hanging="480"/>
+        <w:ind w:left="2880" w:hanging="360"/>
       </w:pPr>
     </w:lvl>
     <w:lvl w:ilvl="4">
@@ -6373,7 +6362,7 @@
       <w:lvlText w:val=" "/>
       <w:lvlJc w:val="left"/>
       <w:pPr>
-        <w:ind w:left="3600" w:hanging="480"/>
+        <w:ind w:left="3600" w:hanging="360"/>
       </w:pPr>
     </w:lvl>
     <w:lvl w:ilvl="5">
@@ -6381,7 +6370,7 @@
       <w:lvlText w:val=" "/>
       <w:lvlJc w:val="left"/>
       <w:pPr>
-        <w:ind w:left="4320" w:hanging="480"/>
+        <w:ind w:left="4320" w:hanging="360"/>
       </w:pPr>
     </w:lvl>
     <w:lvl w:ilvl="6">
@@ -6389,7 +6378,7 @@
       <w:lvlText w:val=" "/>
       <w:lvlJc w:val="left"/>
       <w:pPr>
-        <w:ind w:left="5040" w:hanging="480"/>
+        <w:ind w:left="5040" w:hanging="360"/>
       </w:pPr>
     </w:lvl>
     <w:lvl w:ilvl="7">
@@ -6397,7 +6386,7 @@
       <w:lvlText w:val=" "/>
       <w:lvlJc w:val="left"/>
       <w:pPr>
-        <w:ind w:left="5760" w:hanging="480"/>
+        <w:ind w:left="5760" w:hanging="360"/>
       </w:pPr>
     </w:lvl>
     <w:lvl w:ilvl="8">
@@ -6405,84 +6394,111 @@
       <w:lvlText w:val=" "/>
       <w:lvlJc w:val="left"/>
       <w:pPr>
-        <w:ind w:left="6480" w:hanging="480"/>
+        <w:ind w:left="6480" w:hanging="360"/>
       </w:pPr>
     </w:lvl>
   </w:abstractNum>
   <w:abstractNum w:abstractNumId="991">
-    <w:nsid w:val="A991"/>
+    <w:nsid w:val="0000A991"/>
     <w:multiLevelType w:val="multilevel"/>
     <w:lvl w:ilvl="0">
       <w:numFmt w:val="bullet"/>
-      <w:lvlText w:val="•"/>
+      <w:lvlText w:val=""/>
       <w:lvlJc w:val="left"/>
       <w:pPr>
-        <w:ind w:left="720" w:hanging="480"/>
-      </w:pPr>
+        <w:ind w:left="720" w:hanging="360"/>
+      </w:pPr>
+      <w:rPr>
+        <w:rFonts w:ascii="Symbol" w:hAnsi="Symbol" w:cs="Symbol" w:hint="default"/>
+      </w:rPr>
     </w:lvl>
     <w:lvl w:ilvl="1">
       <w:numFmt w:val="bullet"/>
-      <w:lvlText w:val="–"/>
+      <w:lvlText w:val="o"/>
       <w:lvlJc w:val="left"/>
       <w:pPr>
-        <w:ind w:left="1440" w:hanging="480"/>
-      </w:pPr>
+        <w:ind w:left="1440" w:hanging="360"/>
+      </w:pPr>
+      <w:rPr>
+        <w:rFonts w:ascii="Courier New" w:hAnsi="Courier New" w:cs="Courier New" w:hint="default"/>
+      </w:rPr>
     </w:lvl>
     <w:lvl w:ilvl="2">
       <w:numFmt w:val="bullet"/>
-      <w:lvlText w:val="•"/>
+      <w:lvlText w:val=""/>
       <w:lvlJc w:val="left"/>
       <w:pPr>
-        <w:ind w:left="2160" w:hanging="480"/>
-      </w:pPr>
+        <w:ind w:left="2160" w:hanging="360"/>
+      </w:pPr>
+      <w:rPr>
+        <w:rFonts w:ascii="Wingdings" w:hAnsi="Wingdings" w:cs="Wingdings" w:hint="default"/>
+      </w:rPr>
     </w:lvl>
     <w:lvl w:ilvl="3">
       <w:numFmt w:val="bullet"/>
-      <w:lvlText w:val="–"/>
+      <w:lvlText w:val=""/>
       <w:lvlJc w:val="left"/>
       <w:pPr>
-        <w:ind w:left="2880" w:hanging="480"/>
-      </w:pPr>
+        <w:ind w:left="2880" w:hanging="360"/>
+      </w:pPr>
+      <w:rPr>
+        <w:rFonts w:ascii="Symbol" w:hAnsi="Symbol" w:cs="Symbol" w:hint="default"/>
+      </w:rPr>
     </w:lvl>
     <w:lvl w:ilvl="4">
       <w:numFmt w:val="bullet"/>
-      <w:lvlText w:val="•"/>
+      <w:lvlText w:val="o"/>
       <w:lvlJc w:val="left"/>
       <w:pPr>
-        <w:ind w:left="3600" w:hanging="480"/>
-      </w:pPr>
+        <w:ind w:left="3600" w:hanging="360"/>
+      </w:pPr>
+      <w:rPr>
+        <w:rFonts w:ascii="Courier New" w:hAnsi="Courier New" w:cs="Courier New" w:hint="default"/>
+      </w:rPr>
     </w:lvl>
     <w:lvl w:ilvl="5">
       <w:numFmt w:val="bullet"/>
-      <w:lvlText w:val="–"/>
+      <w:lvlText w:val=""/>
       <w:lvlJc w:val="left"/>
       <w:pPr>
-        <w:ind w:left="4320" w:hanging="480"/>
-      </w:pPr>
+        <w:ind w:left="4320" w:hanging="360"/>
+      </w:pPr>
+      <w:rPr>
+        <w:rFonts w:ascii="Wingdings" w:hAnsi="Wingdings" w:cs="Wingdings" w:hint="default"/>
+      </w:rPr>
     </w:lvl>
     <w:lvl w:ilvl="6">
       <w:numFmt w:val="bullet"/>
-      <w:lvlText w:val="•"/>
+      <w:lvlText w:val=""/>
       <w:lvlJc w:val="left"/>
       <w:pPr>
-        <w:ind w:left="5040" w:hanging="480"/>
-      </w:pPr>
+        <w:ind w:left="5040" w:hanging="360"/>
+      </w:pPr>
+      <w:rPr>
+        <w:rFonts w:ascii="Symbol" w:hAnsi="Symbol" w:cs="Symbol" w:hint="default"/>
+      </w:rPr>
     </w:lvl>
     <w:lvl w:ilvl="7">
       <w:numFmt w:val="bullet"/>
-      <w:lvlText w:val="–"/>
+      <w:lvlText w:val="o"/>
       <w:lvlJc w:val="left"/>
       <w:pPr>
-        <w:ind w:left="5760" w:hanging="480"/>
-      </w:pPr>
+        <w:ind w:left="5760" w:hanging="360"/>
+      </w:pPr>
+      <w:rPr>
+        <w:rFonts w:ascii="Courier New" w:hAnsi="Courier New" w:cs="Courier New" w:hint="default"/>
+      </w:rPr>
     </w:lvl>
     <w:lvl w:ilvl="8">
       <w:numFmt w:val="bullet"/>
-      <w:lvlText w:val="•"/>
+      <w:lvlText w:val=""/>
       <w:lvlJc w:val="left"/>
       <w:pPr>
-        <w:ind w:left="6480" w:hanging="480"/>
-      </w:pPr>
+        <w:ind w:left="6480" w:hanging="360"/>
+      </w:pPr>
+      <w:rPr>
+        <w:rFonts w:ascii="Wingdings" w:hAnsi="Wingdings" w:cs="Wingdings" w:hint="default"/>
+      </w:rPr>
     </w:lvl>
   </w:abstractNum>
   <w:num w:numId="1000">
@@ -7215,8 +7231,8 @@
     <w:name w:val="KeywordTok"/>
     <w:basedOn w:val="VerbatimChar"/>
     <w:rPr>
+      <w:b/>
       <w:color w:val="007020"/>
-      <w:b/>
     </w:rPr>
   </w:style>
   <w:style w:type="character" w:customStyle="1" w:styleId="DataTypeTok">
@@ -7293,42 +7309,42 @@
     <w:name w:val="ImportTok"/>
     <w:basedOn w:val="VerbatimChar"/>
     <w:rPr>
+      <w:b/>
       <w:color w:val="008000"/>
-      <w:b/>
     </w:rPr>
   </w:style>
   <w:style w:type="character" w:customStyle="1" w:styleId="CommentTok">
     <w:name w:val="CommentTok"/>
     <w:basedOn w:val="VerbatimChar"/>
     <w:rPr>
+      <w:i/>
       <w:color w:val="60a0b0"/>
-      <w:i/>
     </w:rPr>
   </w:style>
   <w:style w:type="character" w:customStyle="1" w:styleId="DocumentationTok">
     <w:name w:val="DocumentationTok"/>
     <w:basedOn w:val="VerbatimChar"/>
     <w:rPr>
+      <w:i/>
       <w:color w:val="ba2121"/>
-      <w:i/>
     </w:rPr>
   </w:style>
   <w:style w:type="character" w:customStyle="1" w:styleId="AnnotationTok">
     <w:name w:val="AnnotationTok"/>
     <w:basedOn w:val="VerbatimChar"/>
     <w:rPr>
-      <w:color w:val="60a0b0"/>
       <w:b/>
       <w:i/>
+      <w:color w:val="60a0b0"/>
     </w:rPr>
   </w:style>
   <w:style w:type="character" w:customStyle="1" w:styleId="CommentVarTok">
     <w:name w:val="CommentVarTok"/>
     <w:basedOn w:val="VerbatimChar"/>
     <w:rPr>
-      <w:color w:val="60a0b0"/>
       <w:b/>
       <w:i/>
+      <w:color w:val="60a0b0"/>
     </w:rPr>
   </w:style>
   <w:style w:type="character" w:customStyle="1" w:styleId="OtherTok">
@@ -7356,8 +7372,8 @@
     <w:name w:val="ControlFlowTok"/>
     <w:basedOn w:val="VerbatimChar"/>
     <w:rPr>
+      <w:b/>
       <w:color w:val="007020"/>
-      <w:b/>
     </w:rPr>
   </w:style>
   <w:style w:type="character" w:customStyle="1" w:styleId="OperatorTok">
@@ -7402,34 +7418,34 @@
     <w:name w:val="InformationTok"/>
     <w:basedOn w:val="VerbatimChar"/>
     <w:rPr>
-      <w:color w:val="60a0b0"/>
       <w:b/>
       <w:i/>
+      <w:color w:val="60a0b0"/>
     </w:rPr>
   </w:style>
   <w:style w:type="character" w:customStyle="1" w:styleId="WarningTok">
     <w:name w:val="WarningTok"/>
     <w:basedOn w:val="VerbatimChar"/>
     <w:rPr>
-      <w:color w:val="60a0b0"/>
       <w:b/>
       <w:i/>
+      <w:color w:val="60a0b0"/>
     </w:rPr>
   </w:style>
   <w:style w:type="character" w:customStyle="1" w:styleId="AlertTok">
     <w:name w:val="AlertTok"/>
     <w:basedOn w:val="VerbatimChar"/>
     <w:rPr>
+      <w:b/>
       <w:color w:val="ff0000"/>
-      <w:b/>
     </w:rPr>
   </w:style>
   <w:style w:type="character" w:customStyle="1" w:styleId="ErrorTok">
     <w:name w:val="ErrorTok"/>
     <w:basedOn w:val="VerbatimChar"/>
     <w:rPr>
+      <w:b/>
       <w:color w:val="ff0000"/>
-      <w:b/>
     </w:rPr>
   </w:style>
   <w:style w:type="character" w:customStyle="1" w:styleId="NormalTok">

</xml_diff>

<commit_message>
docs: refresh decision guide downloads with intro dividers
Signed-off-by: Everett Williams <everett@medplum.com>
</commit_message>
<xml_diff>
--- a/packages/docs/static/decision-guides/care-coordination.docx
+++ b/packages/docs/static/decision-guides/care-coordination.docx
@@ -11,18 +11,18 @@
           <wp:inline>
             <wp:extent cx="5943600" cy="1289649"/>
             <wp:effectExtent b="0" l="0" r="0" t="0"/>
-            <wp:docPr descr="Medplum" title="" id="21" name="Picture"/>
+            <wp:docPr descr="Medplum" title="" id="10" name="Picture"/>
             <a:graphic>
               <a:graphicData uri="http://schemas.openxmlformats.org/drawingml/2006/picture">
                 <pic:pic>
                   <pic:nvPicPr>
-                    <pic:cNvPr descr="medplum-wordmark-grape.png" id="22" name="Picture"/>
+                    <pic:cNvPr descr="medplum-wordmark-grape.png" id="11" name="Picture"/>
                     <pic:cNvPicPr>
                       <a:picLocks noChangeArrowheads="1" noChangeAspect="1"/>
                     </pic:cNvPicPr>
                   </pic:nvPicPr>
                   <pic:blipFill>
-                    <a:blip r:embed="rId20"/>
+                    <a:blip r:embed="rId9"/>
                     <a:stretch>
                       <a:fillRect/>
                     </a:stretch>
@@ -49,7 +49,7 @@
         </w:drawing>
       </w:r>
     </w:p>
-    <w:bookmarkStart w:id="63" w:name="care-coordination-decision-guide"/>
+    <w:bookmarkStart w:id="52" w:name="care-coordination-decision-guide"/>
     <w:p>
       <w:pPr>
         <w:pStyle w:val="Heading1"/>
@@ -72,44 +72,51 @@
       </w:pPr>
       <w:r>
         <w:rPr>
+          <w:i/>
           <w:iCs/>
-          <w:i/>
         </w:rPr>
         <w:t xml:space="preserve">Companion to the</w:t>
       </w:r>
       <w:r>
         <w:rPr>
+          <w:i/>
           <w:iCs/>
-          <w:i/>
         </w:rPr>
         <w:t xml:space="preserve"> </w:t>
       </w:r>
-      <w:hyperlink r:id="rId23">
+      <w:hyperlink r:id="rId12">
         <w:r>
           <w:rPr>
             <w:rStyle w:val="Hyperlink"/>
+            <w:i/>
             <w:iCs/>
-            <w:i/>
           </w:rPr>
           <w:t xml:space="preserve">Care Coordination</w:t>
         </w:r>
       </w:hyperlink>
       <w:r>
         <w:rPr>
+          <w:i/>
           <w:iCs/>
-          <w:i/>
         </w:rPr>
         <w:t xml:space="preserve"> </w:t>
       </w:r>
       <w:r>
         <w:rPr>
+          <w:i/>
           <w:iCs/>
-          <w:i/>
         </w:rPr>
         <w:t xml:space="preserve">docs.</w:t>
       </w:r>
     </w:p>
-    <w:bookmarkStart w:id="25" w:name="section-1-use-case-participants"/>
+    <w:p>
+      <w:r>
+        <w:pict>
+          <v:rect style="width:0;height:1.5pt" o:hralign="center" o:hrstd="t" o:hr="t"/>
+        </w:pict>
+      </w:r>
+    </w:p>
+    <w:bookmarkStart w:id="14" w:name="section-1-use-case-participants"/>
     <w:p>
       <w:pPr>
         <w:pStyle w:val="Heading2"/>
@@ -124,79 +131,79 @@
       </w:pPr>
       <w:r>
         <w:rPr>
+          <w:b/>
           <w:bCs/>
-          <w:b/>
         </w:rPr>
         <w:t xml:space="preserve">1.1 Which operational problems are you trying to solve first?</w:t>
       </w:r>
     </w:p>
     <w:p>
       <w:pPr>
+        <w:pStyle w:val="Compact"/>
         <w:numPr>
           <w:ilvl w:val="0"/>
           <w:numId w:val="1001"/>
         </w:numPr>
+      </w:pPr>
+      <w:r>
+        <w:t xml:space="preserve">Clinicians spend time on work that other team members could perform</w:t>
+      </w:r>
+    </w:p>
+    <w:p>
+      <w:pPr>
         <w:pStyle w:val="Compact"/>
-      </w:pPr>
-      <w:r>
-        <w:t xml:space="preserve">Clinicians spend time on work that other team members could perform</w:t>
-      </w:r>
-    </w:p>
-    <w:p>
-      <w:pPr>
         <w:numPr>
           <w:ilvl w:val="0"/>
           <w:numId w:val="1001"/>
         </w:numPr>
+      </w:pPr>
+      <w:r>
+        <w:t xml:space="preserve">Work gets lost between people, teams, visits, or systems</w:t>
+      </w:r>
+    </w:p>
+    <w:p>
+      <w:pPr>
         <w:pStyle w:val="Compact"/>
-      </w:pPr>
-      <w:r>
-        <w:t xml:space="preserve">Work gets lost between people, teams, visits, or systems</w:t>
-      </w:r>
-    </w:p>
-    <w:p>
-      <w:pPr>
         <w:numPr>
           <w:ilvl w:val="0"/>
           <w:numId w:val="1001"/>
         </w:numPr>
+      </w:pPr>
+      <w:r>
+        <w:t xml:space="preserve">Staff cannot see who owns the next action or what is overdue</w:t>
+      </w:r>
+    </w:p>
+    <w:p>
+      <w:pPr>
         <w:pStyle w:val="Compact"/>
-      </w:pPr>
-      <w:r>
-        <w:t xml:space="preserve">Staff cannot see who owns the next action or what is overdue</w:t>
-      </w:r>
-    </w:p>
-    <w:p>
-      <w:pPr>
         <w:numPr>
           <w:ilvl w:val="0"/>
           <w:numId w:val="1001"/>
         </w:numPr>
+      </w:pPr>
+      <w:r>
+        <w:t xml:space="preserve">Patient care spans multiple visits without a clear case history or plan</w:t>
+      </w:r>
+    </w:p>
+    <w:p>
+      <w:pPr>
         <w:pStyle w:val="Compact"/>
-      </w:pPr>
-      <w:r>
-        <w:t xml:space="preserve">Patient care spans multiple visits without a clear case history or plan</w:t>
-      </w:r>
-    </w:p>
-    <w:p>
-      <w:pPr>
         <w:numPr>
           <w:ilvl w:val="0"/>
           <w:numId w:val="1001"/>
         </w:numPr>
+      </w:pPr>
+      <w:r>
+        <w:t xml:space="preserve">Follow-up, protocols, or clinical recommendations are applied inconsistently</w:t>
+      </w:r>
+    </w:p>
+    <w:p>
+      <w:pPr>
         <w:pStyle w:val="Compact"/>
-      </w:pPr>
-      <w:r>
-        <w:t xml:space="preserve">Follow-up, protocols, or clinical recommendations are applied inconsistently</w:t>
-      </w:r>
-    </w:p>
-    <w:p>
-      <w:pPr>
         <w:numPr>
           <w:ilvl w:val="0"/>
           <w:numId w:val="1001"/>
         </w:numPr>
-        <w:pStyle w:val="Compact"/>
       </w:pPr>
       <w:r>
         <w:t xml:space="preserve">Some combination; identify the first workflow you intend to launch</w:t>
@@ -208,8 +215,8 @@
       </w:pPr>
       <w:r>
         <w:rPr>
+          <w:i/>
           <w:iCs/>
-          <w:i/>
         </w:rPr>
         <w:t xml:space="preserve">Why: establishes whether the starting point is delegation, a work queue, longitudinal tracking, or a more structured care program.</w:t>
       </w:r>
@@ -220,55 +227,55 @@
       </w:pPr>
       <w:r>
         <w:rPr>
+          <w:b/>
           <w:bCs/>
-          <w:b/>
         </w:rPr>
         <w:t xml:space="preserve">1.2 Who participates, and where does responsibility sit?</w:t>
       </w:r>
     </w:p>
     <w:p>
       <w:pPr>
+        <w:pStyle w:val="Compact"/>
         <w:numPr>
           <w:ilvl w:val="0"/>
           <w:numId w:val="1002"/>
         </w:numPr>
+      </w:pPr>
+      <w:r>
+        <w:t xml:space="preserve">Which clinicians, nurses, assistants, coordinators, administrative staff, patients, and caregivers perform work?</w:t>
+      </w:r>
+    </w:p>
+    <w:p>
+      <w:pPr>
         <w:pStyle w:val="Compact"/>
-      </w:pPr>
-      <w:r>
-        <w:t xml:space="preserve">Which clinicians, nurses, assistants, coordinators, administrative staff, patients, and caregivers perform work?</w:t>
-      </w:r>
-    </w:p>
-    <w:p>
-      <w:pPr>
         <w:numPr>
           <w:ilvl w:val="0"/>
           <w:numId w:val="1002"/>
         </w:numPr>
+      </w:pPr>
+      <w:r>
+        <w:t xml:space="preserve">Is work organized by individual, role, care team, service line, location, or organization?</w:t>
+      </w:r>
+    </w:p>
+    <w:p>
+      <w:pPr>
         <w:pStyle w:val="Compact"/>
-      </w:pPr>
-      <w:r>
-        <w:t xml:space="preserve">Is work organized by individual, role, care team, service line, location, or organization?</w:t>
-      </w:r>
-    </w:p>
-    <w:p>
-      <w:pPr>
         <w:numPr>
           <w:ilvl w:val="0"/>
           <w:numId w:val="1002"/>
         </w:numPr>
+      </w:pPr>
+      <w:r>
+        <w:t xml:space="preserve">Who is accountable for a patient’s overall care, and who owns each individual action?</w:t>
+      </w:r>
+    </w:p>
+    <w:p>
+      <w:pPr>
         <w:pStyle w:val="Compact"/>
-      </w:pPr>
-      <w:r>
-        <w:t xml:space="preserve">Who is accountable for a patient’s overall care, and who owns each individual action?</w:t>
-      </w:r>
-    </w:p>
-    <w:p>
-      <w:pPr>
         <w:numPr>
           <w:ilvl w:val="0"/>
           <w:numId w:val="1002"/>
         </w:numPr>
-        <w:pStyle w:val="Compact"/>
       </w:pPr>
       <w:r>
         <w:t xml:space="preserve">Do outside providers or partner organizations participate directly, or through exchanged messages and documents?</w:t>
@@ -280,8 +287,8 @@
       </w:pPr>
       <w:r>
         <w:rPr>
+          <w:i/>
           <w:iCs/>
-          <w:i/>
         </w:rPr>
         <w:t xml:space="preserve">Why: separates ongoing care responsibility from task ownership and identifies the access and handoff boundaries.</w:t>
       </w:r>
@@ -292,43 +299,43 @@
       </w:pPr>
       <w:r>
         <w:rPr>
+          <w:b/>
           <w:bCs/>
-          <w:b/>
         </w:rPr>
         <w:t xml:space="preserve">1.3 What creates work, and where is it managed today?</w:t>
       </w:r>
     </w:p>
     <w:p>
       <w:pPr>
+        <w:pStyle w:val="Compact"/>
         <w:numPr>
           <w:ilvl w:val="0"/>
           <w:numId w:val="1003"/>
         </w:numPr>
+      </w:pPr>
+      <w:r>
+        <w:t xml:space="preserve">Staff action, completed intake, an incoming message, an admission/discharge event, an order or result, a missed appointment, a scheduled follow-up, or a recommendation?</w:t>
+      </w:r>
+    </w:p>
+    <w:p>
+      <w:pPr>
         <w:pStyle w:val="Compact"/>
-      </w:pPr>
-      <w:r>
-        <w:t xml:space="preserve">Staff action, completed intake, an incoming message, an admission/discharge event, an order or result, a missed appointment, a scheduled follow-up, or a recommendation?</w:t>
-      </w:r>
-    </w:p>
-    <w:p>
-      <w:pPr>
         <w:numPr>
           <w:ilvl w:val="0"/>
           <w:numId w:val="1003"/>
         </w:numPr>
+      </w:pPr>
+      <w:r>
+        <w:t xml:space="preserve">Are you replacing spreadsheets, inboxes, or another task system, or coordinating work that will remain in those systems?</w:t>
+      </w:r>
+    </w:p>
+    <w:p>
+      <w:pPr>
         <w:pStyle w:val="Compact"/>
-      </w:pPr>
-      <w:r>
-        <w:t xml:space="preserve">Are you replacing spreadsheets, inboxes, or another task system, or coordinating work that will remain in those systems?</w:t>
-      </w:r>
-    </w:p>
-    <w:p>
-      <w:pPr>
         <w:numPr>
           <w:ilvl w:val="0"/>
           <w:numId w:val="1003"/>
         </w:numPr>
-        <w:pStyle w:val="Compact"/>
       </w:pPr>
       <w:r>
         <w:t xml:space="preserve">Which system owns the clinical record, the work item, and its completion status?</w:t>
@@ -340,8 +347,8 @@
       </w:pPr>
       <w:r>
         <w:rPr>
+          <w:i/>
           <w:iCs/>
-          <w:i/>
         </w:rPr>
         <w:t xml:space="preserve">Why: establishes entry points, integration needs, and which system can authoritatively change each state.</w:t>
       </w:r>
@@ -352,55 +359,55 @@
       </w:pPr>
       <w:r>
         <w:rPr>
+          <w:b/>
           <w:bCs/>
-          <w:b/>
         </w:rPr>
         <w:t xml:space="preserve">1.4 How much continuity and scale do you need?</w:t>
       </w:r>
     </w:p>
     <w:p>
       <w:pPr>
+        <w:pStyle w:val="Compact"/>
         <w:numPr>
           <w:ilvl w:val="0"/>
           <w:numId w:val="1004"/>
         </w:numPr>
+      </w:pPr>
+      <w:r>
+        <w:t xml:space="preserve">Does work end with one action or encounter, or continue across months of care?</w:t>
+      </w:r>
+    </w:p>
+    <w:p>
+      <w:pPr>
         <w:pStyle w:val="Compact"/>
-      </w:pPr>
-      <w:r>
-        <w:t xml:space="preserve">Does work end with one action or encounter, or continue across months of care?</w:t>
-      </w:r>
-    </w:p>
-    <w:p>
-      <w:pPr>
         <w:numPr>
           <w:ilvl w:val="0"/>
           <w:numId w:val="1004"/>
         </w:numPr>
+      </w:pPr>
+      <w:r>
+        <w:t xml:space="preserve">Can a patient participate in several programs or cases at once?</w:t>
+      </w:r>
+    </w:p>
+    <w:p>
+      <w:pPr>
         <w:pStyle w:val="Compact"/>
-      </w:pPr>
-      <w:r>
-        <w:t xml:space="preserve">Can a patient participate in several programs or cases at once?</w:t>
-      </w:r>
-    </w:p>
-    <w:p>
-      <w:pPr>
         <w:numPr>
           <w:ilvl w:val="0"/>
           <w:numId w:val="1004"/>
         </w:numPr>
+      </w:pPr>
+      <w:r>
+        <w:t xml:space="preserve">How many staff share a queue, how much work arrives, and are operations limited to business hours?</w:t>
+      </w:r>
+    </w:p>
+    <w:p>
+      <w:pPr>
         <w:pStyle w:val="Compact"/>
-      </w:pPr>
-      <w:r>
-        <w:t xml:space="preserve">How many staff share a queue, how much work arrives, and are operations limited to business hours?</w:t>
-      </w:r>
-    </w:p>
-    <w:p>
-      <w:pPr>
         <w:numPr>
           <w:ilvl w:val="0"/>
           <w:numId w:val="1004"/>
         </w:numPr>
-        <w:pStyle w:val="Compact"/>
       </w:pPr>
       <w:r>
         <w:t xml:space="preserve">What must improve to consider the first release successful?</w:t>
@@ -412,8 +419,8 @@
       </w:pPr>
       <w:r>
         <w:rPr>
+          <w:i/>
           <w:iCs/>
-          <w:i/>
         </w:rPr>
         <w:t xml:space="preserve">Why: determines the need for case grouping, concurrent assignment controls, escalation, and reporting.</w:t>
       </w:r>
@@ -424,43 +431,43 @@
       </w:pPr>
       <w:r>
         <w:rPr>
+          <w:b/>
           <w:bCs/>
-          <w:b/>
         </w:rPr>
         <w:t xml:space="preserve">1.5 Does a care program require consent or service-time records?</w:t>
       </w:r>
     </w:p>
     <w:p>
       <w:pPr>
+        <w:pStyle w:val="Compact"/>
         <w:numPr>
           <w:ilvl w:val="0"/>
           <w:numId w:val="1005"/>
         </w:numPr>
+      </w:pPr>
+      <w:r>
+        <w:t xml:space="preserve">What program consent must be captured, reviewed, renewed, or withdrawn before enrollment or ongoing work?</w:t>
+      </w:r>
+    </w:p>
+    <w:p>
+      <w:pPr>
         <w:pStyle w:val="Compact"/>
-      </w:pPr>
-      <w:r>
-        <w:t xml:space="preserve">What program consent must be captured, reviewed, renewed, or withdrawn before enrollment or ongoing work?</w:t>
-      </w:r>
-    </w:p>
-    <w:p>
-      <w:pPr>
         <w:numPr>
           <w:ilvl w:val="0"/>
           <w:numId w:val="1005"/>
         </w:numPr>
+      </w:pPr>
+      <w:r>
+        <w:t xml:space="preserve">Which activities require time records, and who performed them for which patient and program?</w:t>
+      </w:r>
+    </w:p>
+    <w:p>
+      <w:pPr>
         <w:pStyle w:val="Compact"/>
-      </w:pPr>
-      <w:r>
-        <w:t xml:space="preserve">Which activities require time records, and who performed them for which patient and program?</w:t>
-      </w:r>
-    </w:p>
-    <w:p>
-      <w:pPr>
         <w:numPr>
           <w:ilvl w:val="0"/>
           <w:numId w:val="1005"/>
         </w:numPr>
-        <w:pStyle w:val="Compact"/>
       </w:pPr>
       <w:r>
         <w:t xml:space="preserve">How will you record actual effort, corrections, overlapping activity, and the reporting period required by the program or payer?</w:t>
@@ -472,32 +479,32 @@
       </w:pPr>
       <w:r>
         <w:rPr>
+          <w:i/>
           <w:iCs/>
-          <w:i/>
         </w:rPr>
         <w:t xml:space="preserve">Why: identifies program-specific consent and time-recording requirements. Task execution windows alone do not establish billable effort. Choose the time-record model and any Consent representation after confirming the program’s requirements; see</w:t>
       </w:r>
       <w:r>
         <w:rPr>
+          <w:i/>
           <w:iCs/>
-          <w:i/>
         </w:rPr>
         <w:t xml:space="preserve"> </w:t>
       </w:r>
-      <w:hyperlink r:id="rId24">
+      <w:hyperlink r:id="rId13">
         <w:r>
           <w:rPr>
             <w:rStyle w:val="Hyperlink"/>
+            <w:i/>
             <w:iCs/>
-            <w:i/>
           </w:rPr>
           <w:t xml:space="preserve">Consent</w:t>
         </w:r>
       </w:hyperlink>
       <w:r>
         <w:rPr>
+          <w:i/>
           <w:iCs/>
-          <w:i/>
         </w:rPr>
         <w:t xml:space="preserve">.</w:t>
       </w:r>
@@ -509,8 +516,8 @@
         </w:pict>
       </w:r>
     </w:p>
-    <w:bookmarkEnd w:id="25"/>
-    <w:bookmarkStart w:id="26" w:name="section-2-feature-scoping"/>
+    <w:bookmarkEnd w:id="14"/>
+    <w:bookmarkStart w:id="15" w:name="section-2-feature-scoping"/>
     <w:p>
       <w:pPr>
         <w:pStyle w:val="Heading2"/>
@@ -525,8 +532,8 @@
       </w:pPr>
       <w:r>
         <w:rPr>
+          <w:i/>
           <w:iCs/>
-          <w:i/>
         </w:rPr>
         <w:t xml:space="preserve">For each feature, mark Yes / No / Nice-to-have / Not sure. The § column points to the relevant deep dive. Cover 3.1 for every implementation.</w:t>
       </w:r>
@@ -535,9 +542,8 @@
       <w:tblPr>
         <w:tblStyle w:val="Table"/>
         <w:tblW w:w="9360" w:type="dxa"/>
+        <w:tblLayout w:type="fixed"/>
         <w:tblLook w:firstRow="1" w:lastRow="0" w:firstColumn="0" w:lastColumn="0" w:noHBand="0" w:noVBand="0" w:val="0020"/>
-        <w:jc w:val="start"/>
-        <w:tblLayout w:type="fixed"/>
       </w:tblPr>
       <w:tblGrid>
         <w:gridCol w:w="600"/>
@@ -551,7 +557,7 @@
       <w:tr>
         <w:trPr>
           <w:cantSplit/>
-          <w:tblHeader w:val="true"/>
+          <w:tblHeader w:val="on"/>
         </w:trPr>
         <w:tc>
           <w:tcPr/>
@@ -1449,8 +1455,8 @@
         </w:pict>
       </w:r>
     </w:p>
-    <w:bookmarkEnd w:id="26"/>
-    <w:bookmarkStart w:id="61" w:name="section-3-feature-deep-dives"/>
+    <w:bookmarkEnd w:id="15"/>
+    <w:bookmarkStart w:id="50" w:name="section-3-feature-deep-dives"/>
     <w:p>
       <w:pPr>
         <w:pStyle w:val="Heading2"/>
@@ -1465,8 +1471,8 @@
       </w:pPr>
       <w:r>
         <w:rPr>
+          <w:i/>
           <w:iCs/>
-          <w:i/>
         </w:rPr>
         <w:t xml:space="preserve">Cover each feature selected above. Record the chosen approach and unresolved decisions for the first workflow before expanding to additional workflows.</w:t>
       </w:r>
@@ -1479,7 +1485,7 @@
         <w:t xml:space="preserve">The approaches below name recommended resources and fields. Local workflow stages, eligibility checks, and automation are application conventions that you implement; storing these resources does not execute those rules automatically.</w:t>
       </w:r>
     </w:p>
-    <w:bookmarkStart w:id="28" w:name="work-items-clinical-context"/>
+    <w:bookmarkStart w:id="17" w:name="work-items-clinical-context"/>
     <w:p>
       <w:pPr>
         <w:pStyle w:val="Heading3"/>
@@ -1498,47 +1504,47 @@
     </w:p>
     <w:p>
       <w:pPr>
+        <w:pStyle w:val="Compact"/>
         <w:numPr>
           <w:ilvl w:val="0"/>
           <w:numId w:val="1006"/>
         </w:numPr>
+      </w:pPr>
+      <w:r>
+        <w:t xml:space="preserve">What is the smallest unit of work that needs its own owner, status, and completion criteria?</w:t>
+      </w:r>
+    </w:p>
+    <w:p>
+      <w:pPr>
         <w:pStyle w:val="Compact"/>
-      </w:pPr>
-      <w:r>
-        <w:t xml:space="preserve">What is the smallest unit of work that needs its own owner, status, and completion criteria?</w:t>
-      </w:r>
-    </w:p>
-    <w:p>
-      <w:pPr>
         <w:numPr>
           <w:ilvl w:val="0"/>
           <w:numId w:val="1006"/>
         </w:numPr>
+      </w:pPr>
+      <w:r>
+        <w:t xml:space="preserve">Is each item about a patient, a particular encounter, or practice administration?</w:t>
+      </w:r>
+    </w:p>
+    <w:p>
+      <w:pPr>
         <w:pStyle w:val="Compact"/>
-      </w:pPr>
-      <w:r>
-        <w:t xml:space="preserve">Is each item about a patient, a particular encounter, or practice administration?</w:t>
-      </w:r>
-    </w:p>
-    <w:p>
-      <w:pPr>
         <w:numPr>
           <w:ilvl w:val="0"/>
           <w:numId w:val="1006"/>
         </w:numPr>
+      </w:pPr>
+      <w:r>
+        <w:t xml:space="preserve">What is being acted on: a referral, result, questionnaire, message thread, or another resource?</w:t>
+      </w:r>
+    </w:p>
+    <w:p>
+      <w:pPr>
         <w:pStyle w:val="Compact"/>
-      </w:pPr>
-      <w:r>
-        <w:t xml:space="preserve">What is being acted on: a referral, result, questionnaire, message thread, or another resource?</w:t>
-      </w:r>
-    </w:p>
-    <w:p>
-      <w:pPr>
         <w:numPr>
           <w:ilvl w:val="0"/>
           <w:numId w:val="1006"/>
         </w:numPr>
-        <w:pStyle w:val="Compact"/>
       </w:pPr>
       <w:r>
         <w:t xml:space="preserve">Does one person perform the whole activity, or do independently assigned steps need separate work items?</w:t>
@@ -1548,9 +1554,8 @@
       <w:tblPr>
         <w:tblStyle w:val="Table"/>
         <w:tblW w:w="9360" w:type="dxa"/>
+        <w:tblLayout w:type="fixed"/>
         <w:tblLook w:firstRow="1" w:lastRow="0" w:firstColumn="0" w:lastColumn="0" w:noHBand="0" w:noVBand="0" w:val="0020"/>
-        <w:jc w:val="start"/>
-        <w:tblLayout w:type="fixed"/>
       </w:tblPr>
       <w:tblGrid>
         <w:gridCol w:w="4680"/>
@@ -1559,7 +1564,7 @@
       <w:tr>
         <w:trPr>
           <w:cantSplit/>
-          <w:tblHeader w:val="true"/>
+          <w:tblHeader w:val="on"/>
         </w:trPr>
         <w:tc>
           <w:tcPr/>
@@ -1904,7 +1909,7 @@
       <w:r>
         <w:t xml:space="preserve"> </w:t>
       </w:r>
-      <w:hyperlink r:id="rId27">
+      <w:hyperlink r:id="rId16">
         <w:r>
           <w:rPr>
             <w:rStyle w:val="Hyperlink"/>
@@ -1916,8 +1921,8 @@
         <w:t xml:space="preserve">.</w:t>
       </w:r>
     </w:p>
-    <w:bookmarkEnd w:id="28"/>
-    <w:bookmarkStart w:id="31" w:name="top-of-license-care-delegation"/>
+    <w:bookmarkEnd w:id="17"/>
+    <w:bookmarkStart w:id="20" w:name="top-of-license-care-delegation"/>
     <w:p>
       <w:pPr>
         <w:pStyle w:val="Heading3"/>
@@ -1936,47 +1941,47 @@
     </w:p>
     <w:p>
       <w:pPr>
+        <w:pStyle w:val="Compact"/>
         <w:numPr>
           <w:ilvl w:val="0"/>
           <w:numId w:val="1007"/>
         </w:numPr>
+      </w:pPr>
+      <w:r>
+        <w:t xml:space="preserve">Which steps currently reach a clinician that another qualified team member could prepare or complete?</w:t>
+      </w:r>
+    </w:p>
+    <w:p>
+      <w:pPr>
         <w:pStyle w:val="Compact"/>
-      </w:pPr>
-      <w:r>
-        <w:t xml:space="preserve">Which steps currently reach a clinician that another qualified team member could prepare or complete?</w:t>
-      </w:r>
-    </w:p>
-    <w:p>
-      <w:pPr>
         <w:numPr>
           <w:ilvl w:val="0"/>
           <w:numId w:val="1007"/>
         </w:numPr>
+      </w:pPr>
+      <w:r>
+        <w:t xml:space="preserve">Which actions require clinical judgment, sign-off, supervision, or escalation?</w:t>
+      </w:r>
+    </w:p>
+    <w:p>
+      <w:pPr>
         <w:pStyle w:val="Compact"/>
-      </w:pPr>
-      <w:r>
-        <w:t xml:space="preserve">Which actions require clinical judgment, sign-off, supervision, or escalation?</w:t>
-      </w:r>
-    </w:p>
-    <w:p>
-      <w:pPr>
         <w:numPr>
           <w:ilvl w:val="0"/>
           <w:numId w:val="1007"/>
         </w:numPr>
+      </w:pPr>
+      <w:r>
+        <w:t xml:space="preserve">Do eligibility rules depend on credentials, specialty, service line, jurisdiction, or the patient’s program?</w:t>
+      </w:r>
+    </w:p>
+    <w:p>
+      <w:pPr>
         <w:pStyle w:val="Compact"/>
-      </w:pPr>
-      <w:r>
-        <w:t xml:space="preserve">Do eligibility rules depend on credentials, specialty, service line, jurisdiction, or the patient’s program?</w:t>
-      </w:r>
-    </w:p>
-    <w:p>
-      <w:pPr>
         <w:numPr>
           <w:ilvl w:val="0"/>
           <w:numId w:val="1007"/>
         </w:numPr>
-        <w:pStyle w:val="Compact"/>
       </w:pPr>
       <w:r>
         <w:t xml:space="preserve">Who maintains those rules, and what happens when no eligible person is available?</w:t>
@@ -1986,9 +1991,8 @@
       <w:tblPr>
         <w:tblStyle w:val="Table"/>
         <w:tblW w:w="9360" w:type="dxa"/>
+        <w:tblLayout w:type="fixed"/>
         <w:tblLook w:firstRow="1" w:lastRow="0" w:firstColumn="0" w:lastColumn="0" w:noHBand="0" w:noVBand="0" w:val="0020"/>
-        <w:jc w:val="start"/>
-        <w:tblLayout w:type="fixed"/>
       </w:tblPr>
       <w:tblGrid>
         <w:gridCol w:w="3979"/>
@@ -1997,7 +2001,7 @@
       <w:tr>
         <w:trPr>
           <w:cantSplit/>
-          <w:tblHeader w:val="true"/>
+          <w:tblHeader w:val="on"/>
         </w:trPr>
         <w:tc>
           <w:tcPr/>
@@ -2316,7 +2320,7 @@
       <w:r>
         <w:t xml:space="preserve"> </w:t>
       </w:r>
-      <w:hyperlink r:id="rId29">
+      <w:hyperlink r:id="rId18">
         <w:r>
           <w:rPr>
             <w:rStyle w:val="Hyperlink"/>
@@ -2330,7 +2334,7 @@
       <w:r>
         <w:t xml:space="preserve"> </w:t>
       </w:r>
-      <w:hyperlink r:id="rId30">
+      <w:hyperlink r:id="rId19">
         <w:r>
           <w:rPr>
             <w:rStyle w:val="Hyperlink"/>
@@ -2342,8 +2346,8 @@
         <w:t xml:space="preserve">; scheduling operations do not enforce licensure themselves.</w:t>
       </w:r>
     </w:p>
-    <w:bookmarkEnd w:id="31"/>
-    <w:bookmarkStart w:id="36" w:name="queues-ownership-care-teams"/>
+    <w:bookmarkEnd w:id="20"/>
+    <w:bookmarkStart w:id="25" w:name="queues-ownership-care-teams"/>
     <w:p>
       <w:pPr>
         <w:pStyle w:val="Heading3"/>
@@ -2362,71 +2366,71 @@
     </w:p>
     <w:p>
       <w:pPr>
+        <w:pStyle w:val="Compact"/>
         <w:numPr>
           <w:ilvl w:val="0"/>
           <w:numId w:val="1008"/>
         </w:numPr>
+      </w:pPr>
+      <w:r>
+        <w:t xml:space="preserve">Is work assigned directly, claimed from a shared queue, or distributed automatically?</w:t>
+      </w:r>
+    </w:p>
+    <w:p>
+      <w:pPr>
         <w:pStyle w:val="Compact"/>
-      </w:pPr>
-      <w:r>
-        <w:t xml:space="preserve">Is work assigned directly, claimed from a shared queue, or distributed automatically?</w:t>
-      </w:r>
-    </w:p>
-    <w:p>
-      <w:pPr>
         <w:numPr>
           <w:ilvl w:val="0"/>
           <w:numId w:val="1008"/>
         </w:numPr>
+      </w:pPr>
+      <w:r>
+        <w:t xml:space="preserve">Which queue dimensions matter: role, service, location, urgency, or workflow stage?</w:t>
+      </w:r>
+    </w:p>
+    <w:p>
+      <w:pPr>
         <w:pStyle w:val="Compact"/>
-      </w:pPr>
-      <w:r>
-        <w:t xml:space="preserve">Which queue dimensions matter: role, service, location, urgency, or workflow stage?</w:t>
-      </w:r>
-    </w:p>
-    <w:p>
-      <w:pPr>
         <w:numPr>
           <w:ilvl w:val="0"/>
           <w:numId w:val="1008"/>
         </w:numPr>
+      </w:pPr>
+      <w:r>
+        <w:t xml:space="preserve">Can two staff members attempt to claim the same item? Who resolves conflicts?</w:t>
+      </w:r>
+    </w:p>
+    <w:p>
+      <w:pPr>
         <w:pStyle w:val="Compact"/>
-      </w:pPr>
-      <w:r>
-        <w:t xml:space="preserve">Can two staff members attempt to claim the same item? Who resolves conflicts?</w:t>
-      </w:r>
-    </w:p>
-    <w:p>
-      <w:pPr>
         <w:numPr>
           <w:ilvl w:val="0"/>
           <w:numId w:val="1008"/>
         </w:numPr>
+      </w:pPr>
+      <w:r>
+        <w:t xml:space="preserve">Does the patient have an ongoing care team or coordinator distinct from the person handling today’s task?</w:t>
+      </w:r>
+    </w:p>
+    <w:p>
+      <w:pPr>
         <w:pStyle w:val="Compact"/>
-      </w:pPr>
-      <w:r>
-        <w:t xml:space="preserve">Does the patient have an ongoing care team or coordinator distinct from the person handling today’s task?</w:t>
-      </w:r>
-    </w:p>
-    <w:p>
-      <w:pPr>
         <w:numPr>
           <w:ilvl w:val="0"/>
           <w:numId w:val="1008"/>
         </w:numPr>
+      </w:pPr>
+      <w:r>
+        <w:t xml:space="preserve">How do absence, workload, and shift changes affect assignment?</w:t>
+      </w:r>
+    </w:p>
+    <w:p>
+      <w:pPr>
         <w:pStyle w:val="Compact"/>
-      </w:pPr>
-      <w:r>
-        <w:t xml:space="preserve">How do absence, workload, and shift changes affect assignment?</w:t>
-      </w:r>
-    </w:p>
-    <w:p>
-      <w:pPr>
         <w:numPr>
           <w:ilvl w:val="0"/>
           <w:numId w:val="1008"/>
         </w:numPr>
-        <w:pStyle w:val="Compact"/>
       </w:pPr>
       <w:r>
         <w:t xml:space="preserve">How do staff discover new or escalated work: a live queue, an outbound notification, or both? See</w:t>
@@ -2434,7 +2438,7 @@
       <w:r>
         <w:t xml:space="preserve"> </w:t>
       </w:r>
-      <w:hyperlink r:id="rId32">
+      <w:hyperlink r:id="rId21">
         <w:r>
           <w:rPr>
             <w:rStyle w:val="Hyperlink"/>
@@ -2450,9 +2454,8 @@
       <w:tblPr>
         <w:tblStyle w:val="Table"/>
         <w:tblW w:w="9360" w:type="dxa"/>
+        <w:tblLayout w:type="fixed"/>
         <w:tblLook w:firstRow="1" w:lastRow="0" w:firstColumn="0" w:lastColumn="0" w:noHBand="0" w:noVBand="0" w:val="0020"/>
-        <w:jc w:val="start"/>
-        <w:tblLayout w:type="fixed"/>
       </w:tblPr>
       <w:tblGrid>
         <w:gridCol w:w="4121"/>
@@ -2461,7 +2464,7 @@
       <w:tr>
         <w:trPr>
           <w:cantSplit/>
-          <w:tblHeader w:val="true"/>
+          <w:tblHeader w:val="on"/>
         </w:trPr>
         <w:tc>
           <w:tcPr/>
@@ -2847,7 +2850,7 @@
       <w:r>
         <w:t xml:space="preserve"> </w:t>
       </w:r>
-      <w:hyperlink r:id="rId33">
+      <w:hyperlink r:id="rId22">
         <w:r>
           <w:rPr>
             <w:rStyle w:val="Hyperlink"/>
@@ -2861,7 +2864,7 @@
       <w:r>
         <w:t xml:space="preserve"> </w:t>
       </w:r>
-      <w:hyperlink r:id="rId34">
+      <w:hyperlink r:id="rId23">
         <w:r>
           <w:rPr>
             <w:rStyle w:val="Hyperlink"/>
@@ -2875,7 +2878,7 @@
       <w:r>
         <w:t xml:space="preserve"> </w:t>
       </w:r>
-      <w:hyperlink r:id="rId35">
+      <w:hyperlink r:id="rId24">
         <w:r>
           <w:rPr>
             <w:rStyle w:val="Hyperlink"/>
@@ -2887,8 +2890,8 @@
         <w:t xml:space="preserve">.</w:t>
       </w:r>
     </w:p>
-    <w:bookmarkEnd w:id="36"/>
-    <w:bookmarkStart w:id="39" w:name="lifecycle-handoffs-deadlines"/>
+    <w:bookmarkEnd w:id="25"/>
+    <w:bookmarkStart w:id="28" w:name="lifecycle-handoffs-deadlines"/>
     <w:p>
       <w:pPr>
         <w:pStyle w:val="Heading3"/>
@@ -2907,59 +2910,59 @@
     </w:p>
     <w:p>
       <w:pPr>
+        <w:pStyle w:val="Compact"/>
         <w:numPr>
           <w:ilvl w:val="0"/>
           <w:numId w:val="1009"/>
         </w:numPr>
+      </w:pPr>
+      <w:r>
+        <w:t xml:space="preserve">Which stages do staff need to operate on, and which are useful only for reporting?</w:t>
+      </w:r>
+    </w:p>
+    <w:p>
+      <w:pPr>
         <w:pStyle w:val="Compact"/>
-      </w:pPr>
-      <w:r>
-        <w:t xml:space="preserve">Which stages do staff need to operate on, and which are useful only for reporting?</w:t>
-      </w:r>
-    </w:p>
-    <w:p>
-      <w:pPr>
         <w:numPr>
           <w:ilvl w:val="0"/>
           <w:numId w:val="1009"/>
         </w:numPr>
+      </w:pPr>
+      <w:r>
+        <w:t xml:space="preserve">What counts as ready, blocked, complete, cancelled, or entered in error?</w:t>
+      </w:r>
+    </w:p>
+    <w:p>
+      <w:pPr>
         <w:pStyle w:val="Compact"/>
-      </w:pPr>
-      <w:r>
-        <w:t xml:space="preserve">What counts as ready, blocked, complete, cancelled, or entered in error?</w:t>
-      </w:r>
-    </w:p>
-    <w:p>
-      <w:pPr>
         <w:numPr>
           <w:ilvl w:val="0"/>
           <w:numId w:val="1009"/>
         </w:numPr>
+      </w:pPr>
+      <w:r>
+        <w:t xml:space="preserve">Does handing off work require acknowledgment from the next owner?</w:t>
+      </w:r>
+    </w:p>
+    <w:p>
+      <w:pPr>
         <w:pStyle w:val="Compact"/>
-      </w:pPr>
-      <w:r>
-        <w:t xml:space="preserve">Does handing off work require acknowledgment from the next owner?</w:t>
-      </w:r>
-    </w:p>
-    <w:p>
-      <w:pPr>
         <w:numPr>
           <w:ilvl w:val="0"/>
           <w:numId w:val="1009"/>
         </w:numPr>
+      </w:pPr>
+      <w:r>
+        <w:t xml:space="preserve">Which deadlines use elapsed time versus business hours? Does waiting for a patient or outside party pause the clock?</w:t>
+      </w:r>
+    </w:p>
+    <w:p>
+      <w:pPr>
         <w:pStyle w:val="Compact"/>
-      </w:pPr>
-      <w:r>
-        <w:t xml:space="preserve">Which deadlines use elapsed time versus business hours? Does waiting for a patient or outside party pause the clock?</w:t>
-      </w:r>
-    </w:p>
-    <w:p>
-      <w:pPr>
         <w:numPr>
           <w:ilvl w:val="0"/>
           <w:numId w:val="1009"/>
         </w:numPr>
-        <w:pStyle w:val="Compact"/>
       </w:pPr>
       <w:r>
         <w:t xml:space="preserve">Who receives overdue work, and how are repeated reminders prevented?</w:t>
@@ -2969,9 +2972,8 @@
       <w:tblPr>
         <w:tblStyle w:val="Table"/>
         <w:tblW w:w="9360" w:type="dxa"/>
+        <w:tblLayout w:type="fixed"/>
         <w:tblLook w:firstRow="1" w:lastRow="0" w:firstColumn="0" w:lastColumn="0" w:noHBand="0" w:noVBand="0" w:val="0020"/>
-        <w:jc w:val="start"/>
-        <w:tblLayout w:type="fixed"/>
       </w:tblPr>
       <w:tblGrid>
         <w:gridCol w:w="4317"/>
@@ -2980,7 +2982,7 @@
       <w:tr>
         <w:trPr>
           <w:cantSplit/>
-          <w:tblHeader w:val="true"/>
+          <w:tblHeader w:val="on"/>
         </w:trPr>
         <w:tc>
           <w:tcPr/>
@@ -3244,7 +3246,7 @@
             <w:r>
               <w:t xml:space="preserve"> </w:t>
             </w:r>
-            <w:hyperlink r:id="rId37">
+            <w:hyperlink r:id="rId26">
               <w:r>
                 <w:rPr>
                   <w:rStyle w:val="Hyperlink"/>
@@ -3317,7 +3319,7 @@
             <w:r>
               <w:t xml:space="preserve"> </w:t>
             </w:r>
-            <w:hyperlink r:id="rId38">
+            <w:hyperlink r:id="rId27">
               <w:r>
                 <w:rPr>
                   <w:rStyle w:val="Hyperlink"/>
@@ -3404,7 +3406,7 @@
       <w:r>
         <w:t xml:space="preserve"> </w:t>
       </w:r>
-      <w:hyperlink r:id="rId27">
+      <w:hyperlink r:id="rId16">
         <w:r>
           <w:rPr>
             <w:rStyle w:val="Hyperlink"/>
@@ -3419,8 +3421,8 @@
         <w:t xml:space="preserve">for status and timing fields. Queue ordering, deadline calculations, and escalation require application or Bot logic.</w:t>
       </w:r>
     </w:p>
-    <w:bookmarkEnd w:id="39"/>
-    <w:bookmarkStart w:id="41" w:name="longitudinal-patient-case-tracking"/>
+    <w:bookmarkEnd w:id="28"/>
+    <w:bookmarkStart w:id="30" w:name="longitudinal-patient-case-tracking"/>
     <w:p>
       <w:pPr>
         <w:pStyle w:val="Heading3"/>
@@ -3439,59 +3441,59 @@
     </w:p>
     <w:p>
       <w:pPr>
+        <w:pStyle w:val="Compact"/>
         <w:numPr>
           <w:ilvl w:val="0"/>
           <w:numId w:val="1010"/>
         </w:numPr>
+      </w:pPr>
+      <w:r>
+        <w:t xml:space="preserve">What defines a case: a condition, a treatment course, a service program, or a period of responsibility?</w:t>
+      </w:r>
+    </w:p>
+    <w:p>
+      <w:pPr>
         <w:pStyle w:val="Compact"/>
-      </w:pPr>
-      <w:r>
-        <w:t xml:space="preserve">What defines a case: a condition, a treatment course, a service program, or a period of responsibility?</w:t>
-      </w:r>
-    </w:p>
-    <w:p>
-      <w:pPr>
         <w:numPr>
           <w:ilvl w:val="0"/>
           <w:numId w:val="1010"/>
         </w:numPr>
+      </w:pPr>
+      <w:r>
+        <w:t xml:space="preserve">What starts, pauses, transfers, and ends that case?</w:t>
+      </w:r>
+    </w:p>
+    <w:p>
+      <w:pPr>
         <w:pStyle w:val="Compact"/>
-      </w:pPr>
-      <w:r>
-        <w:t xml:space="preserve">What starts, pauses, transfers, and ends that case?</w:t>
-      </w:r>
-    </w:p>
-    <w:p>
-      <w:pPr>
         <w:numPr>
           <w:ilvl w:val="0"/>
           <w:numId w:val="1010"/>
         </w:numPr>
+      </w:pPr>
+      <w:r>
+        <w:t xml:space="preserve">Can a patient have concurrent cases, including more than one addressing the same condition?</w:t>
+      </w:r>
+    </w:p>
+    <w:p>
+      <w:pPr>
         <w:pStyle w:val="Compact"/>
-      </w:pPr>
-      <w:r>
-        <w:t xml:space="preserve">Can a patient have concurrent cases, including more than one addressing the same condition?</w:t>
-      </w:r>
-    </w:p>
-    <w:p>
-      <w:pPr>
         <w:numPr>
           <w:ilvl w:val="0"/>
           <w:numId w:val="1010"/>
         </w:numPr>
+      </w:pPr>
+      <w:r>
+        <w:t xml:space="preserve">Can one encounter contribute to multiple cases?</w:t>
+      </w:r>
+    </w:p>
+    <w:p>
+      <w:pPr>
         <w:pStyle w:val="Compact"/>
-      </w:pPr>
-      <w:r>
-        <w:t xml:space="preserve">Can one encounter contribute to multiple cases?</w:t>
-      </w:r>
-    </w:p>
-    <w:p>
-      <w:pPr>
         <w:numPr>
           <w:ilvl w:val="0"/>
           <w:numId w:val="1010"/>
         </w:numPr>
-        <w:pStyle w:val="Compact"/>
       </w:pPr>
       <w:r>
         <w:t xml:space="preserve">Which organization, coordinator, or care team is responsible over time?</w:t>
@@ -3501,9 +3503,8 @@
       <w:tblPr>
         <w:tblStyle w:val="Table"/>
         <w:tblW w:w="9360" w:type="dxa"/>
+        <w:tblLayout w:type="fixed"/>
         <w:tblLook w:firstRow="1" w:lastRow="0" w:firstColumn="0" w:lastColumn="0" w:noHBand="0" w:noVBand="0" w:val="0020"/>
-        <w:jc w:val="start"/>
-        <w:tblLayout w:type="fixed"/>
       </w:tblPr>
       <w:tblGrid>
         <w:gridCol w:w="4012"/>
@@ -3512,7 +3513,7 @@
       <w:tr>
         <w:trPr>
           <w:cantSplit/>
-          <w:tblHeader w:val="true"/>
+          <w:tblHeader w:val="on"/>
         </w:trPr>
         <w:tc>
           <w:tcPr/>
@@ -3869,7 +3870,7 @@
       <w:r>
         <w:t xml:space="preserve"> </w:t>
       </w:r>
-      <w:hyperlink r:id="rId40">
+      <w:hyperlink r:id="rId29">
         <w:r>
           <w:rPr>
             <w:rStyle w:val="Hyperlink"/>
@@ -3881,8 +3882,8 @@
         <w:t xml:space="preserve">.</w:t>
       </w:r>
     </w:p>
-    <w:bookmarkEnd w:id="41"/>
-    <w:bookmarkStart w:id="44" w:name="care-plans-goals-progress"/>
+    <w:bookmarkEnd w:id="30"/>
+    <w:bookmarkStart w:id="33" w:name="care-plans-goals-progress"/>
     <w:p>
       <w:pPr>
         <w:pStyle w:val="Heading3"/>
@@ -3901,59 +3902,59 @@
     </w:p>
     <w:p>
       <w:pPr>
+        <w:pStyle w:val="Compact"/>
         <w:numPr>
           <w:ilvl w:val="0"/>
           <w:numId w:val="1011"/>
         </w:numPr>
+      </w:pPr>
+      <w:r>
+        <w:t xml:space="preserve">Do staff need to see agreed goals and planned activities together for a patient?</w:t>
+      </w:r>
+    </w:p>
+    <w:p>
+      <w:pPr>
         <w:pStyle w:val="Compact"/>
-      </w:pPr>
-      <w:r>
-        <w:t xml:space="preserve">Do staff need to see agreed goals and planned activities together for a patient?</w:t>
-      </w:r>
-    </w:p>
-    <w:p>
-      <w:pPr>
         <w:numPr>
           <w:ilvl w:val="0"/>
           <w:numId w:val="1011"/>
         </w:numPr>
+      </w:pPr>
+      <w:r>
+        <w:t xml:space="preserve">Who authors, approves, reviews, and changes the plan? Does the patient participate?</w:t>
+      </w:r>
+    </w:p>
+    <w:p>
+      <w:pPr>
         <w:pStyle w:val="Compact"/>
-      </w:pPr>
-      <w:r>
-        <w:t xml:space="preserve">Who authors, approves, reviews, and changes the plan? Does the patient participate?</w:t>
-      </w:r>
-    </w:p>
-    <w:p>
-      <w:pPr>
         <w:numPr>
           <w:ilvl w:val="0"/>
           <w:numId w:val="1011"/>
         </w:numPr>
+      </w:pPr>
+      <w:r>
+        <w:t xml:space="preserve">How is goal progress assessed, and which observations or assessments support it?</w:t>
+      </w:r>
+    </w:p>
+    <w:p>
+      <w:pPr>
         <w:pStyle w:val="Compact"/>
-      </w:pPr>
-      <w:r>
-        <w:t xml:space="preserve">How is goal progress assessed, and which observations or assessments support it?</w:t>
-      </w:r>
-    </w:p>
-    <w:p>
-      <w:pPr>
         <w:numPr>
           <w:ilvl w:val="0"/>
           <w:numId w:val="1011"/>
         </w:numPr>
+      </w:pPr>
+      <w:r>
+        <w:t xml:space="preserve">When a plan changes, what happens to already assigned work?</w:t>
+      </w:r>
+    </w:p>
+    <w:p>
+      <w:pPr>
         <w:pStyle w:val="Compact"/>
-      </w:pPr>
-      <w:r>
-        <w:t xml:space="preserve">When a plan changes, what happens to already assigned work?</w:t>
-      </w:r>
-    </w:p>
-    <w:p>
-      <w:pPr>
         <w:numPr>
           <w:ilvl w:val="0"/>
           <w:numId w:val="1011"/>
         </w:numPr>
-        <w:pStyle w:val="Compact"/>
       </w:pPr>
       <w:r>
         <w:t xml:space="preserve">What closes the plan, and can individual goals or activities finish at different times?</w:t>
@@ -3963,9 +3964,8 @@
       <w:tblPr>
         <w:tblStyle w:val="Table"/>
         <w:tblW w:w="9360" w:type="dxa"/>
+        <w:tblLayout w:type="fixed"/>
         <w:tblLook w:firstRow="1" w:lastRow="0" w:firstColumn="0" w:lastColumn="0" w:noHBand="0" w:noVBand="0" w:val="0020"/>
-        <w:jc w:val="start"/>
-        <w:tblLayout w:type="fixed"/>
       </w:tblPr>
       <w:tblGrid>
         <w:gridCol w:w="4255"/>
@@ -3974,7 +3974,7 @@
       <w:tr>
         <w:trPr>
           <w:cantSplit/>
-          <w:tblHeader w:val="true"/>
+          <w:tblHeader w:val="on"/>
         </w:trPr>
         <w:tc>
           <w:tcPr/>
@@ -4332,7 +4332,7 @@
       <w:r>
         <w:t xml:space="preserve"> </w:t>
       </w:r>
-      <w:hyperlink r:id="rId42">
+      <w:hyperlink r:id="rId31">
         <w:r>
           <w:rPr>
             <w:rStyle w:val="Hyperlink"/>
@@ -4349,7 +4349,7 @@
       <w:r>
         <w:t xml:space="preserve"> </w:t>
       </w:r>
-      <w:hyperlink r:id="rId43">
+      <w:hyperlink r:id="rId32">
         <w:r>
           <w:rPr>
             <w:rStyle w:val="Hyperlink"/>
@@ -4364,8 +4364,8 @@
         <w:t xml:space="preserve">for the distinction between a patient’s plan and a reusable protocol.</w:t>
       </w:r>
     </w:p>
-    <w:bookmarkEnd w:id="44"/>
-    <w:bookmarkStart w:id="49" w:name="protocols-recurring-work-automation"/>
+    <w:bookmarkEnd w:id="33"/>
+    <w:bookmarkStart w:id="38" w:name="protocols-recurring-work-automation"/>
     <w:p>
       <w:pPr>
         <w:pStyle w:val="Heading3"/>
@@ -4384,59 +4384,59 @@
     </w:p>
     <w:p>
       <w:pPr>
+        <w:pStyle w:val="Compact"/>
         <w:numPr>
           <w:ilvl w:val="0"/>
           <w:numId w:val="1012"/>
         </w:numPr>
+      </w:pPr>
+      <w:r>
+        <w:t xml:space="preserve">Is work created manually, from events, on a schedule, or from a reusable protocol?</w:t>
+      </w:r>
+    </w:p>
+    <w:p>
+      <w:pPr>
         <w:pStyle w:val="Compact"/>
-      </w:pPr>
-      <w:r>
-        <w:t xml:space="preserve">Is work created manually, from events, on a schedule, or from a reusable protocol?</w:t>
-      </w:r>
-    </w:p>
-    <w:p>
-      <w:pPr>
         <w:numPr>
           <w:ilvl w:val="0"/>
           <w:numId w:val="1012"/>
         </w:numPr>
+      </w:pPr>
+      <w:r>
+        <w:t xml:space="preserve">Which steps repeat for every patient, and which depend on prior outcomes?</w:t>
+      </w:r>
+    </w:p>
+    <w:p>
+      <w:pPr>
         <w:pStyle w:val="Compact"/>
-      </w:pPr>
-      <w:r>
-        <w:t xml:space="preserve">Which steps repeat for every patient, and which depend on prior outcomes?</w:t>
-      </w:r>
-    </w:p>
-    <w:p>
-      <w:pPr>
         <w:numPr>
           <w:ilvl w:val="0"/>
           <w:numId w:val="1012"/>
         </w:numPr>
+      </w:pPr>
+      <w:r>
+        <w:t xml:space="preserve">Are there dependencies, delays, repeated attempts, or stop conditions?</w:t>
+      </w:r>
+    </w:p>
+    <w:p>
+      <w:pPr>
         <w:pStyle w:val="Compact"/>
-      </w:pPr>
-      <w:r>
-        <w:t xml:space="preserve">Are there dependencies, delays, repeated attempts, or stop conditions?</w:t>
-      </w:r>
-    </w:p>
-    <w:p>
-      <w:pPr>
         <w:numPr>
           <w:ilvl w:val="0"/>
           <w:numId w:val="1012"/>
         </w:numPr>
+      </w:pPr>
+      <w:r>
+        <w:t xml:space="preserve">When a protocol changes, do existing patients continue their current version or migrate?</w:t>
+      </w:r>
+    </w:p>
+    <w:p>
+      <w:pPr>
         <w:pStyle w:val="Compact"/>
-      </w:pPr>
-      <w:r>
-        <w:t xml:space="preserve">When a protocol changes, do existing patients continue their current version or migrate?</w:t>
-      </w:r>
-    </w:p>
-    <w:p>
-      <w:pPr>
         <w:numPr>
           <w:ilvl w:val="0"/>
           <w:numId w:val="1012"/>
         </w:numPr>
-        <w:pStyle w:val="Compact"/>
       </w:pPr>
       <w:r>
         <w:t xml:space="preserve">How are failed runs, duplicate events, and missed follow-ups detected and recovered?</w:t>
@@ -4446,9 +4446,8 @@
       <w:tblPr>
         <w:tblStyle w:val="Table"/>
         <w:tblW w:w="9360" w:type="dxa"/>
+        <w:tblLayout w:type="fixed"/>
         <w:tblLook w:firstRow="1" w:lastRow="0" w:firstColumn="0" w:lastColumn="0" w:noHBand="0" w:noVBand="0" w:val="0020"/>
-        <w:jc w:val="start"/>
-        <w:tblLayout w:type="fixed"/>
       </w:tblPr>
       <w:tblGrid>
         <w:gridCol w:w="4318"/>
@@ -4457,7 +4456,7 @@
       <w:tr>
         <w:trPr>
           <w:cantSplit/>
-          <w:tblHeader w:val="true"/>
+          <w:tblHeader w:val="on"/>
         </w:trPr>
         <w:tc>
           <w:tcPr/>
@@ -4620,7 +4619,7 @@
             <w:r>
               <w:t xml:space="preserve"> </w:t>
             </w:r>
-            <w:hyperlink r:id="rId45">
+            <w:hyperlink r:id="rId34">
               <w:r>
                 <w:rPr>
                   <w:rStyle w:val="VerbatimChar"/>
@@ -4800,7 +4799,7 @@
       <w:r>
         <w:t xml:space="preserve"> </w:t>
       </w:r>
-      <w:hyperlink r:id="rId43">
+      <w:hyperlink r:id="rId32">
         <w:r>
           <w:rPr>
             <w:rStyle w:val="Hyperlink"/>
@@ -4814,7 +4813,7 @@
       <w:r>
         <w:t xml:space="preserve"> </w:t>
       </w:r>
-      <w:hyperlink r:id="rId46">
+      <w:hyperlink r:id="rId35">
         <w:r>
           <w:rPr>
             <w:rStyle w:val="Hyperlink"/>
@@ -4828,7 +4827,7 @@
       <w:r>
         <w:t xml:space="preserve"> </w:t>
       </w:r>
-      <w:hyperlink r:id="rId47">
+      <w:hyperlink r:id="rId36">
         <w:r>
           <w:rPr>
             <w:rStyle w:val="Hyperlink"/>
@@ -4842,7 +4841,7 @@
       <w:r>
         <w:t xml:space="preserve"> </w:t>
       </w:r>
-      <w:hyperlink r:id="rId48">
+      <w:hyperlink r:id="rId37">
         <w:r>
           <w:rPr>
             <w:rStyle w:val="Hyperlink"/>
@@ -4854,8 +4853,8 @@
         <w:t xml:space="preserve">.</w:t>
       </w:r>
     </w:p>
-    <w:bookmarkEnd w:id="49"/>
-    <w:bookmarkStart w:id="53" w:name="clinical-decision-support-follow-through"/>
+    <w:bookmarkEnd w:id="38"/>
+    <w:bookmarkStart w:id="42" w:name="clinical-decision-support-follow-through"/>
     <w:p>
       <w:pPr>
         <w:pStyle w:val="Heading3"/>
@@ -4874,59 +4873,59 @@
     </w:p>
     <w:p>
       <w:pPr>
+        <w:pStyle w:val="Compact"/>
         <w:numPr>
           <w:ilvl w:val="0"/>
           <w:numId w:val="1013"/>
         </w:numPr>
+      </w:pPr>
+      <w:r>
+        <w:t xml:space="preserve">Do clinicians need contextual reference material, rules-based recommendations, or predictive outputs?</w:t>
+      </w:r>
+    </w:p>
+    <w:p>
+      <w:pPr>
         <w:pStyle w:val="Compact"/>
-      </w:pPr>
-      <w:r>
-        <w:t xml:space="preserve">Do clinicians need contextual reference material, rules-based recommendations, or predictive outputs?</w:t>
-      </w:r>
-    </w:p>
-    <w:p>
-      <w:pPr>
         <w:numPr>
           <w:ilvl w:val="0"/>
           <w:numId w:val="1013"/>
         </w:numPr>
+      </w:pPr>
+      <w:r>
+        <w:t xml:space="preserve">When should guidance appear: chart review, order entry, assessment review, or background monitoring?</w:t>
+      </w:r>
+    </w:p>
+    <w:p>
+      <w:pPr>
         <w:pStyle w:val="Compact"/>
-      </w:pPr>
-      <w:r>
-        <w:t xml:space="preserve">When should guidance appear: chart review, order entry, assessment review, or background monitoring?</w:t>
-      </w:r>
-    </w:p>
-    <w:p>
-      <w:pPr>
         <w:numPr>
           <w:ilvl w:val="0"/>
           <w:numId w:val="1013"/>
         </w:numPr>
+      </w:pPr>
+      <w:r>
+        <w:t xml:space="preserve">Is the output informational, does it require acknowledgment, or should accepted recommendations create work?</w:t>
+      </w:r>
+    </w:p>
+    <w:p>
+      <w:pPr>
         <w:pStyle w:val="Compact"/>
-      </w:pPr>
-      <w:r>
-        <w:t xml:space="preserve">Is the output informational, does it require acknowledgment, or should accepted recommendations create work?</w:t>
-      </w:r>
-    </w:p>
-    <w:p>
-      <w:pPr>
         <w:numPr>
           <w:ilvl w:val="0"/>
           <w:numId w:val="1013"/>
         </w:numPr>
+      </w:pPr>
+      <w:r>
+        <w:t xml:space="preserve">Who can accept, dismiss, or override a recommendation, and what reason or evidence should be recorded?</w:t>
+      </w:r>
+    </w:p>
+    <w:p>
+      <w:pPr>
         <w:pStyle w:val="Compact"/>
-      </w:pPr>
-      <w:r>
-        <w:t xml:space="preserve">Who can accept, dismiss, or override a recommendation, and what reason or evidence should be recorded?</w:t>
-      </w:r>
-    </w:p>
-    <w:p>
-      <w:pPr>
         <w:numPr>
           <w:ilvl w:val="0"/>
           <w:numId w:val="1013"/>
         </w:numPr>
-        <w:pStyle w:val="Compact"/>
       </w:pPr>
       <w:r>
         <w:t xml:space="preserve">Who maintains the knowledge or model, and how will you evaluate usefulness, missed follow-up, and excessive alerts?</w:t>
@@ -4936,9 +4935,8 @@
       <w:tblPr>
         <w:tblStyle w:val="Table"/>
         <w:tblW w:w="9360" w:type="dxa"/>
+        <w:tblLayout w:type="fixed"/>
         <w:tblLook w:firstRow="1" w:lastRow="0" w:firstColumn="0" w:lastColumn="0" w:noHBand="0" w:noVBand="0" w:val="0020"/>
-        <w:jc w:val="start"/>
-        <w:tblLayout w:type="fixed"/>
       </w:tblPr>
       <w:tblGrid>
         <w:gridCol w:w="4680"/>
@@ -4947,7 +4945,7 @@
       <w:tr>
         <w:trPr>
           <w:cantSplit/>
-          <w:tblHeader w:val="true"/>
+          <w:tblHeader w:val="on"/>
         </w:trPr>
         <w:tc>
           <w:tcPr/>
@@ -5236,7 +5234,7 @@
       <w:r>
         <w:t xml:space="preserve"> </w:t>
       </w:r>
-      <w:hyperlink r:id="rId50">
+      <w:hyperlink r:id="rId39">
         <w:r>
           <w:rPr>
             <w:rStyle w:val="Hyperlink"/>
@@ -5253,7 +5251,7 @@
       <w:r>
         <w:t xml:space="preserve"> </w:t>
       </w:r>
-      <w:hyperlink r:id="rId51">
+      <w:hyperlink r:id="rId40">
         <w:r>
           <w:rPr>
             <w:rStyle w:val="Hyperlink"/>
@@ -5278,7 +5276,7 @@
       <w:r>
         <w:t xml:space="preserve"> </w:t>
       </w:r>
-      <w:hyperlink r:id="rId52">
+      <w:hyperlink r:id="rId41">
         <w:r>
           <w:rPr>
             <w:rStyle w:val="Hyperlink"/>
@@ -5290,8 +5288,8 @@
         <w:t xml:space="preserve">.</w:t>
       </w:r>
     </w:p>
-    <w:bookmarkEnd w:id="53"/>
-    <w:bookmarkStart w:id="59" w:name="participation-access-external-handoffs"/>
+    <w:bookmarkEnd w:id="42"/>
+    <w:bookmarkStart w:id="48" w:name="participation-access-external-handoffs"/>
     <w:p>
       <w:pPr>
         <w:pStyle w:val="Heading3"/>
@@ -5310,59 +5308,59 @@
     </w:p>
     <w:p>
       <w:pPr>
+        <w:pStyle w:val="Compact"/>
         <w:numPr>
           <w:ilvl w:val="0"/>
           <w:numId w:val="1014"/>
         </w:numPr>
+      </w:pPr>
+      <w:r>
+        <w:t xml:space="preserve">Do patients or caregivers perform assigned actions, see progress, or only receive updates?</w:t>
+      </w:r>
+    </w:p>
+    <w:p>
+      <w:pPr>
         <w:pStyle w:val="Compact"/>
-      </w:pPr>
-      <w:r>
-        <w:t xml:space="preserve">Do patients or caregivers perform assigned actions, see progress, or only receive updates?</w:t>
-      </w:r>
-    </w:p>
-    <w:p>
-      <w:pPr>
         <w:numPr>
           <w:ilvl w:val="0"/>
           <w:numId w:val="1014"/>
         </w:numPr>
+      </w:pPr>
+      <w:r>
+        <w:t xml:space="preserve">Which notes and documents are internal, patient-visible, or intended for an external recipient?</w:t>
+      </w:r>
+    </w:p>
+    <w:p>
+      <w:pPr>
         <w:pStyle w:val="Compact"/>
-      </w:pPr>
-      <w:r>
-        <w:t xml:space="preserve">Which notes and documents are internal, patient-visible, or intended for an external recipient?</w:t>
-      </w:r>
-    </w:p>
-    <w:p>
-      <w:pPr>
         <w:numPr>
           <w:ilvl w:val="0"/>
           <w:numId w:val="1014"/>
         </w:numPr>
+      </w:pPr>
+      <w:r>
+        <w:t xml:space="preserve">After reassignment or discharge, who retains access to the record?</w:t>
+      </w:r>
+    </w:p>
+    <w:p>
+      <w:pPr>
         <w:pStyle w:val="Compact"/>
-      </w:pPr>
-      <w:r>
-        <w:t xml:space="preserve">After reassignment or discharge, who retains access to the record?</w:t>
-      </w:r>
-    </w:p>
-    <w:p>
-      <w:pPr>
         <w:numPr>
           <w:ilvl w:val="0"/>
           <w:numId w:val="1014"/>
         </w:numPr>
+      </w:pPr>
+      <w:r>
+        <w:t xml:space="preserve">Do external partners update shared records, exchange structured data, or return documents and messages?</w:t>
+      </w:r>
+    </w:p>
+    <w:p>
+      <w:pPr>
         <w:pStyle w:val="Compact"/>
-      </w:pPr>
-      <w:r>
-        <w:t xml:space="preserve">Do external partners update shared records, exchange structured data, or return documents and messages?</w:t>
-      </w:r>
-    </w:p>
-    <w:p>
-      <w:pPr>
         <w:numPr>
           <w:ilvl w:val="0"/>
           <w:numId w:val="1014"/>
         </w:numPr>
-        <w:pStyle w:val="Compact"/>
       </w:pPr>
       <w:r>
         <w:t xml:space="preserve">How are replies matched to the original request, and who handles unmatched responses?</w:t>
@@ -5372,9 +5370,8 @@
       <w:tblPr>
         <w:tblStyle w:val="Table"/>
         <w:tblW w:w="9360" w:type="dxa"/>
+        <w:tblLayout w:type="fixed"/>
         <w:tblLook w:firstRow="1" w:lastRow="0" w:firstColumn="0" w:lastColumn="0" w:noHBand="0" w:noVBand="0" w:val="0020"/>
-        <w:jc w:val="start"/>
-        <w:tblLayout w:type="fixed"/>
       </w:tblPr>
       <w:tblGrid>
         <w:gridCol w:w="4356"/>
@@ -5383,7 +5380,7 @@
       <w:tr>
         <w:trPr>
           <w:cantSplit/>
-          <w:tblHeader w:val="true"/>
+          <w:tblHeader w:val="on"/>
         </w:trPr>
         <w:tc>
           <w:tcPr/>
@@ -5469,7 +5466,7 @@
             <w:r>
               <w:t xml:space="preserve"> </w:t>
             </w:r>
-            <w:hyperlink r:id="rId54">
+            <w:hyperlink r:id="rId43">
               <w:r>
                 <w:rPr>
                   <w:rStyle w:val="Hyperlink"/>
@@ -5781,7 +5778,7 @@
             <w:r>
               <w:t xml:space="preserve"> </w:t>
             </w:r>
-            <w:hyperlink r:id="rId55">
+            <w:hyperlink r:id="rId44">
               <w:r>
                 <w:rPr>
                   <w:rStyle w:val="Hyperlink"/>
@@ -5809,7 +5806,7 @@
       <w:r>
         <w:t xml:space="preserve"> </w:t>
       </w:r>
-      <w:hyperlink r:id="rId56">
+      <w:hyperlink r:id="rId45">
         <w:r>
           <w:rPr>
             <w:rStyle w:val="Hyperlink"/>
@@ -5823,7 +5820,7 @@
       <w:r>
         <w:t xml:space="preserve"> </w:t>
       </w:r>
-      <w:hyperlink r:id="rId57">
+      <w:hyperlink r:id="rId46">
         <w:r>
           <w:rPr>
             <w:rStyle w:val="Hyperlink"/>
@@ -5837,7 +5834,7 @@
       <w:r>
         <w:t xml:space="preserve"> </w:t>
       </w:r>
-      <w:hyperlink r:id="rId58">
+      <w:hyperlink r:id="rId47">
         <w:r>
           <w:rPr>
             <w:rStyle w:val="Hyperlink"/>
@@ -5852,8 +5849,8 @@
         <w:t xml:space="preserve">docs for the detailed designs. Scheduling and billing decisions should likewise link to their respective workflow documentation.</w:t>
       </w:r>
     </w:p>
-    <w:bookmarkEnd w:id="59"/>
-    <w:bookmarkStart w:id="60" w:name="operational-reporting-closure"/>
+    <w:bookmarkEnd w:id="48"/>
+    <w:bookmarkStart w:id="49" w:name="operational-reporting-closure"/>
     <w:p>
       <w:pPr>
         <w:pStyle w:val="Heading3"/>
@@ -5872,47 +5869,47 @@
     </w:p>
     <w:p>
       <w:pPr>
+        <w:pStyle w:val="Compact"/>
         <w:numPr>
           <w:ilvl w:val="0"/>
           <w:numId w:val="1015"/>
         </w:numPr>
+      </w:pPr>
+      <w:r>
+        <w:t xml:space="preserve">Which daily views do staff need: unassigned work, due work, blocked items, workload by team, or patients needing follow-up?</w:t>
+      </w:r>
+    </w:p>
+    <w:p>
+      <w:pPr>
         <w:pStyle w:val="Compact"/>
-      </w:pPr>
-      <w:r>
-        <w:t xml:space="preserve">Which daily views do staff need: unassigned work, due work, blocked items, workload by team, or patients needing follow-up?</w:t>
-      </w:r>
-    </w:p>
-    <w:p>
-      <w:pPr>
         <w:numPr>
           <w:ilvl w:val="0"/>
           <w:numId w:val="1015"/>
         </w:numPr>
+      </w:pPr>
+      <w:r>
+        <w:t xml:space="preserve">Which measures demonstrate improvement: turnaround time, fewer handoffs, appropriate delegation, successful follow-up, or goal progress?</w:t>
+      </w:r>
+    </w:p>
+    <w:p>
+      <w:pPr>
         <w:pStyle w:val="Compact"/>
-      </w:pPr>
-      <w:r>
-        <w:t xml:space="preserve">Which measures demonstrate improvement: turnaround time, fewer handoffs, appropriate delegation, successful follow-up, or goal progress?</w:t>
-      </w:r>
-    </w:p>
-    <w:p>
-      <w:pPr>
         <w:numPr>
           <w:ilvl w:val="0"/>
           <w:numId w:val="1015"/>
         </w:numPr>
+      </w:pPr>
+      <w:r>
+        <w:t xml:space="preserve">What timestamps and event history support those measures, including reopened work and paused clocks?</w:t>
+      </w:r>
+    </w:p>
+    <w:p>
+      <w:pPr>
         <w:pStyle w:val="Compact"/>
-      </w:pPr>
-      <w:r>
-        <w:t xml:space="preserve">What timestamps and event history support those measures, including reopened work and paused clocks?</w:t>
-      </w:r>
-    </w:p>
-    <w:p>
-      <w:pPr>
         <w:numPr>
           <w:ilvl w:val="0"/>
           <w:numId w:val="1015"/>
         </w:numPr>
-        <w:pStyle w:val="Compact"/>
       </w:pPr>
       <w:r>
         <w:t xml:space="preserve">Does completing a Task also complete an activity, referral, plan, or case? Under what conditions?</w:t>
@@ -5922,9 +5919,8 @@
       <w:tblPr>
         <w:tblStyle w:val="Table"/>
         <w:tblW w:w="9360" w:type="dxa"/>
+        <w:tblLayout w:type="fixed"/>
         <w:tblLook w:firstRow="1" w:lastRow="0" w:firstColumn="0" w:lastColumn="0" w:noHBand="0" w:noVBand="0" w:val="0020"/>
-        <w:jc w:val="start"/>
-        <w:tblLayout w:type="fixed"/>
       </w:tblPr>
       <w:tblGrid>
         <w:gridCol w:w="4452"/>
@@ -5933,7 +5929,7 @@
       <w:tr>
         <w:trPr>
           <w:cantSplit/>
-          <w:tblHeader w:val="true"/>
+          <w:tblHeader w:val="on"/>
         </w:trPr>
         <w:tc>
           <w:tcPr/>
@@ -6212,9 +6208,9 @@
         </w:tc>
       </w:tr>
     </w:tbl>
-    <w:bookmarkEnd w:id="60"/>
-    <w:bookmarkEnd w:id="61"/>
-    <w:bookmarkStart w:id="62" w:name="X4c59cba664d03f8dc0701cf52eb20c40b875665"/>
+    <w:bookmarkEnd w:id="49"/>
+    <w:bookmarkEnd w:id="50"/>
+    <w:bookmarkStart w:id="51" w:name="X4c59cba664d03f8dc0701cf52eb20c40b875665"/>
     <w:p>
       <w:pPr>
         <w:pStyle w:val="Heading2"/>
@@ -6225,78 +6221,78 @@
     </w:p>
     <w:p>
       <w:pPr>
+        <w:pStyle w:val="Compact"/>
         <w:numPr>
           <w:ilvl w:val="0"/>
           <w:numId w:val="1016"/>
         </w:numPr>
+      </w:pPr>
+      <w:r>
+        <w:t xml:space="preserve">The first workflow, its entry event, and its source of truth</w:t>
+      </w:r>
+    </w:p>
+    <w:p>
+      <w:pPr>
         <w:pStyle w:val="Compact"/>
-      </w:pPr>
-      <w:r>
-        <w:t xml:space="preserve">The first workflow, its entry event, and its source of truth</w:t>
-      </w:r>
-    </w:p>
-    <w:p>
-      <w:pPr>
         <w:numPr>
           <w:ilvl w:val="0"/>
           <w:numId w:val="1016"/>
         </w:numPr>
+      </w:pPr>
+      <w:r>
+        <w:t xml:space="preserve">Work items, clinical context, and any longitudinal case or care-plan model</w:t>
+      </w:r>
+    </w:p>
+    <w:p>
+      <w:pPr>
         <w:pStyle w:val="Compact"/>
-      </w:pPr>
-      <w:r>
-        <w:t xml:space="preserve">Work items, clinical context, and any longitudinal case or care-plan model</w:t>
-      </w:r>
-    </w:p>
-    <w:p>
-      <w:pPr>
         <w:numPr>
           <w:ilvl w:val="0"/>
           <w:numId w:val="1016"/>
         </w:numPr>
+      </w:pPr>
+      <w:r>
+        <w:t xml:space="preserve">Eligible roles, accountable owners, review steps, and exception handling</w:t>
+      </w:r>
+    </w:p>
+    <w:p>
+      <w:pPr>
         <w:pStyle w:val="Compact"/>
-      </w:pPr>
-      <w:r>
-        <w:t xml:space="preserve">Eligible roles, accountable owners, review steps, and exception handling</w:t>
-      </w:r>
-    </w:p>
-    <w:p>
-      <w:pPr>
         <w:numPr>
           <w:ilvl w:val="0"/>
           <w:numId w:val="1016"/>
         </w:numPr>
+      </w:pPr>
+      <w:r>
+        <w:t xml:space="preserve">Lifecycle stages, completion evidence, deadlines, and escalation rules</w:t>
+      </w:r>
+    </w:p>
+    <w:p>
+      <w:pPr>
         <w:pStyle w:val="Compact"/>
-      </w:pPr>
-      <w:r>
-        <w:t xml:space="preserve">Lifecycle stages, completion evidence, deadlines, and escalation rules</w:t>
-      </w:r>
-    </w:p>
-    <w:p>
-      <w:pPr>
         <w:numPr>
           <w:ilvl w:val="0"/>
           <w:numId w:val="1016"/>
         </w:numPr>
+      </w:pPr>
+      <w:r>
+        <w:t xml:space="preserve">Automation and CDS behavior, including human review and failure recovery</w:t>
+      </w:r>
+    </w:p>
+    <w:p>
+      <w:pPr>
         <w:pStyle w:val="Compact"/>
-      </w:pPr>
-      <w:r>
-        <w:t xml:space="preserve">Automation and CDS behavior, including human review and failure recovery</w:t>
-      </w:r>
-    </w:p>
-    <w:p>
-      <w:pPr>
         <w:numPr>
           <w:ilvl w:val="0"/>
           <w:numId w:val="1016"/>
         </w:numPr>
-        <w:pStyle w:val="Compact"/>
       </w:pPr>
       <w:r>
         <w:t xml:space="preserve">Access boundaries, external handoffs, and the measures of success</w:t>
       </w:r>
     </w:p>
-    <w:bookmarkEnd w:id="62"/>
-    <w:bookmarkEnd w:id="63"/>
+    <w:bookmarkEnd w:id="51"/>
+    <w:bookmarkEnd w:id="52"/>
     <w:sectPr>
       <w:pgSz w:h="15840" w:w="12240"/>
       <w:pgMar w:bottom="1440" w:footer="720" w:gutter="0" w:header="720" w:left="1440" w:right="1440" w:top="1440"/>
@@ -6334,14 +6330,14 @@
 <file path=word/numbering.xml><?xml version="1.0" encoding="utf-8"?>
 <w:numbering xmlns:w="http://schemas.openxmlformats.org/wordprocessingml/2006/main">
   <w:abstractNum w:abstractNumId="990">
-    <w:nsid w:val="A990"/>
+    <w:nsid w:val="0000A990"/>
     <w:multiLevelType w:val="multilevel"/>
     <w:lvl w:ilvl="0">
       <w:numFmt w:val="bullet"/>
       <w:lvlText w:val=" "/>
       <w:lvlJc w:val="left"/>
       <w:pPr>
-        <w:ind w:left="720" w:hanging="480"/>
+        <w:ind w:left="720" w:hanging="360"/>
       </w:pPr>
     </w:lvl>
     <w:lvl w:ilvl="1">
@@ -6349,7 +6345,7 @@
       <w:lvlText w:val=" "/>
       <w:lvlJc w:val="left"/>
       <w:pPr>
-        <w:ind w:left="1440" w:hanging="480"/>
+        <w:ind w:left="1440" w:hanging="360"/>
       </w:pPr>
     </w:lvl>
     <w:lvl w:ilvl="2">
@@ -6357,7 +6353,7 @@
       <w:lvlText w:val=" "/>
       <w:lvlJc w:val="left"/>
       <w:pPr>
-        <w:ind w:left="2160" w:hanging="480"/>
+        <w:ind w:left="2160" w:hanging="360"/>
       </w:pPr>
     </w:lvl>
     <w:lvl w:ilvl="3">
@@ -6365,7 +6361,7 @@
       <w:lvlText w:val=" "/>
       <w:lvlJc w:val="left"/>
       <w:pPr>
-        <w:ind w:left="2880" w:hanging="480"/>
+        <w:ind w:left="2880" w:hanging="360"/>
       </w:pPr>
     </w:lvl>
     <w:lvl w:ilvl="4">
@@ -6373,7 +6369,7 @@
       <w:lvlText w:val=" "/>
       <w:lvlJc w:val="left"/>
       <w:pPr>
-        <w:ind w:left="3600" w:hanging="480"/>
+        <w:ind w:left="3600" w:hanging="360"/>
       </w:pPr>
     </w:lvl>
     <w:lvl w:ilvl="5">
@@ -6381,7 +6377,7 @@
       <w:lvlText w:val=" "/>
       <w:lvlJc w:val="left"/>
       <w:pPr>
-        <w:ind w:left="4320" w:hanging="480"/>
+        <w:ind w:left="4320" w:hanging="360"/>
       </w:pPr>
     </w:lvl>
     <w:lvl w:ilvl="6">
@@ -6389,7 +6385,7 @@
       <w:lvlText w:val=" "/>
       <w:lvlJc w:val="left"/>
       <w:pPr>
-        <w:ind w:left="5040" w:hanging="480"/>
+        <w:ind w:left="5040" w:hanging="360"/>
       </w:pPr>
     </w:lvl>
     <w:lvl w:ilvl="7">
@@ -6397,7 +6393,7 @@
       <w:lvlText w:val=" "/>
       <w:lvlJc w:val="left"/>
       <w:pPr>
-        <w:ind w:left="5760" w:hanging="480"/>
+        <w:ind w:left="5760" w:hanging="360"/>
       </w:pPr>
     </w:lvl>
     <w:lvl w:ilvl="8">
@@ -6405,84 +6401,111 @@
       <w:lvlText w:val=" "/>
       <w:lvlJc w:val="left"/>
       <w:pPr>
-        <w:ind w:left="6480" w:hanging="480"/>
+        <w:ind w:left="6480" w:hanging="360"/>
       </w:pPr>
     </w:lvl>
   </w:abstractNum>
   <w:abstractNum w:abstractNumId="991">
-    <w:nsid w:val="A991"/>
+    <w:nsid w:val="0000A991"/>
     <w:multiLevelType w:val="multilevel"/>
     <w:lvl w:ilvl="0">
       <w:numFmt w:val="bullet"/>
-      <w:lvlText w:val="•"/>
+      <w:lvlText w:val=""/>
       <w:lvlJc w:val="left"/>
       <w:pPr>
-        <w:ind w:left="720" w:hanging="480"/>
-      </w:pPr>
+        <w:ind w:left="720" w:hanging="360"/>
+      </w:pPr>
+      <w:rPr>
+        <w:rFonts w:ascii="Symbol" w:hAnsi="Symbol" w:cs="Symbol" w:hint="default"/>
+      </w:rPr>
     </w:lvl>
     <w:lvl w:ilvl="1">
       <w:numFmt w:val="bullet"/>
-      <w:lvlText w:val="–"/>
+      <w:lvlText w:val="o"/>
       <w:lvlJc w:val="left"/>
       <w:pPr>
-        <w:ind w:left="1440" w:hanging="480"/>
-      </w:pPr>
+        <w:ind w:left="1440" w:hanging="360"/>
+      </w:pPr>
+      <w:rPr>
+        <w:rFonts w:ascii="Courier New" w:hAnsi="Courier New" w:cs="Courier New" w:hint="default"/>
+      </w:rPr>
     </w:lvl>
     <w:lvl w:ilvl="2">
       <w:numFmt w:val="bullet"/>
-      <w:lvlText w:val="•"/>
+      <w:lvlText w:val=""/>
       <w:lvlJc w:val="left"/>
       <w:pPr>
-        <w:ind w:left="2160" w:hanging="480"/>
-      </w:pPr>
+        <w:ind w:left="2160" w:hanging="360"/>
+      </w:pPr>
+      <w:rPr>
+        <w:rFonts w:ascii="Wingdings" w:hAnsi="Wingdings" w:cs="Wingdings" w:hint="default"/>
+      </w:rPr>
     </w:lvl>
     <w:lvl w:ilvl="3">
       <w:numFmt w:val="bullet"/>
-      <w:lvlText w:val="–"/>
+      <w:lvlText w:val=""/>
       <w:lvlJc w:val="left"/>
       <w:pPr>
-        <w:ind w:left="2880" w:hanging="480"/>
-      </w:pPr>
+        <w:ind w:left="2880" w:hanging="360"/>
+      </w:pPr>
+      <w:rPr>
+        <w:rFonts w:ascii="Symbol" w:hAnsi="Symbol" w:cs="Symbol" w:hint="default"/>
+      </w:rPr>
     </w:lvl>
     <w:lvl w:ilvl="4">
       <w:numFmt w:val="bullet"/>
-      <w:lvlText w:val="•"/>
+      <w:lvlText w:val="o"/>
       <w:lvlJc w:val="left"/>
       <w:pPr>
-        <w:ind w:left="3600" w:hanging="480"/>
-      </w:pPr>
+        <w:ind w:left="3600" w:hanging="360"/>
+      </w:pPr>
+      <w:rPr>
+        <w:rFonts w:ascii="Courier New" w:hAnsi="Courier New" w:cs="Courier New" w:hint="default"/>
+      </w:rPr>
     </w:lvl>
     <w:lvl w:ilvl="5">
       <w:numFmt w:val="bullet"/>
-      <w:lvlText w:val="–"/>
+      <w:lvlText w:val=""/>
       <w:lvlJc w:val="left"/>
       <w:pPr>
-        <w:ind w:left="4320" w:hanging="480"/>
-      </w:pPr>
+        <w:ind w:left="4320" w:hanging="360"/>
+      </w:pPr>
+      <w:rPr>
+        <w:rFonts w:ascii="Wingdings" w:hAnsi="Wingdings" w:cs="Wingdings" w:hint="default"/>
+      </w:rPr>
     </w:lvl>
     <w:lvl w:ilvl="6">
       <w:numFmt w:val="bullet"/>
-      <w:lvlText w:val="•"/>
+      <w:lvlText w:val=""/>
       <w:lvlJc w:val="left"/>
       <w:pPr>
-        <w:ind w:left="5040" w:hanging="480"/>
-      </w:pPr>
+        <w:ind w:left="5040" w:hanging="360"/>
+      </w:pPr>
+      <w:rPr>
+        <w:rFonts w:ascii="Symbol" w:hAnsi="Symbol" w:cs="Symbol" w:hint="default"/>
+      </w:rPr>
     </w:lvl>
     <w:lvl w:ilvl="7">
       <w:numFmt w:val="bullet"/>
-      <w:lvlText w:val="–"/>
+      <w:lvlText w:val="o"/>
       <w:lvlJc w:val="left"/>
       <w:pPr>
-        <w:ind w:left="5760" w:hanging="480"/>
-      </w:pPr>
+        <w:ind w:left="5760" w:hanging="360"/>
+      </w:pPr>
+      <w:rPr>
+        <w:rFonts w:ascii="Courier New" w:hAnsi="Courier New" w:cs="Courier New" w:hint="default"/>
+      </w:rPr>
     </w:lvl>
     <w:lvl w:ilvl="8">
       <w:numFmt w:val="bullet"/>
-      <w:lvlText w:val="•"/>
+      <w:lvlText w:val=""/>
       <w:lvlJc w:val="left"/>
       <w:pPr>
-        <w:ind w:left="6480" w:hanging="480"/>
-      </w:pPr>
+        <w:ind w:left="6480" w:hanging="360"/>
+      </w:pPr>
+      <w:rPr>
+        <w:rFonts w:ascii="Wingdings" w:hAnsi="Wingdings" w:cs="Wingdings" w:hint="default"/>
+      </w:rPr>
     </w:lvl>
   </w:abstractNum>
   <w:num w:numId="1000">
@@ -7215,8 +7238,8 @@
     <w:name w:val="KeywordTok"/>
     <w:basedOn w:val="VerbatimChar"/>
     <w:rPr>
+      <w:b/>
       <w:color w:val="007020"/>
-      <w:b/>
     </w:rPr>
   </w:style>
   <w:style w:type="character" w:customStyle="1" w:styleId="DataTypeTok">
@@ -7293,42 +7316,42 @@
     <w:name w:val="ImportTok"/>
     <w:basedOn w:val="VerbatimChar"/>
     <w:rPr>
+      <w:b/>
       <w:color w:val="008000"/>
-      <w:b/>
     </w:rPr>
   </w:style>
   <w:style w:type="character" w:customStyle="1" w:styleId="CommentTok">
     <w:name w:val="CommentTok"/>
     <w:basedOn w:val="VerbatimChar"/>
     <w:rPr>
+      <w:i/>
       <w:color w:val="60a0b0"/>
-      <w:i/>
     </w:rPr>
   </w:style>
   <w:style w:type="character" w:customStyle="1" w:styleId="DocumentationTok">
     <w:name w:val="DocumentationTok"/>
     <w:basedOn w:val="VerbatimChar"/>
     <w:rPr>
+      <w:i/>
       <w:color w:val="ba2121"/>
-      <w:i/>
     </w:rPr>
   </w:style>
   <w:style w:type="character" w:customStyle="1" w:styleId="AnnotationTok">
     <w:name w:val="AnnotationTok"/>
     <w:basedOn w:val="VerbatimChar"/>
     <w:rPr>
-      <w:color w:val="60a0b0"/>
       <w:b/>
       <w:i/>
+      <w:color w:val="60a0b0"/>
     </w:rPr>
   </w:style>
   <w:style w:type="character" w:customStyle="1" w:styleId="CommentVarTok">
     <w:name w:val="CommentVarTok"/>
     <w:basedOn w:val="VerbatimChar"/>
     <w:rPr>
-      <w:color w:val="60a0b0"/>
       <w:b/>
       <w:i/>
+      <w:color w:val="60a0b0"/>
     </w:rPr>
   </w:style>
   <w:style w:type="character" w:customStyle="1" w:styleId="OtherTok">
@@ -7356,8 +7379,8 @@
     <w:name w:val="ControlFlowTok"/>
     <w:basedOn w:val="VerbatimChar"/>
     <w:rPr>
+      <w:b/>
       <w:color w:val="007020"/>
-      <w:b/>
     </w:rPr>
   </w:style>
   <w:style w:type="character" w:customStyle="1" w:styleId="OperatorTok">
@@ -7402,34 +7425,34 @@
     <w:name w:val="InformationTok"/>
     <w:basedOn w:val="VerbatimChar"/>
     <w:rPr>
-      <w:color w:val="60a0b0"/>
       <w:b/>
       <w:i/>
+      <w:color w:val="60a0b0"/>
     </w:rPr>
   </w:style>
   <w:style w:type="character" w:customStyle="1" w:styleId="WarningTok">
     <w:name w:val="WarningTok"/>
     <w:basedOn w:val="VerbatimChar"/>
     <w:rPr>
-      <w:color w:val="60a0b0"/>
       <w:b/>
       <w:i/>
+      <w:color w:val="60a0b0"/>
     </w:rPr>
   </w:style>
   <w:style w:type="character" w:customStyle="1" w:styleId="AlertTok">
     <w:name w:val="AlertTok"/>
     <w:basedOn w:val="VerbatimChar"/>
     <w:rPr>
+      <w:b/>
       <w:color w:val="ff0000"/>
-      <w:b/>
     </w:rPr>
   </w:style>
   <w:style w:type="character" w:customStyle="1" w:styleId="ErrorTok">
     <w:name w:val="ErrorTok"/>
     <w:basedOn w:val="VerbatimChar"/>
     <w:rPr>
+      <w:b/>
       <w:color w:val="ff0000"/>
-      <w:b/>
     </w:rPr>
   </w:style>
   <w:style w:type="character" w:customStyle="1" w:styleId="NormalTok">

</xml_diff>